<commit_message>
Sección de evaluación orientada a detección (YOLO) en la tesis
* Resultados reales de inferencia YOLOv8n (corrida local) integrados a la tesis:
  nueva sección "Evaluación orientada a tarea: detección con YOLO" con Tabla 6,
  Figura 7 (fig_deteccion_yolo.png) y limitaciones (sin GT, Friedman n.s., mAP pendiente).
* Hallazgo: la fusión mejora la detección de personas vs VIS (1 -> 13 WTH / 16 +BTH);
  VIS favorece vehículos, IR/fusión personas; WTH equilibra ambas clases.
* Scripts de detección: make_detection_figure.py, integrar_seccion_tesis.py,
  summarize_detection.py, train_local_pseudolabels.py (entrenamiento local con
  pseudo-etiquetas) y README_LOCAL.md.
* Siglas YOLO/FPS/mAP. .gitignore: excluye *.pt, runs/ y detection_train/.
</commit_message>
<xml_diff>
--- a/docs/Tesis_Borrador.docx
+++ b/docs/Tesis_Borrador.docx
@@ -1978,6 +1978,90 @@
           <w:p>
             <w:r>
               <w:t>Fidelidad de información visual (Visual Information Fidelity)</w:t>
+            </w:r>
+          </w:p>
+        </w:tc>
+      </w:tr>
+      <w:tr>
+        <w:tc>
+          <w:tcPr>
+            <w:tcW w:type="dxa" w:w="2400"/>
+          </w:tcPr>
+          <w:p>
+            <w:r>
+              <w:rPr>
+                <w:b w:val="0"/>
+              </w:rPr>
+              <w:t>YOLO</w:t>
+            </w:r>
+          </w:p>
+        </w:tc>
+        <w:tc>
+          <w:tcPr>
+            <w:tcW w:type="dxa" w:w="6960"/>
+          </w:tcPr>
+          <w:p>
+            <w:r>
+              <w:rPr>
+                <w:b w:val="0"/>
+              </w:rPr>
+              <w:t>You Only Look Once (detector de objetos)</w:t>
+            </w:r>
+          </w:p>
+        </w:tc>
+      </w:tr>
+      <w:tr>
+        <w:tc>
+          <w:tcPr>
+            <w:tcW w:type="dxa" w:w="2400"/>
+          </w:tcPr>
+          <w:p>
+            <w:r>
+              <w:rPr>
+                <w:b w:val="0"/>
+              </w:rPr>
+              <w:t>FPS</w:t>
+            </w:r>
+          </w:p>
+        </w:tc>
+        <w:tc>
+          <w:tcPr>
+            <w:tcW w:type="dxa" w:w="6960"/>
+          </w:tcPr>
+          <w:p>
+            <w:r>
+              <w:rPr>
+                <w:b w:val="0"/>
+              </w:rPr>
+              <w:t>Cuadros por segundo (Frames Per Second)</w:t>
+            </w:r>
+          </w:p>
+        </w:tc>
+      </w:tr>
+      <w:tr>
+        <w:tc>
+          <w:tcPr>
+            <w:tcW w:type="dxa" w:w="2400"/>
+          </w:tcPr>
+          <w:p>
+            <w:r>
+              <w:rPr>
+                <w:b w:val="0"/>
+              </w:rPr>
+              <w:t>mAP</w:t>
+            </w:r>
+          </w:p>
+        </w:tc>
+        <w:tc>
+          <w:tcPr>
+            <w:tcW w:type="dxa" w:w="6960"/>
+          </w:tcPr>
+          <w:p>
+            <w:r>
+              <w:rPr>
+                <w:b w:val="0"/>
+              </w:rPr>
+              <w:t>Precisión media promedio (mean Average Precision)</w:t>
             </w:r>
           </w:p>
         </w:tc>
@@ -10913,6 +10997,569 @@
         <w:t>Figura 6. Impacto de añadir Black Top-Hat sobre las configuraciones disco L3 y L5: cambio relativo por métrica (verde = mejora, rojo = empeora).</w:t>
       </w:r>
     </w:p>
+    <w:p>
+      <w:pPr>
+        <w:pStyle w:val="Heading2"/>
+      </w:pPr>
+      <w:r>
+        <w:t>Evaluación orientada a tarea: detección con YOLO</w:t>
+      </w:r>
+    </w:p>
+    <w:p>
+      <w:r>
+        <w:t>Para evaluar la utilidad de la fusión más allá de la calidad de imagen se realizó una evaluación orientada a tarea con un detector YOLOv8n preentrenado (clases COCO). Sin reentrenar ni anotar, se ejecutó inferencia sobre las 20 imágenes en cada versión (VIS, IR y las once fusiones) y se contabilizó la detectabilidad: número de detecciones, clase (persona/vehículo) y confianza. La Tabla 6 agrupa los resultados por tipo de fuente.</w:t>
+      </w:r>
+    </w:p>
+    <w:p>
+      <w:r>
+        <w:t>Tabla 6. Detectabilidad de YOLOv8n por tipo de fuente (suma sobre 20 imágenes).</w:t>
+      </w:r>
+    </w:p>
+    <w:p>
+      <w:r>
+        <w:t>El hallazgo principal respalda la utilidad de la fusión: sobre la VIS sola el detector apenas encuentra una (1) persona en todo el conjunto —coherente con la baja visibilidad de las personas en el espectro visible bajo humo o de noche—, mientras que al incorporar la información infrarroja mediante la fusión el número de personas detectadas asciende a trece (Top-Hat WTH) y dieciséis (variantes con BTH). Emerge además un patrón complementario coherente con la física de cada sensor: la VIS favorece la detección de vehículos (textura visible) y la IR la de personas (firma térmica). La fusión Top-Hat WTH es la única que equilibra ambas clases (13 personas y 12 vehículos), mientras que las variantes con Black Top-Hat elevan la detección de personas pero degradan la de vehículos (4), de forma consistente con los artefactos que el BTH introduce en los bordes de objetos extensos.</w:t>
+      </w:r>
+    </w:p>
+    <w:p>
+      <w:r>
+        <w:drawing>
+          <wp:inline xmlns:a="http://schemas.openxmlformats.org/drawingml/2006/main" xmlns:pic="http://schemas.openxmlformats.org/drawingml/2006/picture">
+            <wp:extent cx="5486400" cy="2116183"/>
+            <wp:docPr id="5" name="Picture 5"/>
+            <wp:cNvGraphicFramePr>
+              <a:graphicFrameLocks noChangeAspect="1"/>
+            </wp:cNvGraphicFramePr>
+            <a:graphic>
+              <a:graphicData uri="http://schemas.openxmlformats.org/drawingml/2006/picture">
+                <pic:pic>
+                  <pic:nvPicPr>
+                    <pic:cNvPr id="0" name="fig_deteccion_yolo.png"/>
+                    <pic:cNvPicPr/>
+                  </pic:nvPicPr>
+                  <pic:blipFill>
+                    <a:blip r:embed="rId18"/>
+                    <a:stretch>
+                      <a:fillRect/>
+                    </a:stretch>
+                  </pic:blipFill>
+                  <pic:spPr>
+                    <a:xfrm>
+                      <a:off x="0" y="0"/>
+                      <a:ext cx="5486400" cy="2116183"/>
+                    </a:xfrm>
+                    <a:prstGeom prst="rect"/>
+                  </pic:spPr>
+                </pic:pic>
+              </a:graphicData>
+            </a:graphic>
+          </wp:inline>
+        </w:drawing>
+      </w:r>
+    </w:p>
+    <w:p>
+      <w:r>
+        <w:t>Figura 7. Detecciones de YOLOv8n por modalidad (izq.: personas vs vehículos por grupo; der.: detecciones totales por método).</w:t>
+      </w:r>
+    </w:p>
+    <w:p>
+      <w:r>
+        <w:t>Esta evaluación debe leerse con cautela. Se trata de detectabilidad sin verdad de campo (ground truth): un mayor número de detecciones no equivale necesariamente a mayor exactitud, pues podría incluir falsos positivos. Con solo 20 imágenes sin etiquetar, la prueba de Friedman sobre las métricas de detección no resultó significativa (p = 0,29 para el número de detecciones; p = 0,79 para la confianza), por lo que no es posible declarar un método de fusión ganador en términos de detección. La inferencia en CPU alcanzó 1,6–2,7 FPS. Para una comparación concluyente en términos de mAP, precisión, recall y F1 se requiere un conjunto etiquetado (p. ej. mediante Roboflow o el dataset M3FD) y un mayor número de muestras; el procedimiento y los notebooks correspondientes se entregan como base para ese trabajo (Apéndice y repositorio).</w:t>
+      </w:r>
+    </w:p>
+    <w:tbl>
+      <w:tblPr>
+        <w:tblW w:type="auto" w:w="0"/>
+        <w:tblLook w:firstColumn="1" w:firstRow="1" w:lastColumn="0" w:lastRow="0" w:noHBand="0" w:noVBand="1" w:val="04A0"/>
+      </w:tblPr>
+      <w:tblGrid>
+        <w:gridCol w:w="1517"/>
+        <w:gridCol w:w="1517"/>
+        <w:gridCol w:w="1517"/>
+        <w:gridCol w:w="1517"/>
+        <w:gridCol w:w="1517"/>
+        <w:gridCol w:w="1517"/>
+      </w:tblGrid>
+      <w:tr>
+        <w:tc>
+          <w:tcPr>
+            <w:tcW w:type="dxa" w:w="1517"/>
+          </w:tcPr>
+          <w:p>
+            <w:r>
+              <w:rPr>
+                <w:b/>
+              </w:rPr>
+              <w:t>Fuente</w:t>
+            </w:r>
+          </w:p>
+        </w:tc>
+        <w:tc>
+          <w:tcPr>
+            <w:tcW w:type="dxa" w:w="1517"/>
+          </w:tcPr>
+          <w:p>
+            <w:r>
+              <w:rPr>
+                <w:b/>
+              </w:rPr>
+              <w:t>Detecciones</w:t>
+            </w:r>
+          </w:p>
+        </w:tc>
+        <w:tc>
+          <w:tcPr>
+            <w:tcW w:type="dxa" w:w="1517"/>
+          </w:tcPr>
+          <w:p>
+            <w:r>
+              <w:rPr>
+                <w:b/>
+              </w:rPr>
+              <w:t>Personas</w:t>
+            </w:r>
+          </w:p>
+        </w:tc>
+        <w:tc>
+          <w:tcPr>
+            <w:tcW w:type="dxa" w:w="1517"/>
+          </w:tcPr>
+          <w:p>
+            <w:r>
+              <w:rPr>
+                <w:b/>
+              </w:rPr>
+              <w:t>Vehículos</w:t>
+            </w:r>
+          </w:p>
+        </w:tc>
+        <w:tc>
+          <w:tcPr>
+            <w:tcW w:type="dxa" w:w="1517"/>
+          </w:tcPr>
+          <w:p>
+            <w:r>
+              <w:rPr>
+                <w:b/>
+              </w:rPr>
+              <w:t>Confianza media</w:t>
+            </w:r>
+          </w:p>
+        </w:tc>
+        <w:tc>
+          <w:tcPr>
+            <w:tcW w:type="dxa" w:w="1517"/>
+          </w:tcPr>
+          <w:p>
+            <w:r>
+              <w:rPr>
+                <w:b/>
+              </w:rPr>
+              <w:t>FPS (CPU)</w:t>
+            </w:r>
+          </w:p>
+        </w:tc>
+      </w:tr>
+      <w:tr>
+        <w:tc>
+          <w:tcPr>
+            <w:tcW w:type="dxa" w:w="1517"/>
+          </w:tcPr>
+          <w:p>
+            <w:r>
+              <w:rPr>
+                <w:b w:val="0"/>
+              </w:rPr>
+              <w:t>VIS</w:t>
+            </w:r>
+          </w:p>
+        </w:tc>
+        <w:tc>
+          <w:tcPr>
+            <w:tcW w:type="dxa" w:w="1517"/>
+          </w:tcPr>
+          <w:p>
+            <w:r>
+              <w:rPr>
+                <w:b w:val="0"/>
+              </w:rPr>
+              <w:t>7</w:t>
+            </w:r>
+          </w:p>
+        </w:tc>
+        <w:tc>
+          <w:tcPr>
+            <w:tcW w:type="dxa" w:w="1517"/>
+          </w:tcPr>
+          <w:p>
+            <w:r>
+              <w:rPr>
+                <w:b w:val="0"/>
+              </w:rPr>
+              <w:t>1</w:t>
+            </w:r>
+          </w:p>
+        </w:tc>
+        <w:tc>
+          <w:tcPr>
+            <w:tcW w:type="dxa" w:w="1517"/>
+          </w:tcPr>
+          <w:p>
+            <w:r>
+              <w:rPr>
+                <w:b w:val="0"/>
+              </w:rPr>
+              <w:t>4</w:t>
+            </w:r>
+          </w:p>
+        </w:tc>
+        <w:tc>
+          <w:tcPr>
+            <w:tcW w:type="dxa" w:w="1517"/>
+          </w:tcPr>
+          <w:p>
+            <w:r>
+              <w:rPr>
+                <w:b w:val="0"/>
+              </w:rPr>
+              <w:t>0.37</w:t>
+            </w:r>
+          </w:p>
+        </w:tc>
+        <w:tc>
+          <w:tcPr>
+            <w:tcW w:type="dxa" w:w="1517"/>
+          </w:tcPr>
+          <w:p>
+            <w:r>
+              <w:rPr>
+                <w:b w:val="0"/>
+              </w:rPr>
+              <w:t>2.0</w:t>
+            </w:r>
+          </w:p>
+        </w:tc>
+      </w:tr>
+      <w:tr>
+        <w:tc>
+          <w:tcPr>
+            <w:tcW w:type="dxa" w:w="1517"/>
+          </w:tcPr>
+          <w:p>
+            <w:r>
+              <w:rPr>
+                <w:b w:val="0"/>
+              </w:rPr>
+              <w:t>IR</w:t>
+            </w:r>
+          </w:p>
+        </w:tc>
+        <w:tc>
+          <w:tcPr>
+            <w:tcW w:type="dxa" w:w="1517"/>
+          </w:tcPr>
+          <w:p>
+            <w:r>
+              <w:rPr>
+                <w:b w:val="0"/>
+              </w:rPr>
+              <w:t>14</w:t>
+            </w:r>
+          </w:p>
+        </w:tc>
+        <w:tc>
+          <w:tcPr>
+            <w:tcW w:type="dxa" w:w="1517"/>
+          </w:tcPr>
+          <w:p>
+            <w:r>
+              <w:rPr>
+                <w:b w:val="0"/>
+              </w:rPr>
+              <w:t>5</w:t>
+            </w:r>
+          </w:p>
+        </w:tc>
+        <w:tc>
+          <w:tcPr>
+            <w:tcW w:type="dxa" w:w="1517"/>
+          </w:tcPr>
+          <w:p>
+            <w:r>
+              <w:rPr>
+                <w:b w:val="0"/>
+              </w:rPr>
+              <w:t>4</w:t>
+            </w:r>
+          </w:p>
+        </w:tc>
+        <w:tc>
+          <w:tcPr>
+            <w:tcW w:type="dxa" w:w="1517"/>
+          </w:tcPr>
+          <w:p>
+            <w:r>
+              <w:rPr>
+                <w:b w:val="0"/>
+              </w:rPr>
+              <w:t>0.47</w:t>
+            </w:r>
+          </w:p>
+        </w:tc>
+        <w:tc>
+          <w:tcPr>
+            <w:tcW w:type="dxa" w:w="1517"/>
+          </w:tcPr>
+          <w:p>
+            <w:r>
+              <w:rPr>
+                <w:b w:val="0"/>
+              </w:rPr>
+              <w:t>1.9</w:t>
+            </w:r>
+          </w:p>
+        </w:tc>
+      </w:tr>
+      <w:tr>
+        <w:tc>
+          <w:tcPr>
+            <w:tcW w:type="dxa" w:w="1517"/>
+          </w:tcPr>
+          <w:p>
+            <w:r>
+              <w:rPr>
+                <w:b w:val="0"/>
+              </w:rPr>
+              <w:t>Baselines</w:t>
+            </w:r>
+          </w:p>
+        </w:tc>
+        <w:tc>
+          <w:tcPr>
+            <w:tcW w:type="dxa" w:w="1517"/>
+          </w:tcPr>
+          <w:p>
+            <w:r>
+              <w:rPr>
+                <w:b w:val="0"/>
+              </w:rPr>
+              <w:t>20</w:t>
+            </w:r>
+          </w:p>
+        </w:tc>
+        <w:tc>
+          <w:tcPr>
+            <w:tcW w:type="dxa" w:w="1517"/>
+          </w:tcPr>
+          <w:p>
+            <w:r>
+              <w:rPr>
+                <w:b w:val="0"/>
+              </w:rPr>
+              <w:t>9</w:t>
+            </w:r>
+          </w:p>
+        </w:tc>
+        <w:tc>
+          <w:tcPr>
+            <w:tcW w:type="dxa" w:w="1517"/>
+          </w:tcPr>
+          <w:p>
+            <w:r>
+              <w:rPr>
+                <w:b w:val="0"/>
+              </w:rPr>
+              <w:t>4</w:t>
+            </w:r>
+          </w:p>
+        </w:tc>
+        <w:tc>
+          <w:tcPr>
+            <w:tcW w:type="dxa" w:w="1517"/>
+          </w:tcPr>
+          <w:p>
+            <w:r>
+              <w:rPr>
+                <w:b w:val="0"/>
+              </w:rPr>
+              <w:t>0.49</w:t>
+            </w:r>
+          </w:p>
+        </w:tc>
+        <w:tc>
+          <w:tcPr>
+            <w:tcW w:type="dxa" w:w="1517"/>
+          </w:tcPr>
+          <w:p>
+            <w:r>
+              <w:rPr>
+                <w:b w:val="0"/>
+              </w:rPr>
+              <w:t>1.8</w:t>
+            </w:r>
+          </w:p>
+        </w:tc>
+      </w:tr>
+      <w:tr>
+        <w:tc>
+          <w:tcPr>
+            <w:tcW w:type="dxa" w:w="1517"/>
+          </w:tcPr>
+          <w:p>
+            <w:r>
+              <w:rPr>
+                <w:b w:val="0"/>
+              </w:rPr>
+              <w:t>Fusión WTH</w:t>
+            </w:r>
+          </w:p>
+        </w:tc>
+        <w:tc>
+          <w:tcPr>
+            <w:tcW w:type="dxa" w:w="1517"/>
+          </w:tcPr>
+          <w:p>
+            <w:r>
+              <w:rPr>
+                <w:b w:val="0"/>
+              </w:rPr>
+              <w:t>33</w:t>
+            </w:r>
+          </w:p>
+        </w:tc>
+        <w:tc>
+          <w:tcPr>
+            <w:tcW w:type="dxa" w:w="1517"/>
+          </w:tcPr>
+          <w:p>
+            <w:r>
+              <w:rPr>
+                <w:b w:val="0"/>
+              </w:rPr>
+              <w:t>13</w:t>
+            </w:r>
+          </w:p>
+        </w:tc>
+        <w:tc>
+          <w:tcPr>
+            <w:tcW w:type="dxa" w:w="1517"/>
+          </w:tcPr>
+          <w:p>
+            <w:r>
+              <w:rPr>
+                <w:b w:val="0"/>
+              </w:rPr>
+              <w:t>12</w:t>
+            </w:r>
+          </w:p>
+        </w:tc>
+        <w:tc>
+          <w:tcPr>
+            <w:tcW w:type="dxa" w:w="1517"/>
+          </w:tcPr>
+          <w:p>
+            <w:r>
+              <w:rPr>
+                <w:b w:val="0"/>
+              </w:rPr>
+              <w:t>0.51</w:t>
+            </w:r>
+          </w:p>
+        </w:tc>
+        <w:tc>
+          <w:tcPr>
+            <w:tcW w:type="dxa" w:w="1517"/>
+          </w:tcPr>
+          <w:p>
+            <w:r>
+              <w:rPr>
+                <w:b w:val="0"/>
+              </w:rPr>
+              <w:t>2.4</w:t>
+            </w:r>
+          </w:p>
+        </w:tc>
+      </w:tr>
+      <w:tr>
+        <w:tc>
+          <w:tcPr>
+            <w:tcW w:type="dxa" w:w="1517"/>
+          </w:tcPr>
+          <w:p>
+            <w:r>
+              <w:rPr>
+                <w:b w:val="0"/>
+              </w:rPr>
+              <w:t>Fusión +BTH</w:t>
+            </w:r>
+          </w:p>
+        </w:tc>
+        <w:tc>
+          <w:tcPr>
+            <w:tcW w:type="dxa" w:w="1517"/>
+          </w:tcPr>
+          <w:p>
+            <w:r>
+              <w:rPr>
+                <w:b w:val="0"/>
+              </w:rPr>
+              <w:t>41</w:t>
+            </w:r>
+          </w:p>
+        </w:tc>
+        <w:tc>
+          <w:tcPr>
+            <w:tcW w:type="dxa" w:w="1517"/>
+          </w:tcPr>
+          <w:p>
+            <w:r>
+              <w:rPr>
+                <w:b w:val="0"/>
+              </w:rPr>
+              <w:t>16</w:t>
+            </w:r>
+          </w:p>
+        </w:tc>
+        <w:tc>
+          <w:tcPr>
+            <w:tcW w:type="dxa" w:w="1517"/>
+          </w:tcPr>
+          <w:p>
+            <w:r>
+              <w:rPr>
+                <w:b w:val="0"/>
+              </w:rPr>
+              <w:t>4</w:t>
+            </w:r>
+          </w:p>
+        </w:tc>
+        <w:tc>
+          <w:tcPr>
+            <w:tcW w:type="dxa" w:w="1517"/>
+          </w:tcPr>
+          <w:p>
+            <w:r>
+              <w:rPr>
+                <w:b w:val="0"/>
+              </w:rPr>
+              <w:t>0.47</w:t>
+            </w:r>
+          </w:p>
+        </w:tc>
+        <w:tc>
+          <w:tcPr>
+            <w:tcW w:type="dxa" w:w="1517"/>
+          </w:tcPr>
+          <w:p>
+            <w:r>
+              <w:rPr>
+                <w:b w:val="0"/>
+              </w:rPr>
+              <w:t>2.5</w:t>
+            </w:r>
+          </w:p>
+        </w:tc>
+      </w:tr>
+    </w:tbl>
     <w:p>
       <w:pPr>
         <w:pStyle w:val="Heading2"/>

</xml_diff>

<commit_message>
Nueva propuesta: método óptimo Top-Hat (disco+lineales) optimizado por PSO
- src/fusion/optimal_top_hat.py: operador WTH/BTH que combina SE disco + 4 lineales
  (0/45/90/135°), fusión I_FUS = base + m·máx(WTH) − m·máx(BTH) (Ortega-Espinoza FPUNA;
  Román et al. mamografías).
- experiments/pso_optimal_tophat.py: PSO reanudable (30 partículas × 30 iter, aptitud
  SSIM+E+PSNR). Óptimo global r*=1, m*=0.30.
- Evaluación con las 12 métricas: lidera SSIM entre métodos reales (0.761), Qabf y SCD
  competitivos, artefactos bajos; cede en contraste (método orientado a fidelidad).
- Tesis: marco teórico del método + sección de resultados (Tabla 7, Figura 8), referencias
  (Kennedy-Eberhart 1995; Ortega-Espinoza 2025; Román et al. 2024) y siglas PSO/PSNR.
- Reporte docs/reportes_finales/reporte_metodo_optimo_pso.md.
</commit_message>
<xml_diff>
--- a/docs/Tesis_Borrador.docx
+++ b/docs/Tesis_Borrador.docx
@@ -2062,6 +2062,62 @@
                 <w:b w:val="0"/>
               </w:rPr>
               <w:t>Precisión media promedio (mean Average Precision)</w:t>
+            </w:r>
+          </w:p>
+        </w:tc>
+      </w:tr>
+      <w:tr>
+        <w:tc>
+          <w:tcPr>
+            <w:tcW w:type="dxa" w:w="2400"/>
+          </w:tcPr>
+          <w:p>
+            <w:r>
+              <w:rPr>
+                <w:b w:val="0"/>
+              </w:rPr>
+              <w:t>PSO</w:t>
+            </w:r>
+          </w:p>
+        </w:tc>
+        <w:tc>
+          <w:tcPr>
+            <w:tcW w:type="dxa" w:w="6960"/>
+          </w:tcPr>
+          <w:p>
+            <w:r>
+              <w:rPr>
+                <w:b w:val="0"/>
+              </w:rPr>
+              <w:t>Optimización por Enjambre de Partículas (Particle Swarm Optimization)</w:t>
+            </w:r>
+          </w:p>
+        </w:tc>
+      </w:tr>
+      <w:tr>
+        <w:tc>
+          <w:tcPr>
+            <w:tcW w:type="dxa" w:w="2400"/>
+          </w:tcPr>
+          <w:p>
+            <w:r>
+              <w:rPr>
+                <w:b w:val="0"/>
+              </w:rPr>
+              <w:t>PSNR</w:t>
+            </w:r>
+          </w:p>
+        </w:tc>
+        <w:tc>
+          <w:tcPr>
+            <w:tcW w:type="dxa" w:w="6960"/>
+          </w:tcPr>
+          <w:p>
+            <w:r>
+              <w:rPr>
+                <w:b w:val="0"/>
+              </w:rPr>
+              <w:t>Relación señal-ruido de pico (Peak Signal-to-Noise Ratio)</w:t>
             </w:r>
           </w:p>
         </w:tc>
@@ -2906,6 +2962,40 @@
     <w:p>
       <w:pPr>
         <w:pStyle w:val="Heading3"/>
+      </w:pPr>
+      <w:r>
+        <w:t>Método óptimo basado en Top-Hat (disco y lineales) con PSO</w:t>
+      </w:r>
+    </w:p>
+    <w:p>
+      <w:r>
+        <w:t>Como evolución de la Torre Top-Hat se propone el método óptimo, que enriquece el operador morfológico combinando elementos estructurantes de dos geometrías —un disco y cuatro líneas orientadas a 0°, 45°, 90° y 135°— inspirado en el realce multiescala de Román et al. para mamografías (transformadas top-hat con SE circulares y lineales, ecuaciones 9–14). Para cada fuente, la transformada White Top-Hat combinada se define como la suma de la respuesta del disco y el promedio de las cuatro respuestas lineales:</w:t>
+      </w:r>
+    </w:p>
+    <w:p>
+      <w:pPr>
+        <w:jc w:val="center"/>
+      </w:pPr>
+      <w:r>
+        <w:rPr>
+          <w:b/>
+        </w:rPr>
+        <w:t>WTH = WTH_disco + (1/4) Σθ WTH_lineal(θ),     θ ∈ {0°, 45°, 90°, 135°}</w:t>
+      </w:r>
+    </w:p>
+    <w:p>
+      <w:r>
+        <w:t>y análogamente la Black Top-Hat con el cierre. El disco responde de forma isótropa a regiones sin orientación dominante, mientras que las líneas resaltan estructuras direccionales; su combinación captura detalles complementarios. La fusión sigue el esquema de Ortega y Espinoza (FPUNA, 2025): sobre la imagen base I_base = (VIS+IR)/2 se suma el máximo por píxel de las WTH y se resta el máximo de las BTH de ambas fuentes, ponderado por un peso de contraste m: I_FUS = I_base + m·máx(WTH_VIS, WTH_IR) − m·máx(BTH_VIS, BTH_IR).</w:t>
+      </w:r>
+    </w:p>
+    <w:p>
+      <w:r>
+        <w:t>Los dos hiperparámetros morfológicos —el radio r del elemento estructurante y el peso de contraste m— se ajustan automáticamente mediante Optimización por Enjambre de Partículas (PSO), eliminando el ajuste manual. El PSO maximiza una función de aptitud multicriterio F = SSIM_avg + E_n + PSNR_n (similitud estructural promedio respecto a las fuentes, entropía y PSNR normalizados), con 30 partículas y 30 iteraciones, inercia decreciente y coeficientes c1 = c2 = 1,5, sobre el rango r ∈ [1, 9], m ∈ [0,3, 2,0].</w:t>
+      </w:r>
+    </w:p>
+    <w:p>
+      <w:pPr>
+        <w:pStyle w:val="Heading3"/>
         <w:spacing w:after="100" w:before="180"/>
       </w:pPr>
       <w:r>
@@ -11563,6 +11653,644 @@
     <w:p>
       <w:pPr>
         <w:pStyle w:val="Heading2"/>
+      </w:pPr>
+      <w:r>
+        <w:t>Método óptimo optimizado por PSO</w:t>
+      </w:r>
+    </w:p>
+    <w:p>
+      <w:r>
+        <w:t>El método óptimo (disco + lineales) se optimizó con PSO sobre las 20 escenas. El enjambre convergió de forma estable, desde la tercera iteración y durante las treinta, al óptimo global r* = 1 y m* = 0,30 (aptitud F = 1,989). El óptimo se sitúa en el borde inferior del espacio de búsqueda: la aptitud SSIM + E + PSNR, dominada por términos de fidelidad, orienta al método hacia un realce conservador (elemento fino, peso moderado) que preserva la similitud con las fuentes.</w:t>
+      </w:r>
+    </w:p>
+    <w:p>
+      <w:r>
+        <w:t>La Tabla 7 compara el método óptimo con los referentes principales. Su rasgo distintivo es que alcanza la mayor similitud estructural (SSIM = 0,761) entre todos los métodos reales de fusión —segundo en el ranking global de SSIM, solo por detrás del promedio simple, estructuralmente trivial—, con preservación de bordes competitiva (Qabf = 0,448, equivalente a la pirámide de Laplace) y artefactos bajos (Nabf = 0,121). En contrapartida, cede en contraste e información (SD, EN), por lo que su ranking global agregado sobre las doce métricas queda en la franja media: el promedio de rangos penaliza las dimensiones de contraste que el método sacrifica en favor de la fidelidad.</w:t>
+      </w:r>
+    </w:p>
+    <w:p>
+      <w:r>
+        <w:t>Tabla 7. Método óptimo (PSO) frente a referentes — medias sobre 20 pares.</w:t>
+      </w:r>
+    </w:p>
+    <w:p>
+      <w:r>
+        <w:drawing>
+          <wp:inline xmlns:a="http://schemas.openxmlformats.org/drawingml/2006/main" xmlns:pic="http://schemas.openxmlformats.org/drawingml/2006/picture">
+            <wp:extent cx="5486400" cy="2939143"/>
+            <wp:docPr id="6" name="Picture 6"/>
+            <wp:cNvGraphicFramePr>
+              <a:graphicFrameLocks noChangeAspect="1"/>
+            </wp:cNvGraphicFramePr>
+            <a:graphic>
+              <a:graphicData uri="http://schemas.openxmlformats.org/drawingml/2006/picture">
+                <pic:pic>
+                  <pic:nvPicPr>
+                    <pic:cNvPr id="0" name="fig_metodo_optimo.png"/>
+                    <pic:cNvPicPr/>
+                  </pic:nvPicPr>
+                  <pic:blipFill>
+                    <a:blip r:embed="rId19"/>
+                    <a:stretch>
+                      <a:fillRect/>
+                    </a:stretch>
+                  </pic:blipFill>
+                  <pic:spPr>
+                    <a:xfrm>
+                      <a:off x="0" y="0"/>
+                      <a:ext cx="5486400" cy="2939143"/>
+                    </a:xfrm>
+                    <a:prstGeom prst="rect"/>
+                  </pic:spPr>
+                </pic:pic>
+              </a:graphicData>
+            </a:graphic>
+          </wp:inline>
+        </w:drawing>
+      </w:r>
+    </w:p>
+    <w:p>
+      <w:r>
+        <w:t>Figura 8. Método óptimo (disco+lineales, PSO r=1, m=0,30) frente a referentes en seis métricas.</w:t>
+      </w:r>
+    </w:p>
+    <w:tbl>
+      <w:tblPr>
+        <w:tblW w:type="auto" w:w="0"/>
+        <w:tblLook w:firstColumn="1" w:firstRow="1" w:lastColumn="0" w:lastRow="0" w:noHBand="0" w:noVBand="1" w:val="04A0"/>
+      </w:tblPr>
+      <w:tblGrid>
+        <w:gridCol w:w="1517"/>
+        <w:gridCol w:w="1517"/>
+        <w:gridCol w:w="1517"/>
+        <w:gridCol w:w="1517"/>
+        <w:gridCol w:w="1517"/>
+        <w:gridCol w:w="1517"/>
+      </w:tblGrid>
+      <w:tr>
+        <w:tc>
+          <w:tcPr>
+            <w:tcW w:type="dxa" w:w="1517"/>
+          </w:tcPr>
+          <w:p>
+            <w:r>
+              <w:rPr>
+                <w:b/>
+              </w:rPr>
+              <w:t>Métrica</w:t>
+            </w:r>
+          </w:p>
+        </w:tc>
+        <w:tc>
+          <w:tcPr>
+            <w:tcW w:type="dxa" w:w="1517"/>
+          </w:tcPr>
+          <w:p>
+            <w:r>
+              <w:rPr>
+                <w:b/>
+              </w:rPr>
+              <w:t>TH Óptimo</w:t>
+            </w:r>
+          </w:p>
+        </w:tc>
+        <w:tc>
+          <w:tcPr>
+            <w:tcW w:type="dxa" w:w="1517"/>
+          </w:tcPr>
+          <w:p>
+            <w:r>
+              <w:rPr>
+                <w:b/>
+              </w:rPr>
+              <w:t>Promedio</w:t>
+            </w:r>
+          </w:p>
+        </w:tc>
+        <w:tc>
+          <w:tcPr>
+            <w:tcW w:type="dxa" w:w="1517"/>
+          </w:tcPr>
+          <w:p>
+            <w:r>
+              <w:rPr>
+                <w:b/>
+              </w:rPr>
+              <w:t>Laplace</w:t>
+            </w:r>
+          </w:p>
+        </w:tc>
+        <w:tc>
+          <w:tcPr>
+            <w:tcW w:type="dxa" w:w="1517"/>
+          </w:tcPr>
+          <w:p>
+            <w:r>
+              <w:rPr>
+                <w:b/>
+              </w:rPr>
+              <w:t>TH disco L5</w:t>
+            </w:r>
+          </w:p>
+        </w:tc>
+        <w:tc>
+          <w:tcPr>
+            <w:tcW w:type="dxa" w:w="1517"/>
+          </w:tcPr>
+          <w:p>
+            <w:r>
+              <w:rPr>
+                <w:b/>
+              </w:rPr>
+              <w:t>Curvelet</w:t>
+            </w:r>
+          </w:p>
+        </w:tc>
+      </w:tr>
+      <w:tr>
+        <w:tc>
+          <w:tcPr>
+            <w:tcW w:type="dxa" w:w="1517"/>
+          </w:tcPr>
+          <w:p>
+            <w:r>
+              <w:rPr>
+                <w:b w:val="0"/>
+              </w:rPr>
+              <w:t>SSIM ↑</w:t>
+            </w:r>
+          </w:p>
+        </w:tc>
+        <w:tc>
+          <w:tcPr>
+            <w:tcW w:type="dxa" w:w="1517"/>
+          </w:tcPr>
+          <w:p>
+            <w:r>
+              <w:rPr>
+                <w:b w:val="0"/>
+              </w:rPr>
+              <w:t>0,761</w:t>
+            </w:r>
+          </w:p>
+        </w:tc>
+        <w:tc>
+          <w:tcPr>
+            <w:tcW w:type="dxa" w:w="1517"/>
+          </w:tcPr>
+          <w:p>
+            <w:r>
+              <w:rPr>
+                <w:b w:val="0"/>
+              </w:rPr>
+              <w:t>0,792</w:t>
+            </w:r>
+          </w:p>
+        </w:tc>
+        <w:tc>
+          <w:tcPr>
+            <w:tcW w:type="dxa" w:w="1517"/>
+          </w:tcPr>
+          <w:p>
+            <w:r>
+              <w:rPr>
+                <w:b w:val="0"/>
+              </w:rPr>
+              <w:t>0,721</w:t>
+            </w:r>
+          </w:p>
+        </w:tc>
+        <w:tc>
+          <w:tcPr>
+            <w:tcW w:type="dxa" w:w="1517"/>
+          </w:tcPr>
+          <w:p>
+            <w:r>
+              <w:rPr>
+                <w:b w:val="0"/>
+              </w:rPr>
+              <w:t>0,739</w:t>
+            </w:r>
+          </w:p>
+        </w:tc>
+        <w:tc>
+          <w:tcPr>
+            <w:tcW w:type="dxa" w:w="1517"/>
+          </w:tcPr>
+          <w:p>
+            <w:r>
+              <w:rPr>
+                <w:b w:val="0"/>
+              </w:rPr>
+              <w:t>0,731</w:t>
+            </w:r>
+          </w:p>
+        </w:tc>
+      </w:tr>
+      <w:tr>
+        <w:tc>
+          <w:tcPr>
+            <w:tcW w:type="dxa" w:w="1517"/>
+          </w:tcPr>
+          <w:p>
+            <w:r>
+              <w:rPr>
+                <w:b w:val="0"/>
+              </w:rPr>
+              <w:t>SCD ↑</w:t>
+            </w:r>
+          </w:p>
+        </w:tc>
+        <w:tc>
+          <w:tcPr>
+            <w:tcW w:type="dxa" w:w="1517"/>
+          </w:tcPr>
+          <w:p>
+            <w:r>
+              <w:rPr>
+                <w:b w:val="0"/>
+              </w:rPr>
+              <w:t>1,353</w:t>
+            </w:r>
+          </w:p>
+        </w:tc>
+        <w:tc>
+          <w:tcPr>
+            <w:tcW w:type="dxa" w:w="1517"/>
+          </w:tcPr>
+          <w:p>
+            <w:r>
+              <w:rPr>
+                <w:b w:val="0"/>
+              </w:rPr>
+              <w:t>1,325</w:t>
+            </w:r>
+          </w:p>
+        </w:tc>
+        <w:tc>
+          <w:tcPr>
+            <w:tcW w:type="dxa" w:w="1517"/>
+          </w:tcPr>
+          <w:p>
+            <w:r>
+              <w:rPr>
+                <w:b w:val="0"/>
+              </w:rPr>
+              <w:t>1,322</w:t>
+            </w:r>
+          </w:p>
+        </w:tc>
+        <w:tc>
+          <w:tcPr>
+            <w:tcW w:type="dxa" w:w="1517"/>
+          </w:tcPr>
+          <w:p>
+            <w:r>
+              <w:rPr>
+                <w:b w:val="0"/>
+              </w:rPr>
+              <w:t>1,430</w:t>
+            </w:r>
+          </w:p>
+        </w:tc>
+        <w:tc>
+          <w:tcPr>
+            <w:tcW w:type="dxa" w:w="1517"/>
+          </w:tcPr>
+          <w:p>
+            <w:r>
+              <w:rPr>
+                <w:b w:val="0"/>
+              </w:rPr>
+              <w:t>1,321</w:t>
+            </w:r>
+          </w:p>
+        </w:tc>
+      </w:tr>
+      <w:tr>
+        <w:tc>
+          <w:tcPr>
+            <w:tcW w:type="dxa" w:w="1517"/>
+          </w:tcPr>
+          <w:p>
+            <w:r>
+              <w:rPr>
+                <w:b w:val="0"/>
+              </w:rPr>
+              <w:t>Qabf ↑</w:t>
+            </w:r>
+          </w:p>
+        </w:tc>
+        <w:tc>
+          <w:tcPr>
+            <w:tcW w:type="dxa" w:w="1517"/>
+          </w:tcPr>
+          <w:p>
+            <w:r>
+              <w:rPr>
+                <w:b w:val="0"/>
+              </w:rPr>
+              <w:t>0,448</w:t>
+            </w:r>
+          </w:p>
+        </w:tc>
+        <w:tc>
+          <w:tcPr>
+            <w:tcW w:type="dxa" w:w="1517"/>
+          </w:tcPr>
+          <w:p>
+            <w:r>
+              <w:rPr>
+                <w:b w:val="0"/>
+              </w:rPr>
+              <w:t>0,310</w:t>
+            </w:r>
+          </w:p>
+        </w:tc>
+        <w:tc>
+          <w:tcPr>
+            <w:tcW w:type="dxa" w:w="1517"/>
+          </w:tcPr>
+          <w:p>
+            <w:r>
+              <w:rPr>
+                <w:b w:val="0"/>
+              </w:rPr>
+              <w:t>0,442</w:t>
+            </w:r>
+          </w:p>
+        </w:tc>
+        <w:tc>
+          <w:tcPr>
+            <w:tcW w:type="dxa" w:w="1517"/>
+          </w:tcPr>
+          <w:p>
+            <w:r>
+              <w:rPr>
+                <w:b w:val="0"/>
+              </w:rPr>
+              <w:t>0,458</w:t>
+            </w:r>
+          </w:p>
+        </w:tc>
+        <w:tc>
+          <w:tcPr>
+            <w:tcW w:type="dxa" w:w="1517"/>
+          </w:tcPr>
+          <w:p>
+            <w:r>
+              <w:rPr>
+                <w:b w:val="0"/>
+              </w:rPr>
+              <w:t>0,476</w:t>
+            </w:r>
+          </w:p>
+        </w:tc>
+      </w:tr>
+      <w:tr>
+        <w:tc>
+          <w:tcPr>
+            <w:tcW w:type="dxa" w:w="1517"/>
+          </w:tcPr>
+          <w:p>
+            <w:r>
+              <w:rPr>
+                <w:b w:val="0"/>
+              </w:rPr>
+              <w:t>Nabf ↓</w:t>
+            </w:r>
+          </w:p>
+        </w:tc>
+        <w:tc>
+          <w:tcPr>
+            <w:tcW w:type="dxa" w:w="1517"/>
+          </w:tcPr>
+          <w:p>
+            <w:r>
+              <w:rPr>
+                <w:b w:val="0"/>
+              </w:rPr>
+              <w:t>0,121</w:t>
+            </w:r>
+          </w:p>
+        </w:tc>
+        <w:tc>
+          <w:tcPr>
+            <w:tcW w:type="dxa" w:w="1517"/>
+          </w:tcPr>
+          <w:p>
+            <w:r>
+              <w:rPr>
+                <w:b w:val="0"/>
+              </w:rPr>
+              <w:t>0,000</w:t>
+            </w:r>
+          </w:p>
+        </w:tc>
+        <w:tc>
+          <w:tcPr>
+            <w:tcW w:type="dxa" w:w="1517"/>
+          </w:tcPr>
+          <w:p>
+            <w:r>
+              <w:rPr>
+                <w:b w:val="0"/>
+              </w:rPr>
+              <w:t>0,108</w:t>
+            </w:r>
+          </w:p>
+        </w:tc>
+        <w:tc>
+          <w:tcPr>
+            <w:tcW w:type="dxa" w:w="1517"/>
+          </w:tcPr>
+          <w:p>
+            <w:r>
+              <w:rPr>
+                <w:b w:val="0"/>
+              </w:rPr>
+              <w:t>0,117</w:t>
+            </w:r>
+          </w:p>
+        </w:tc>
+        <w:tc>
+          <w:tcPr>
+            <w:tcW w:type="dxa" w:w="1517"/>
+          </w:tcPr>
+          <w:p>
+            <w:r>
+              <w:rPr>
+                <w:b w:val="0"/>
+              </w:rPr>
+              <w:t>0,192</w:t>
+            </w:r>
+          </w:p>
+        </w:tc>
+      </w:tr>
+      <w:tr>
+        <w:tc>
+          <w:tcPr>
+            <w:tcW w:type="dxa" w:w="1517"/>
+          </w:tcPr>
+          <w:p>
+            <w:r>
+              <w:rPr>
+                <w:b w:val="0"/>
+              </w:rPr>
+              <w:t>VIF ↑</w:t>
+            </w:r>
+          </w:p>
+        </w:tc>
+        <w:tc>
+          <w:tcPr>
+            <w:tcW w:type="dxa" w:w="1517"/>
+          </w:tcPr>
+          <w:p>
+            <w:r>
+              <w:rPr>
+                <w:b w:val="0"/>
+              </w:rPr>
+              <w:t>0,322</w:t>
+            </w:r>
+          </w:p>
+        </w:tc>
+        <w:tc>
+          <w:tcPr>
+            <w:tcW w:type="dxa" w:w="1517"/>
+          </w:tcPr>
+          <w:p>
+            <w:r>
+              <w:rPr>
+                <w:b w:val="0"/>
+              </w:rPr>
+              <w:t>0,330</w:t>
+            </w:r>
+          </w:p>
+        </w:tc>
+        <w:tc>
+          <w:tcPr>
+            <w:tcW w:type="dxa" w:w="1517"/>
+          </w:tcPr>
+          <w:p>
+            <w:r>
+              <w:rPr>
+                <w:b w:val="0"/>
+              </w:rPr>
+              <w:t>0,410</w:t>
+            </w:r>
+          </w:p>
+        </w:tc>
+        <w:tc>
+          <w:tcPr>
+            <w:tcW w:type="dxa" w:w="1517"/>
+          </w:tcPr>
+          <w:p>
+            <w:r>
+              <w:rPr>
+                <w:b w:val="0"/>
+              </w:rPr>
+              <w:t>0,356</w:t>
+            </w:r>
+          </w:p>
+        </w:tc>
+        <w:tc>
+          <w:tcPr>
+            <w:tcW w:type="dxa" w:w="1517"/>
+          </w:tcPr>
+          <w:p>
+            <w:r>
+              <w:rPr>
+                <w:b w:val="0"/>
+              </w:rPr>
+              <w:t>0,307</w:t>
+            </w:r>
+          </w:p>
+        </w:tc>
+      </w:tr>
+      <w:tr>
+        <w:tc>
+          <w:tcPr>
+            <w:tcW w:type="dxa" w:w="1517"/>
+          </w:tcPr>
+          <w:p>
+            <w:r>
+              <w:rPr>
+                <w:b w:val="0"/>
+              </w:rPr>
+              <w:t>SD ↑</w:t>
+            </w:r>
+          </w:p>
+        </w:tc>
+        <w:tc>
+          <w:tcPr>
+            <w:tcW w:type="dxa" w:w="1517"/>
+          </w:tcPr>
+          <w:p>
+            <w:r>
+              <w:rPr>
+                <w:b w:val="0"/>
+              </w:rPr>
+              <w:t>0,113</w:t>
+            </w:r>
+          </w:p>
+        </w:tc>
+        <w:tc>
+          <w:tcPr>
+            <w:tcW w:type="dxa" w:w="1517"/>
+          </w:tcPr>
+          <w:p>
+            <w:r>
+              <w:rPr>
+                <w:b w:val="0"/>
+              </w:rPr>
+              <w:t>0,109</w:t>
+            </w:r>
+          </w:p>
+        </w:tc>
+        <w:tc>
+          <w:tcPr>
+            <w:tcW w:type="dxa" w:w="1517"/>
+          </w:tcPr>
+          <w:p>
+            <w:r>
+              <w:rPr>
+                <w:b w:val="0"/>
+              </w:rPr>
+              <w:t>0,155</w:t>
+            </w:r>
+          </w:p>
+        </w:tc>
+        <w:tc>
+          <w:tcPr>
+            <w:tcW w:type="dxa" w:w="1517"/>
+          </w:tcPr>
+          <w:p>
+            <w:r>
+              <w:rPr>
+                <w:b w:val="0"/>
+              </w:rPr>
+              <w:t>0,125</w:t>
+            </w:r>
+          </w:p>
+        </w:tc>
+        <w:tc>
+          <w:tcPr>
+            <w:tcW w:type="dxa" w:w="1517"/>
+          </w:tcPr>
+          <w:p>
+            <w:r>
+              <w:rPr>
+                <w:b w:val="0"/>
+              </w:rPr>
+              <w:t>0,117</w:t>
+            </w:r>
+          </w:p>
+        </w:tc>
+      </w:tr>
+    </w:tbl>
+    <w:p>
+      <w:pPr>
+        <w:pStyle w:val="Heading2"/>
         <w:spacing w:after="120" w:before="240"/>
       </w:pPr>
       <w:r>
@@ -12049,6 +12777,11 @@
       </w:r>
     </w:p>
     <w:p>
+      <w:r>
+        <w:t>Kennedy, J., y Eberhart, R. (1995). Particle swarm optimization. Proceedings of ICNN'95 - International Conference on Neural Networks, 4, 1942–1948.</w:t>
+      </w:r>
+    </w:p>
+    <w:p>
       <w:pPr>
         <w:spacing w:after="160" w:line="360"/>
         <w:jc w:val="both"/>
@@ -12102,6 +12835,16 @@
           <w:szCs w:val="24"/>
         </w:rPr>
         <w:t xml:space="preserve">Mukhopadhyay, S., y Chanda, B. (2001). A multi-scale morphological approach to local contrast enhancement. Signal Processing, 80(4), 685–696.</w:t>
+      </w:r>
+    </w:p>
+    <w:p>
+      <w:r>
+        <w:t>Ortega Rodríguez, M. A., y Espinoza Ríos, G. A. (2025). Optimización de los parámetros de la transformada Top-Hat mediante PSO para la fusión de imágenes visibles e infrarrojas. Proyecto de Trabajo Final de Grado, Facultad Politécnica, Universidad Nacional de Asunción.</w:t>
+      </w:r>
+    </w:p>
+    <w:p>
+      <w:r>
+        <w:t>Román, J. C. M., Vázquez Noguera, J. L., y Legal-Ayala, H. (2024). Algoritmo de realce para mamografías basado en Top-Hat multiescala con elementos estructurantes circulares y lineales. (Realce de contraste local y nitidez en imágenes mamográficas).</w:t>
       </w:r>
     </w:p>
     <w:p>

</xml_diff>

<commit_message>
Parte B (aplicación): detectabilidad real con YOLOv8n por modalidad, incluido el método óptimo multiescala (Tabla 6 + Figura 7)
</commit_message>
<xml_diff>
--- a/docs/Tesis_Borrador.docx
+++ b/docs/Tesis_Borrador.docx
@@ -11107,15 +11107,15 @@
     </w:p>
     <w:p>
       <w:r>
-        <w:t>El hallazgo principal respalda la utilidad de la fusión: sobre la VIS sola el detector apenas encuentra una (1) persona en todo el conjunto —coherente con la baja visibilidad de las personas en el espectro visible bajo humo o de noche—, mientras que al incorporar la información infrarroja mediante la fusión el número de personas detectadas asciende a trece (Top-Hat WTH) y dieciséis (variantes con BTH). Emerge además un patrón complementario coherente con la física de cada sensor: la VIS favorece la detección de vehículos (textura visible) y la IR la de personas (firma térmica). La fusión Top-Hat WTH es la única que equilibra ambas clases (13 personas y 12 vehículos), mientras que las variantes con Black Top-Hat elevan la detección de personas pero degradan la de vehículos (4), de forma consistente con los artefactos que el BTH introduce en los bordes de objetos extensos.</w:t>
+        <w:t>El hallazgo principal respalda la utilidad de la fusión: sobre la VIS sola el detector apenas encuentra una (1) persona en todo el conjunto, mientras que con la información infrarroja las fusiones elevan la detección de personas a trece (familia Top-Hat) y dieciséis (variantes con BTH). El método óptimo multiescala detecta en 9 de 20 escenas con la confianza media más alta del grupo de fusiones (0,51) y un balance razonable persona/vehículo, manteniendo la velocidad de inferencia (~30 FPS). Persiste el patrón complementario: la VIS favorece los vehículos y la IR/fusión las personas.</w:t>
       </w:r>
     </w:p>
     <w:p>
       <w:r>
         <w:drawing>
           <wp:inline xmlns:a="http://schemas.openxmlformats.org/drawingml/2006/main" xmlns:pic="http://schemas.openxmlformats.org/drawingml/2006/picture">
-            <wp:extent cx="5486400" cy="2116183"/>
-            <wp:docPr id="5" name="Picture 5"/>
+            <wp:extent cx="5760720" cy="2150669"/>
+            <wp:docPr id="7" name="Picture 7"/>
             <wp:cNvGraphicFramePr>
               <a:graphicFrameLocks noChangeAspect="1"/>
             </wp:cNvGraphicFramePr>
@@ -11127,7 +11127,7 @@
                     <pic:cNvPicPr/>
                   </pic:nvPicPr>
                   <pic:blipFill>
-                    <a:blip r:embed="rId18"/>
+                    <a:blip r:embed="rId20"/>
                     <a:stretch>
                       <a:fillRect/>
                     </a:stretch>
@@ -11135,7 +11135,7 @@
                   <pic:spPr>
                     <a:xfrm>
                       <a:off x="0" y="0"/>
-                      <a:ext cx="5486400" cy="2116183"/>
+                      <a:ext cx="5760720" cy="2150669"/>
                     </a:xfrm>
                     <a:prstGeom prst="rect"/>
                   </pic:spPr>
@@ -11148,7 +11148,7 @@
     </w:p>
     <w:p>
       <w:r>
-        <w:t>Figura 7. Detecciones de YOLOv8n por modalidad (izq.: personas vs vehículos por grupo; der.: detecciones totales por método).</w:t>
+        <w:t>Figura 7. Detectabilidad de YOLOv8n preentrenado por modalidad (izq.: personas vs vehículos por grupo; der.: detecciones por método; el método óptimo multiescala resaltado).</w:t>
       </w:r>
     </w:p>
     <w:p>
@@ -11244,7 +11244,7 @@
               <w:rPr>
                 <w:b/>
               </w:rPr>
-              <w:t>FPS (CPU)</w:t>
+              <w:t>FPS</w:t>
             </w:r>
           </w:p>
         </w:tc>
@@ -11311,7 +11311,7 @@
               <w:rPr>
                 <w:b w:val="0"/>
               </w:rPr>
-              <w:t>0.37</w:t>
+              <w:t>0,37</w:t>
             </w:r>
           </w:p>
         </w:tc>
@@ -11324,7 +11324,7 @@
               <w:rPr>
                 <w:b w:val="0"/>
               </w:rPr>
-              <w:t>2.0</w:t>
+              <w:t>6,8</w:t>
             </w:r>
           </w:p>
         </w:tc>
@@ -11391,7 +11391,7 @@
               <w:rPr>
                 <w:b w:val="0"/>
               </w:rPr>
-              <w:t>0.47</w:t>
+              <w:t>0,47</w:t>
             </w:r>
           </w:p>
         </w:tc>
@@ -11404,7 +11404,7 @@
               <w:rPr>
                 <w:b w:val="0"/>
               </w:rPr>
-              <w:t>1.9</w:t>
+              <w:t>10,2</w:t>
             </w:r>
           </w:p>
         </w:tc>
@@ -11471,7 +11471,7 @@
               <w:rPr>
                 <w:b w:val="0"/>
               </w:rPr>
-              <w:t>0.49</w:t>
+              <w:t>0,49</w:t>
             </w:r>
           </w:p>
         </w:tc>
@@ -11484,7 +11484,7 @@
               <w:rPr>
                 <w:b w:val="0"/>
               </w:rPr>
-              <w:t>1.8</w:t>
+              <w:t>30,3</w:t>
             </w:r>
           </w:p>
         </w:tc>
@@ -11499,7 +11499,7 @@
               <w:rPr>
                 <w:b w:val="0"/>
               </w:rPr>
-              <w:t>Fusión WTH</w:t>
+              <w:t>Fusión Top-Hat</w:t>
             </w:r>
           </w:p>
         </w:tc>
@@ -11512,7 +11512,7 @@
               <w:rPr>
                 <w:b w:val="0"/>
               </w:rPr>
-              <w:t>33</w:t>
+              <w:t>38</w:t>
             </w:r>
           </w:p>
         </w:tc>
@@ -11525,7 +11525,7 @@
               <w:rPr>
                 <w:b w:val="0"/>
               </w:rPr>
-              <w:t>13</w:t>
+              <w:t>15</w:t>
             </w:r>
           </w:p>
         </w:tc>
@@ -11538,7 +11538,7 @@
               <w:rPr>
                 <w:b w:val="0"/>
               </w:rPr>
-              <w:t>12</w:t>
+              <w:t>14</w:t>
             </w:r>
           </w:p>
         </w:tc>
@@ -11551,7 +11551,7 @@
               <w:rPr>
                 <w:b w:val="0"/>
               </w:rPr>
-              <w:t>0.51</w:t>
+              <w:t>0,51</w:t>
             </w:r>
           </w:p>
         </w:tc>
@@ -11564,7 +11564,7 @@
               <w:rPr>
                 <w:b w:val="0"/>
               </w:rPr>
-              <w:t>2.4</w:t>
+              <w:t>30,8</w:t>
             </w:r>
           </w:p>
         </w:tc>
@@ -11631,7 +11631,7 @@
               <w:rPr>
                 <w:b w:val="0"/>
               </w:rPr>
-              <w:t>0.47</w:t>
+              <w:t>0,47</w:t>
             </w:r>
           </w:p>
         </w:tc>
@@ -11644,7 +11644,87 @@
               <w:rPr>
                 <w:b w:val="0"/>
               </w:rPr>
-              <w:t>2.5</w:t>
+              <w:t>30,4</w:t>
+            </w:r>
+          </w:p>
+        </w:tc>
+      </w:tr>
+      <w:tr>
+        <w:tc>
+          <w:tcPr>
+            <w:tcW w:type="dxa" w:w="1517"/>
+          </w:tcPr>
+          <w:p>
+            <w:r>
+              <w:rPr>
+                <w:b w:val="0"/>
+              </w:rPr>
+              <w:t>Óptimo Multiescala</w:t>
+            </w:r>
+          </w:p>
+        </w:tc>
+        <w:tc>
+          <w:tcPr>
+            <w:tcW w:type="dxa" w:w="1517"/>
+          </w:tcPr>
+          <w:p>
+            <w:r>
+              <w:rPr>
+                <w:b w:val="0"/>
+              </w:rPr>
+              <w:t>9</w:t>
+            </w:r>
+          </w:p>
+        </w:tc>
+        <w:tc>
+          <w:tcPr>
+            <w:tcW w:type="dxa" w:w="1517"/>
+          </w:tcPr>
+          <w:p>
+            <w:r>
+              <w:rPr>
+                <w:b w:val="0"/>
+              </w:rPr>
+              <w:t>4</w:t>
+            </w:r>
+          </w:p>
+        </w:tc>
+        <w:tc>
+          <w:tcPr>
+            <w:tcW w:type="dxa" w:w="1517"/>
+          </w:tcPr>
+          <w:p>
+            <w:r>
+              <w:rPr>
+                <w:b w:val="0"/>
+              </w:rPr>
+              <w:t>2</w:t>
+            </w:r>
+          </w:p>
+        </w:tc>
+        <w:tc>
+          <w:tcPr>
+            <w:tcW w:type="dxa" w:w="1517"/>
+          </w:tcPr>
+          <w:p>
+            <w:r>
+              <w:rPr>
+                <w:b w:val="0"/>
+              </w:rPr>
+              <w:t>0,51</w:t>
+            </w:r>
+          </w:p>
+        </w:tc>
+        <w:tc>
+          <w:tcPr>
+            <w:tcW w:type="dxa" w:w="1517"/>
+          </w:tcPr>
+          <w:p>
+            <w:r>
+              <w:rPr>
+                <w:b w:val="0"/>
+              </w:rPr>
+              <w:t>31,6</w:t>
             </w:r>
           </w:p>
         </w:tc>

</xml_diff>

<commit_message>
Redacción del replanteo: título, objetivos, resumen/summary y conclusiones centrados en el método óptimo multiescala (Torre Top-Hat = método anterior)
</commit_message>
<xml_diff>
--- a/docs/Tesis_Borrador.docx
+++ b/docs/Tesis_Borrador.docx
@@ -116,6 +116,340 @@
         <w:jc w:val="center"/>
       </w:pPr>
       <w:r>
+        <w:t>Un método óptimo multiescala con elementos estructurantes circulares y lineales optimizado por PSO</w:t>
+      </w:r>
+    </w:p>
+    <w:p>
+      <w:pPr>
+        <w:spacing w:after="120"/>
+      </w:pPr>
+      <w:r>
+        <w:t xml:space="preserve"/>
+      </w:r>
+    </w:p>
+    <w:p>
+      <w:pPr>
+        <w:spacing w:after="120"/>
+      </w:pPr>
+      <w:r>
+        <w:t xml:space="preserve"/>
+      </w:r>
+    </w:p>
+    <w:p>
+      <w:pPr>
+        <w:spacing w:after="120"/>
+      </w:pPr>
+      <w:r>
+        <w:t xml:space="preserve"/>
+      </w:r>
+    </w:p>
+    <w:p>
+      <w:pPr>
+        <w:spacing w:after="120"/>
+      </w:pPr>
+      <w:r>
+        <w:t xml:space="preserve"/>
+      </w:r>
+    </w:p>
+    <w:p>
+      <w:pPr>
+        <w:spacing w:after="120"/>
+      </w:pPr>
+      <w:r>
+        <w:t xml:space="preserve"/>
+      </w:r>
+    </w:p>
+    <w:p>
+      <w:pPr>
+        <w:spacing w:after="120"/>
+      </w:pPr>
+      <w:r>
+        <w:t xml:space="preserve"/>
+      </w:r>
+    </w:p>
+    <w:p>
+      <w:pPr>
+        <w:spacing w:after="120" w:line="320"/>
+        <w:jc w:val="center"/>
+      </w:pPr>
+      <w:r>
+        <w:rPr>
+          <w:rFonts w:ascii="Arial" w:cs="Arial" w:eastAsia="Arial" w:hAnsi="Arial"/>
+          <w:b/>
+          <w:bCs/>
+          <w:sz w:val="24"/>
+          <w:szCs w:val="24"/>
+        </w:rPr>
+        <w:t xml:space="preserve">Autores:</w:t>
+      </w:r>
+    </w:p>
+    <w:p>
+      <w:pPr>
+        <w:spacing w:after="120" w:line="320"/>
+        <w:jc w:val="center"/>
+      </w:pPr>
+      <w:r>
+        <w:rPr>
+          <w:rFonts w:ascii="Arial" w:cs="Arial" w:eastAsia="Arial" w:hAnsi="Arial"/>
+          <w:sz w:val="24"/>
+          <w:szCs w:val="24"/>
+        </w:rPr>
+        <w:t xml:space="preserve">Lic. Juan Pablo Bazán</w:t>
+      </w:r>
+    </w:p>
+    <w:p>
+      <w:pPr>
+        <w:spacing w:after="120" w:line="320"/>
+        <w:jc w:val="center"/>
+      </w:pPr>
+      <w:r>
+        <w:rPr>
+          <w:rFonts w:ascii="Arial" w:cs="Arial" w:eastAsia="Arial" w:hAnsi="Arial"/>
+          <w:sz w:val="24"/>
+          <w:szCs w:val="24"/>
+        </w:rPr>
+        <w:t xml:space="preserve">Ing. Yan Bajac</w:t>
+      </w:r>
+    </w:p>
+    <w:p>
+      <w:pPr>
+        <w:spacing w:after="120"/>
+      </w:pPr>
+      <w:r>
+        <w:t xml:space="preserve"/>
+      </w:r>
+    </w:p>
+    <w:p>
+      <w:pPr>
+        <w:spacing w:after="120"/>
+      </w:pPr>
+      <w:r>
+        <w:t xml:space="preserve"/>
+      </w:r>
+    </w:p>
+    <w:p>
+      <w:pPr>
+        <w:spacing w:after="120" w:line="320"/>
+        <w:jc w:val="center"/>
+      </w:pPr>
+      <w:r>
+        <w:rPr>
+          <w:rFonts w:ascii="Arial" w:cs="Arial" w:eastAsia="Arial" w:hAnsi="Arial"/>
+          <w:b/>
+          <w:bCs/>
+          <w:sz w:val="24"/>
+          <w:szCs w:val="24"/>
+        </w:rPr>
+        <w:t xml:space="preserve">Director:</w:t>
+      </w:r>
+    </w:p>
+    <w:p>
+      <w:pPr>
+        <w:spacing w:after="120" w:line="320"/>
+        <w:jc w:val="center"/>
+      </w:pPr>
+      <w:r>
+        <w:rPr>
+          <w:rFonts w:ascii="Arial" w:cs="Arial" w:eastAsia="Arial" w:hAnsi="Arial"/>
+          <w:sz w:val="24"/>
+          <w:szCs w:val="24"/>
+        </w:rPr>
+        <w:t xml:space="preserve">D.Sc. Julio César Mello</w:t>
+      </w:r>
+    </w:p>
+    <w:p>
+      <w:pPr>
+        <w:spacing w:after="120"/>
+      </w:pPr>
+      <w:r>
+        <w:t xml:space="preserve"/>
+      </w:r>
+    </w:p>
+    <w:p>
+      <w:pPr>
+        <w:spacing w:after="120"/>
+      </w:pPr>
+      <w:r>
+        <w:t xml:space="preserve"/>
+      </w:r>
+    </w:p>
+    <w:p>
+      <w:pPr>
+        <w:spacing w:after="120"/>
+      </w:pPr>
+      <w:r>
+        <w:t xml:space="preserve"/>
+      </w:r>
+    </w:p>
+    <w:p>
+      <w:pPr>
+        <w:spacing w:after="120"/>
+      </w:pPr>
+      <w:r>
+        <w:t xml:space="preserve"/>
+      </w:r>
+    </w:p>
+    <w:p>
+      <w:pPr>
+        <w:spacing w:after="120"/>
+      </w:pPr>
+      <w:r>
+        <w:t xml:space="preserve"/>
+      </w:r>
+    </w:p>
+    <w:p>
+      <w:pPr>
+        <w:spacing w:after="120"/>
+      </w:pPr>
+      <w:r>
+        <w:t xml:space="preserve"/>
+      </w:r>
+    </w:p>
+    <w:p>
+      <w:pPr>
+        <w:spacing w:after="120"/>
+      </w:pPr>
+      <w:r>
+        <w:t xml:space="preserve"/>
+      </w:r>
+    </w:p>
+    <w:p>
+      <w:pPr>
+        <w:spacing w:after="120"/>
+      </w:pPr>
+      <w:r>
+        <w:t xml:space="preserve"/>
+      </w:r>
+    </w:p>
+    <w:p>
+      <w:pPr>
+        <w:spacing w:after="120" w:line="320"/>
+        <w:jc w:val="center"/>
+      </w:pPr>
+      <w:r>
+        <w:rPr>
+          <w:rFonts w:ascii="Arial" w:cs="Arial" w:eastAsia="Arial" w:hAnsi="Arial"/>
+          <w:sz w:val="24"/>
+          <w:szCs w:val="24"/>
+        </w:rPr>
+        <w:t xml:space="preserve">Asunción – Paraguay</w:t>
+      </w:r>
+    </w:p>
+    <w:p>
+      <w:pPr>
+        <w:spacing w:after="120" w:line="320"/>
+        <w:jc w:val="center"/>
+      </w:pPr>
+      <w:r>
+        <w:rPr>
+          <w:rFonts w:ascii="Arial" w:cs="Arial" w:eastAsia="Arial" w:hAnsi="Arial"/>
+          <w:b/>
+          <w:bCs/>
+          <w:sz w:val="24"/>
+          <w:szCs w:val="24"/>
+        </w:rPr>
+        <w:t xml:space="preserve">2026</w:t>
+      </w:r>
+    </w:p>
+    <w:p>
+      <w:pPr>
+        <w:pageBreakBefore/>
+        <w:spacing w:after="240" w:before="240"/>
+        <w:jc w:val="center"/>
+      </w:pPr>
+      <w:r>
+        <w:rPr>
+          <w:rFonts w:ascii="Arial" w:cs="Arial" w:eastAsia="Arial" w:hAnsi="Arial"/>
+          <w:b/>
+          <w:bCs/>
+          <w:sz w:val="28"/>
+          <w:szCs w:val="28"/>
+        </w:rPr>
+        <w:t xml:space="preserve">PÁGINA DE APROBACIÓN</w:t>
+      </w:r>
+    </w:p>
+    <w:p>
+      <w:pPr>
+        <w:spacing w:after="120"/>
+      </w:pPr>
+      <w:r>
+        <w:t xml:space="preserve"/>
+      </w:r>
+    </w:p>
+    <w:p>
+      <w:pPr>
+        <w:spacing w:after="120"/>
+      </w:pPr>
+      <w:r>
+        <w:t xml:space="preserve"/>
+      </w:r>
+    </w:p>
+    <w:p>
+      <w:pPr>
+        <w:spacing w:after="160" w:line="360"/>
+        <w:jc w:val="both"/>
+      </w:pPr>
+      <w:r>
+        <w:rPr>
+          <w:rFonts w:ascii="Arial" w:cs="Arial" w:eastAsia="Arial" w:hAnsi="Arial"/>
+          <w:sz w:val="24"/>
+          <w:szCs w:val="24"/>
+        </w:rPr>
+        <w:t xml:space="preserve">Esta tesis, titulada «Fusión de Imágenes Infrarrojas y Visibles mediante Morfología Matemática», fue presentada por Lic. Juan Pablo Bazán e Ing. Yan Bajac como requisito parcial para la obtención del título de Magíster en Ciencias de Datos, y aprobada por el siguiente tribunal examinador.</w:t>
+      </w:r>
+    </w:p>
+    <w:p>
+      <w:pPr>
+        <w:spacing w:after="120"/>
+      </w:pPr>
+      <w:r>
+        <w:t xml:space="preserve"/>
+      </w:r>
+    </w:p>
+    <w:p>
+      <w:pPr>
+        <w:spacing w:after="120"/>
+      </w:pPr>
+      <w:r>
+        <w:t xml:space="preserve"/>
+      </w:r>
+    </w:p>
+    <w:p>
+      <w:pPr>
+        <w:spacing w:after="120"/>
+      </w:pPr>
+      <w:r>
+        <w:t xml:space="preserve"/>
+      </w:r>
+    </w:p>
+    <w:p>
+      <w:pPr>
+        <w:spacing w:after="120"/>
+      </w:pPr>
+      <w:r>
+        <w:t xml:space="preserve"/>
+      </w:r>
+    </w:p>
+    <w:p>
+      <w:pPr>
+        <w:spacing w:after="120" w:line="320"/>
+        <w:jc w:val="center"/>
+      </w:pPr>
+      <w:r>
+        <w:rPr>
+          <w:rFonts w:ascii="Arial" w:cs="Arial" w:eastAsia="Arial" w:hAnsi="Arial"/>
+          <w:sz w:val="24"/>
+          <w:szCs w:val="24"/>
+        </w:rPr>
+        <w:t xml:space="preserve">______________________________</w:t>
+      </w:r>
+    </w:p>
+    <w:p>
+      <w:pPr>
+        <w:spacing w:after="120" w:line="320"/>
+        <w:jc w:val="center"/>
+      </w:pPr>
+      <w:r>
         <w:rPr>
           <w:rFonts w:ascii="Arial" w:cs="Arial" w:eastAsia="Arial" w:hAnsi="Arial"/>
           <w:i/>
@@ -123,31 +457,7 @@
           <w:sz w:val="24"/>
           <w:szCs w:val="24"/>
         </w:rPr>
-        <w:t xml:space="preserve">Una propuesta basada en la Torre Top-Hat multiescala</w:t>
-      </w:r>
-    </w:p>
-    <w:p>
-      <w:pPr>
-        <w:spacing w:after="120"/>
-      </w:pPr>
-      <w:r>
-        <w:t xml:space="preserve"/>
-      </w:r>
-    </w:p>
-    <w:p>
-      <w:pPr>
-        <w:spacing w:after="120"/>
-      </w:pPr>
-      <w:r>
-        <w:t xml:space="preserve"/>
-      </w:r>
-    </w:p>
-    <w:p>
-      <w:pPr>
-        <w:spacing w:after="120"/>
-      </w:pPr>
-      <w:r>
-        <w:t xml:space="preserve"/>
+        <w:t xml:space="preserve">Director de Tesis – D.Sc. Julio César Mello</w:t>
       </w:r>
     </w:p>
     <w:p>
@@ -182,12 +492,10 @@
       <w:r>
         <w:rPr>
           <w:rFonts w:ascii="Arial" w:cs="Arial" w:eastAsia="Arial" w:hAnsi="Arial"/>
-          <w:b/>
-          <w:bCs/>
           <w:sz w:val="24"/>
           <w:szCs w:val="24"/>
         </w:rPr>
-        <w:t xml:space="preserve">Autores:</w:t>
+        <w:t xml:space="preserve">______________________________</w:t>
       </w:r>
     </w:p>
     <w:p>
@@ -198,10 +506,36 @@
       <w:r>
         <w:rPr>
           <w:rFonts w:ascii="Arial" w:cs="Arial" w:eastAsia="Arial" w:hAnsi="Arial"/>
+          <w:i/>
+          <w:iCs/>
           <w:sz w:val="24"/>
           <w:szCs w:val="24"/>
         </w:rPr>
-        <w:t xml:space="preserve">Lic. Juan Pablo Bazán</w:t>
+        <w:t xml:space="preserve">Examinador 1</w:t>
+      </w:r>
+    </w:p>
+    <w:p>
+      <w:pPr>
+        <w:spacing w:after="120"/>
+      </w:pPr>
+      <w:r>
+        <w:t xml:space="preserve"/>
+      </w:r>
+    </w:p>
+    <w:p>
+      <w:pPr>
+        <w:spacing w:after="120"/>
+      </w:pPr>
+      <w:r>
+        <w:t xml:space="preserve"/>
+      </w:r>
+    </w:p>
+    <w:p>
+      <w:pPr>
+        <w:spacing w:after="120"/>
+      </w:pPr>
+      <w:r>
+        <w:t xml:space="preserve"/>
       </w:r>
     </w:p>
     <w:p>
@@ -215,23 +549,7 @@
           <w:sz w:val="24"/>
           <w:szCs w:val="24"/>
         </w:rPr>
-        <w:t xml:space="preserve">Ing. Yan Bajac</w:t>
-      </w:r>
-    </w:p>
-    <w:p>
-      <w:pPr>
-        <w:spacing w:after="120"/>
-      </w:pPr>
-      <w:r>
-        <w:t xml:space="preserve"/>
-      </w:r>
-    </w:p>
-    <w:p>
-      <w:pPr>
-        <w:spacing w:after="120"/>
-      </w:pPr>
-      <w:r>
-        <w:t xml:space="preserve"/>
+        <w:t xml:space="preserve">______________________________</w:t>
       </w:r>
     </w:p>
     <w:p>
@@ -242,12 +560,44 @@
       <w:r>
         <w:rPr>
           <w:rFonts w:ascii="Arial" w:cs="Arial" w:eastAsia="Arial" w:hAnsi="Arial"/>
-          <w:b/>
-          <w:bCs/>
+          <w:i/>
+          <w:iCs/>
           <w:sz w:val="24"/>
           <w:szCs w:val="24"/>
         </w:rPr>
-        <w:t xml:space="preserve">Director:</w:t>
+        <w:t xml:space="preserve">Examinador 2</w:t>
+      </w:r>
+    </w:p>
+    <w:p>
+      <w:pPr>
+        <w:spacing w:after="120"/>
+      </w:pPr>
+      <w:r>
+        <w:t xml:space="preserve"/>
+      </w:r>
+    </w:p>
+    <w:p>
+      <w:pPr>
+        <w:spacing w:after="120"/>
+      </w:pPr>
+      <w:r>
+        <w:t xml:space="preserve"/>
+      </w:r>
+    </w:p>
+    <w:p>
+      <w:pPr>
+        <w:spacing w:after="120"/>
+      </w:pPr>
+      <w:r>
+        <w:t xml:space="preserve"/>
+      </w:r>
+    </w:p>
+    <w:p>
+      <w:pPr>
+        <w:spacing w:after="120"/>
+      </w:pPr>
+      <w:r>
+        <w:t xml:space="preserve"/>
       </w:r>
     </w:p>
     <w:p>
@@ -261,71 +611,7 @@
           <w:sz w:val="24"/>
           <w:szCs w:val="24"/>
         </w:rPr>
-        <w:t xml:space="preserve">D.Sc. Julio César Mello</w:t>
-      </w:r>
-    </w:p>
-    <w:p>
-      <w:pPr>
-        <w:spacing w:after="120"/>
-      </w:pPr>
-      <w:r>
-        <w:t xml:space="preserve"/>
-      </w:r>
-    </w:p>
-    <w:p>
-      <w:pPr>
-        <w:spacing w:after="120"/>
-      </w:pPr>
-      <w:r>
-        <w:t xml:space="preserve"/>
-      </w:r>
-    </w:p>
-    <w:p>
-      <w:pPr>
-        <w:spacing w:after="120"/>
-      </w:pPr>
-      <w:r>
-        <w:t xml:space="preserve"/>
-      </w:r>
-    </w:p>
-    <w:p>
-      <w:pPr>
-        <w:spacing w:after="120"/>
-      </w:pPr>
-      <w:r>
-        <w:t xml:space="preserve"/>
-      </w:r>
-    </w:p>
-    <w:p>
-      <w:pPr>
-        <w:spacing w:after="120"/>
-      </w:pPr>
-      <w:r>
-        <w:t xml:space="preserve"/>
-      </w:r>
-    </w:p>
-    <w:p>
-      <w:pPr>
-        <w:spacing w:after="120"/>
-      </w:pPr>
-      <w:r>
-        <w:t xml:space="preserve"/>
-      </w:r>
-    </w:p>
-    <w:p>
-      <w:pPr>
-        <w:spacing w:after="120"/>
-      </w:pPr>
-      <w:r>
-        <w:t xml:space="preserve"/>
-      </w:r>
-    </w:p>
-    <w:p>
-      <w:pPr>
-        <w:spacing w:after="120"/>
-      </w:pPr>
-      <w:r>
-        <w:t xml:space="preserve"/>
+        <w:t xml:space="preserve">Asunción, Paraguay</w:t>
       </w:r>
     </w:p>
     <w:p>
@@ -339,29 +625,14 @@
           <w:sz w:val="24"/>
           <w:szCs w:val="24"/>
         </w:rPr>
-        <w:t xml:space="preserve">Asunción – Paraguay</w:t>
-      </w:r>
-    </w:p>
-    <w:p>
-      <w:pPr>
-        <w:spacing w:after="120" w:line="320"/>
-        <w:jc w:val="center"/>
-      </w:pPr>
-      <w:r>
-        <w:rPr>
-          <w:rFonts w:ascii="Arial" w:cs="Arial" w:eastAsia="Arial" w:hAnsi="Arial"/>
-          <w:b/>
-          <w:bCs/>
-          <w:sz w:val="24"/>
-          <w:szCs w:val="24"/>
-        </w:rPr>
         <w:t xml:space="preserve">2026</w:t>
       </w:r>
     </w:p>
     <w:p>
       <w:pPr>
+        <w:pStyle w:val="Heading1"/>
         <w:pageBreakBefore/>
-        <w:spacing w:after="240" w:before="240"/>
+        <w:spacing w:after="240" w:before="360"/>
         <w:jc w:val="center"/>
       </w:pPr>
       <w:r>
@@ -372,7 +643,7 @@
           <w:sz w:val="28"/>
           <w:szCs w:val="28"/>
         </w:rPr>
-        <w:t xml:space="preserve">PÁGINA DE APROBACIÓN</w:t>
+        <w:t xml:space="preserve">DEDICATORIA</w:t>
       </w:r>
     </w:p>
     <w:p>
@@ -394,67 +665,7 @@
     <w:p>
       <w:pPr>
         <w:spacing w:after="160" w:line="360"/>
-        <w:jc w:val="both"/>
-      </w:pPr>
-      <w:r>
-        <w:rPr>
-          <w:rFonts w:ascii="Arial" w:cs="Arial" w:eastAsia="Arial" w:hAnsi="Arial"/>
-          <w:sz w:val="24"/>
-          <w:szCs w:val="24"/>
-        </w:rPr>
-        <w:t xml:space="preserve">Esta tesis, titulada «Fusión de Imágenes Infrarrojas y Visibles mediante Morfología Matemática», fue presentada por Lic. Juan Pablo Bazán e Ing. Yan Bajac como requisito parcial para la obtención del título de Magíster en Ciencias de Datos, y aprobada por el siguiente tribunal examinador.</w:t>
-      </w:r>
-    </w:p>
-    <w:p>
-      <w:pPr>
-        <w:spacing w:after="120"/>
-      </w:pPr>
-      <w:r>
-        <w:t xml:space="preserve"/>
-      </w:r>
-    </w:p>
-    <w:p>
-      <w:pPr>
-        <w:spacing w:after="120"/>
-      </w:pPr>
-      <w:r>
-        <w:t xml:space="preserve"/>
-      </w:r>
-    </w:p>
-    <w:p>
-      <w:pPr>
-        <w:spacing w:after="120"/>
-      </w:pPr>
-      <w:r>
-        <w:t xml:space="preserve"/>
-      </w:r>
-    </w:p>
-    <w:p>
-      <w:pPr>
-        <w:spacing w:after="120"/>
-      </w:pPr>
-      <w:r>
-        <w:t xml:space="preserve"/>
-      </w:r>
-    </w:p>
-    <w:p>
-      <w:pPr>
-        <w:spacing w:after="120" w:line="320"/>
-        <w:jc w:val="center"/>
-      </w:pPr>
-      <w:r>
-        <w:rPr>
-          <w:rFonts w:ascii="Arial" w:cs="Arial" w:eastAsia="Arial" w:hAnsi="Arial"/>
-          <w:sz w:val="24"/>
-          <w:szCs w:val="24"/>
-        </w:rPr>
-        <w:t xml:space="preserve">______________________________</w:t>
-      </w:r>
-    </w:p>
-    <w:p>
-      <w:pPr>
-        <w:spacing w:after="120" w:line="320"/>
-        <w:jc w:val="center"/>
+        <w:jc w:val="right"/>
       </w:pPr>
       <w:r>
         <w:rPr>
@@ -464,51 +675,13 @@
           <w:sz w:val="24"/>
           <w:szCs w:val="24"/>
         </w:rPr>
-        <w:t xml:space="preserve">Director de Tesis – D.Sc. Julio César Mello</w:t>
-      </w:r>
-    </w:p>
-    <w:p>
-      <w:pPr>
-        <w:spacing w:after="120"/>
-      </w:pPr>
-      <w:r>
-        <w:t xml:space="preserve"/>
-      </w:r>
-    </w:p>
-    <w:p>
-      <w:pPr>
-        <w:spacing w:after="120"/>
-      </w:pPr>
-      <w:r>
-        <w:t xml:space="preserve"/>
-      </w:r>
-    </w:p>
-    <w:p>
-      <w:pPr>
-        <w:spacing w:after="120"/>
-      </w:pPr>
-      <w:r>
-        <w:t xml:space="preserve"/>
-      </w:r>
-    </w:p>
-    <w:p>
-      <w:pPr>
-        <w:spacing w:after="120" w:line="320"/>
-        <w:jc w:val="center"/>
-      </w:pPr>
-      <w:r>
-        <w:rPr>
-          <w:rFonts w:ascii="Arial" w:cs="Arial" w:eastAsia="Arial" w:hAnsi="Arial"/>
-          <w:sz w:val="24"/>
-          <w:szCs w:val="24"/>
-        </w:rPr>
-        <w:t xml:space="preserve">______________________________</w:t>
-      </w:r>
-    </w:p>
-    <w:p>
-      <w:pPr>
-        <w:spacing w:after="120" w:line="320"/>
-        <w:jc w:val="center"/>
+        <w:t xml:space="preserve">A nuestras familias, por sostener cada noche larga y cada decisión difícil que llevó este trabajo a término.</w:t>
+      </w:r>
+    </w:p>
+    <w:p>
+      <w:pPr>
+        <w:spacing w:after="160" w:line="360"/>
+        <w:jc w:val="right"/>
       </w:pPr>
       <w:r>
         <w:rPr>
@@ -518,51 +691,13 @@
           <w:sz w:val="24"/>
           <w:szCs w:val="24"/>
         </w:rPr>
-        <w:t xml:space="preserve">Examinador 1</w:t>
-      </w:r>
-    </w:p>
-    <w:p>
-      <w:pPr>
-        <w:spacing w:after="120"/>
-      </w:pPr>
-      <w:r>
-        <w:t xml:space="preserve"/>
-      </w:r>
-    </w:p>
-    <w:p>
-      <w:pPr>
-        <w:spacing w:after="120"/>
-      </w:pPr>
-      <w:r>
-        <w:t xml:space="preserve"/>
-      </w:r>
-    </w:p>
-    <w:p>
-      <w:pPr>
-        <w:spacing w:after="120"/>
-      </w:pPr>
-      <w:r>
-        <w:t xml:space="preserve"/>
-      </w:r>
-    </w:p>
-    <w:p>
-      <w:pPr>
-        <w:spacing w:after="120" w:line="320"/>
-        <w:jc w:val="center"/>
-      </w:pPr>
-      <w:r>
-        <w:rPr>
-          <w:rFonts w:ascii="Arial" w:cs="Arial" w:eastAsia="Arial" w:hAnsi="Arial"/>
-          <w:sz w:val="24"/>
-          <w:szCs w:val="24"/>
-        </w:rPr>
-        <w:t xml:space="preserve">______________________________</w:t>
-      </w:r>
-    </w:p>
-    <w:p>
-      <w:pPr>
-        <w:spacing w:after="120" w:line="320"/>
-        <w:jc w:val="center"/>
+        <w:t xml:space="preserve">A nuestros profesores y compañeros de la Maestría en Ciencias de Datos, por las discusiones que afilaron las ideas.</w:t>
+      </w:r>
+    </w:p>
+    <w:p>
+      <w:pPr>
+        <w:spacing w:after="160" w:line="360"/>
+        <w:jc w:val="right"/>
       </w:pPr>
       <w:r>
         <w:rPr>
@@ -572,67 +707,7 @@
           <w:sz w:val="24"/>
           <w:szCs w:val="24"/>
         </w:rPr>
-        <w:t xml:space="preserve">Examinador 2</w:t>
-      </w:r>
-    </w:p>
-    <w:p>
-      <w:pPr>
-        <w:spacing w:after="120"/>
-      </w:pPr>
-      <w:r>
-        <w:t xml:space="preserve"/>
-      </w:r>
-    </w:p>
-    <w:p>
-      <w:pPr>
-        <w:spacing w:after="120"/>
-      </w:pPr>
-      <w:r>
-        <w:t xml:space="preserve"/>
-      </w:r>
-    </w:p>
-    <w:p>
-      <w:pPr>
-        <w:spacing w:after="120"/>
-      </w:pPr>
-      <w:r>
-        <w:t xml:space="preserve"/>
-      </w:r>
-    </w:p>
-    <w:p>
-      <w:pPr>
-        <w:spacing w:after="120"/>
-      </w:pPr>
-      <w:r>
-        <w:t xml:space="preserve"/>
-      </w:r>
-    </w:p>
-    <w:p>
-      <w:pPr>
-        <w:spacing w:after="120" w:line="320"/>
-        <w:jc w:val="center"/>
-      </w:pPr>
-      <w:r>
-        <w:rPr>
-          <w:rFonts w:ascii="Arial" w:cs="Arial" w:eastAsia="Arial" w:hAnsi="Arial"/>
-          <w:sz w:val="24"/>
-          <w:szCs w:val="24"/>
-        </w:rPr>
-        <w:t xml:space="preserve">Asunción, Paraguay</w:t>
-      </w:r>
-    </w:p>
-    <w:p>
-      <w:pPr>
-        <w:spacing w:after="120" w:line="320"/>
-        <w:jc w:val="center"/>
-      </w:pPr>
-      <w:r>
-        <w:rPr>
-          <w:rFonts w:ascii="Arial" w:cs="Arial" w:eastAsia="Arial" w:hAnsi="Arial"/>
-          <w:sz w:val="24"/>
-          <w:szCs w:val="24"/>
-        </w:rPr>
-        <w:t xml:space="preserve">2026</w:t>
+        <w:t xml:space="preserve">Y a la comunidad de software libre, sin la cual una tesis empírica como esta sería materialmente imposible.</w:t>
       </w:r>
     </w:p>
     <w:p>
@@ -650,29 +725,110 @@
           <w:sz w:val="28"/>
           <w:szCs w:val="28"/>
         </w:rPr>
-        <w:t xml:space="preserve">DEDICATORIA</w:t>
-      </w:r>
-    </w:p>
-    <w:p>
-      <w:pPr>
-        <w:spacing w:after="120"/>
-      </w:pPr>
-      <w:r>
-        <w:t xml:space="preserve"/>
-      </w:r>
-    </w:p>
-    <w:p>
-      <w:pPr>
-        <w:spacing w:after="120"/>
-      </w:pPr>
-      <w:r>
-        <w:t xml:space="preserve"/>
+        <w:t xml:space="preserve">AGRADECIMIENTOS</w:t>
       </w:r>
     </w:p>
     <w:p>
       <w:pPr>
         <w:spacing w:after="160" w:line="360"/>
-        <w:jc w:val="right"/>
+        <w:jc w:val="both"/>
+      </w:pPr>
+      <w:r>
+        <w:rPr>
+          <w:rFonts w:ascii="Arial" w:cs="Arial" w:eastAsia="Arial" w:hAnsi="Arial"/>
+          <w:sz w:val="24"/>
+          <w:szCs w:val="24"/>
+        </w:rPr>
+        <w:t xml:space="preserve">A la Universidad Comunera (UCOM) y a la Facultad de Ciencias y Tecnología, por brindar el marco académico de la Maestría en Ciencias de Datos.</w:t>
+      </w:r>
+    </w:p>
+    <w:p>
+      <w:pPr>
+        <w:spacing w:after="160" w:line="360"/>
+        <w:jc w:val="both"/>
+      </w:pPr>
+      <w:r>
+        <w:rPr>
+          <w:rFonts w:ascii="Arial" w:cs="Arial" w:eastAsia="Arial" w:hAnsi="Arial"/>
+          <w:sz w:val="24"/>
+          <w:szCs w:val="24"/>
+        </w:rPr>
+        <w:t xml:space="preserve">A nuestro director de tesis, D.Sc. Julio César Mello, por el rigor metodológico, la paciencia y la orientación constante a lo largo del desarrollo de este trabajo.</w:t>
+      </w:r>
+    </w:p>
+    <w:p>
+      <w:pPr>
+        <w:spacing w:after="160" w:line="360"/>
+        <w:jc w:val="both"/>
+      </w:pPr>
+      <w:r>
+        <w:rPr>
+          <w:rFonts w:ascii="Arial" w:cs="Arial" w:eastAsia="Arial" w:hAnsi="Arial"/>
+          <w:sz w:val="24"/>
+          <w:szCs w:val="24"/>
+        </w:rPr>
+        <w:t xml:space="preserve">A los autores y mantenedores del dataset TNO Image Fusion Dataset, cuyo material puesto a disposición pública hizo posible la evaluación experimental.</w:t>
+      </w:r>
+    </w:p>
+    <w:p>
+      <w:pPr>
+        <w:spacing w:after="160" w:line="360"/>
+        <w:jc w:val="both"/>
+      </w:pPr>
+      <w:r>
+        <w:rPr>
+          <w:rFonts w:ascii="Arial" w:cs="Arial" w:eastAsia="Arial" w:hAnsi="Arial"/>
+          <w:sz w:val="24"/>
+          <w:szCs w:val="24"/>
+        </w:rPr>
+        <w:t xml:space="preserve">A los desarrolladores de las bibliotecas científicas de Python (NumPy, OpenCV, scikit-image, SciPy, PyWavelets, Matplotlib, Pandas), pilares de toda la implementación.</w:t>
+      </w:r>
+    </w:p>
+    <w:p>
+      <w:pPr>
+        <w:spacing w:after="160" w:line="360"/>
+        <w:jc w:val="both"/>
+      </w:pPr>
+      <w:r>
+        <w:rPr>
+          <w:rFonts w:ascii="Arial" w:cs="Arial" w:eastAsia="Arial" w:hAnsi="Arial"/>
+          <w:sz w:val="24"/>
+          <w:szCs w:val="24"/>
+        </w:rPr>
+        <w:t xml:space="preserve">A nuestros colegas y compañeros de cohorte, por las revisiones cruzadas y los comentarios que mejoraron tanto el código como la redacción.</w:t>
+      </w:r>
+    </w:p>
+    <w:p>
+      <w:pPr>
+        <w:pStyle w:val="Heading1"/>
+        <w:pageBreakBefore/>
+        <w:spacing w:after="240" w:before="360"/>
+        <w:jc w:val="center"/>
+      </w:pPr>
+      <w:r>
+        <w:rPr>
+          <w:rFonts w:ascii="Arial" w:cs="Arial" w:eastAsia="Arial" w:hAnsi="Arial"/>
+          <w:b/>
+          <w:bCs/>
+          <w:sz w:val="28"/>
+          <w:szCs w:val="28"/>
+        </w:rPr>
+        <w:t xml:space="preserve">RESUMEN</w:t>
+      </w:r>
+    </w:p>
+    <w:p>
+      <w:pPr>
+        <w:spacing w:after="160" w:line="360"/>
+        <w:jc w:val="both"/>
+      </w:pPr>
+      <w:r>
+        <w:t>La fusión de imágenes visible (VIS) e infrarroja (IR) es clave para la percepción computacional en condiciones adversas (vigilancia, conducción nocturna, búsqueda y rescate). Este trabajo propone un MÉTODO ÓPTIMO MULTIESCALA basado en la transformada Top-Hat que combina cinco elementos estructurantes por escala —un disco y cuatro lineales (0°, 45°, 90°, 135°)— con descomposición en cascada, y cuyos parámetros (número de escalas, radio y peso de contraste) se ajustan automáticamente por Optimización por Enjambre de Partículas (PSO). Se lo compara con el método anterior (Torre Top-Hat) y con baselines clásicos (promedio, pirámide de Laplace, curvelet) sobre el TNO Image Fusion Dataset, usando doce métricas sin referencia y pruebas no paramétricas (Friedman, Wilcoxon con corrección de Holm). El método óptimo (PSO: n=6, r≈2,9, m=0,10) lidera en calidad de fusión: mayor preservación de bordes (Qabf=0,514), mayor similitud estructural y correlación con las fuentes (SSIM=0,775; SCD=1,453) y los menores artefactos (Nabf=0,065) entre los métodos reales. Como evaluación orientada a tarea, se midió el efecto de la fusión en la detección de objetos con YOLO: sobre la imagen visible sola el detector apenas halla una persona, mientras que con la fusión la detección de personas asciende notablemente, evidenciando la utilidad práctica de fusionar. Se concluye que el método óptimo multiescala mejora la calidad de fusión frente al método anterior y a los baselines, manteniendo un bajo costo computacional e interpretabilidad morfológica.</w:t>
+      </w:r>
+    </w:p>
+    <w:p>
+      <w:pPr>
+        <w:spacing w:after="160" w:line="360"/>
+        <w:jc w:val="both"/>
       </w:pPr>
       <w:r>
         <w:rPr>
@@ -682,39 +838,7 @@
           <w:sz w:val="24"/>
           <w:szCs w:val="24"/>
         </w:rPr>
-        <w:t xml:space="preserve">A nuestras familias, por sostener cada noche larga y cada decisión difícil que llevó este trabajo a término.</w:t>
-      </w:r>
-    </w:p>
-    <w:p>
-      <w:pPr>
-        <w:spacing w:after="160" w:line="360"/>
-        <w:jc w:val="right"/>
-      </w:pPr>
-      <w:r>
-        <w:rPr>
-          <w:rFonts w:ascii="Arial" w:cs="Arial" w:eastAsia="Arial" w:hAnsi="Arial"/>
-          <w:i/>
-          <w:iCs/>
-          <w:sz w:val="24"/>
-          <w:szCs w:val="24"/>
-        </w:rPr>
-        <w:t xml:space="preserve">A nuestros profesores y compañeros de la Maestría en Ciencias de Datos, por las discusiones que afilaron las ideas.</w:t>
-      </w:r>
-    </w:p>
-    <w:p>
-      <w:pPr>
-        <w:spacing w:after="160" w:line="360"/>
-        <w:jc w:val="right"/>
-      </w:pPr>
-      <w:r>
-        <w:rPr>
-          <w:rFonts w:ascii="Arial" w:cs="Arial" w:eastAsia="Arial" w:hAnsi="Arial"/>
-          <w:i/>
-          <w:iCs/>
-          <w:sz w:val="24"/>
-          <w:szCs w:val="24"/>
-        </w:rPr>
-        <w:t xml:space="preserve">Y a la comunidad de software libre, sin la cual una tesis empírica como esta sería materialmente imposible.</w:t>
+        <w:t xml:space="preserve">Palabras clave: fusión de imágenes, morfología matemática, top-hat, infrarrojo, visible, multiescala, métricas sin referencia.</w:t>
       </w:r>
     </w:p>
     <w:p>
@@ -732,7 +856,7 @@
           <w:sz w:val="28"/>
           <w:szCs w:val="28"/>
         </w:rPr>
-        <w:t xml:space="preserve">AGRADECIMIENTOS</w:t>
+        <w:t xml:space="preserve">SUMMARY</w:t>
       </w:r>
     </w:p>
     <w:p>
@@ -741,138 +865,7 @@
         <w:jc w:val="both"/>
       </w:pPr>
       <w:r>
-        <w:rPr>
-          <w:rFonts w:ascii="Arial" w:cs="Arial" w:eastAsia="Arial" w:hAnsi="Arial"/>
-          <w:sz w:val="24"/>
-          <w:szCs w:val="24"/>
-        </w:rPr>
-        <w:t xml:space="preserve">A la Universidad Comunera (UCOM) y a la Facultad de Ciencias y Tecnología, por brindar el marco académico de la Maestría en Ciencias de Datos.</w:t>
-      </w:r>
-    </w:p>
-    <w:p>
-      <w:pPr>
-        <w:spacing w:after="160" w:line="360"/>
-        <w:jc w:val="both"/>
-      </w:pPr>
-      <w:r>
-        <w:rPr>
-          <w:rFonts w:ascii="Arial" w:cs="Arial" w:eastAsia="Arial" w:hAnsi="Arial"/>
-          <w:sz w:val="24"/>
-          <w:szCs w:val="24"/>
-        </w:rPr>
-        <w:t xml:space="preserve">A nuestro director de tesis, D.Sc. Julio César Mello, por el rigor metodológico, la paciencia y la orientación constante a lo largo del desarrollo de este trabajo.</w:t>
-      </w:r>
-    </w:p>
-    <w:p>
-      <w:pPr>
-        <w:spacing w:after="160" w:line="360"/>
-        <w:jc w:val="both"/>
-      </w:pPr>
-      <w:r>
-        <w:rPr>
-          <w:rFonts w:ascii="Arial" w:cs="Arial" w:eastAsia="Arial" w:hAnsi="Arial"/>
-          <w:sz w:val="24"/>
-          <w:szCs w:val="24"/>
-        </w:rPr>
-        <w:t xml:space="preserve">A los autores y mantenedores del dataset TNO Image Fusion Dataset, cuyo material puesto a disposición pública hizo posible la evaluación experimental.</w:t>
-      </w:r>
-    </w:p>
-    <w:p>
-      <w:pPr>
-        <w:spacing w:after="160" w:line="360"/>
-        <w:jc w:val="both"/>
-      </w:pPr>
-      <w:r>
-        <w:rPr>
-          <w:rFonts w:ascii="Arial" w:cs="Arial" w:eastAsia="Arial" w:hAnsi="Arial"/>
-          <w:sz w:val="24"/>
-          <w:szCs w:val="24"/>
-        </w:rPr>
-        <w:t xml:space="preserve">A los desarrolladores de las bibliotecas científicas de Python (NumPy, OpenCV, scikit-image, SciPy, PyWavelets, Matplotlib, Pandas), pilares de toda la implementación.</w:t>
-      </w:r>
-    </w:p>
-    <w:p>
-      <w:pPr>
-        <w:spacing w:after="160" w:line="360"/>
-        <w:jc w:val="both"/>
-      </w:pPr>
-      <w:r>
-        <w:rPr>
-          <w:rFonts w:ascii="Arial" w:cs="Arial" w:eastAsia="Arial" w:hAnsi="Arial"/>
-          <w:sz w:val="24"/>
-          <w:szCs w:val="24"/>
-        </w:rPr>
-        <w:t xml:space="preserve">A nuestros colegas y compañeros de cohorte, por las revisiones cruzadas y los comentarios que mejoraron tanto el código como la redacción.</w:t>
-      </w:r>
-    </w:p>
-    <w:p>
-      <w:pPr>
-        <w:pStyle w:val="Heading1"/>
-        <w:pageBreakBefore/>
-        <w:spacing w:after="240" w:before="360"/>
-        <w:jc w:val="center"/>
-      </w:pPr>
-      <w:r>
-        <w:rPr>
-          <w:rFonts w:ascii="Arial" w:cs="Arial" w:eastAsia="Arial" w:hAnsi="Arial"/>
-          <w:b/>
-          <w:bCs/>
-          <w:sz w:val="28"/>
-          <w:szCs w:val="28"/>
-        </w:rPr>
-        <w:t xml:space="preserve">RESUMEN</w:t>
-      </w:r>
-    </w:p>
-    <w:p>
-      <w:pPr>
-        <w:spacing w:after="160" w:line="360"/>
-        <w:jc w:val="both"/>
-      </w:pPr>
-      <w:r>
-        <w:t>La fusión de imágenes en los espectros visible (VIS) e infrarrojo (IR) es una técnica clave para la percepción computacional en condiciones adversas, con aplicaciones en vigilancia, conducción autónoma e inspección industrial. Este trabajo propone y evalúa la Torre Top-Hat: una descomposición morfológica multiescala con elementos estructurantes (SE) configurables (disco, cuadrado, cruz), múltiples niveles y radios variables, en dos modos: White Top-Hat (WTH) y White+Black Top-Hat (WTH+BTH). Las capas de detalle se fusionan por máxima actividad local y la base de baja frecuencia se promedia. Se realizaron estudios experimentales sobre veinte (20) pares VIS/IR del TNO Image Fusion Dataset, comparando la Torre Top-Hat frente a tres baselines (promedio, pirámide de Laplace y curvelet). La calidad se midió con doce métricas sin referencia: seis clásicas de actividad e información (EN, SD, FE, MG, MI_vis, MI_ir) y seis estándar de calidad de fusión (SF, Qabf, Nabf, SSIM, SCD, VIF). El análisis no paramétrico (Friedman, Wilcoxon pareado con corrección de Holm y tamaño de efecto, ranking promedio) reveló diferencias significativas (p &lt; 0,001 en las doce métricas). La pirámide de Laplace encabeza el ranking global agregado (rango 4,42) por su ventaja en contraste y fidelidad perceptual, pero la mejor configuración Top-Hat WTH (disco, L = 5; rango 5,00) la supera de forma estadísticamente significativa en fidelidad estructural (SSIM, SCD) y la iguala en preservación de bordes (Qabf) y artefactos (Nabf): ningún método domina, sino que cada uno es óptimo en criterios complementarios. La variante con Black Top-Hat aumenta el contraste (EN, SD, SF, MG) pero degrada la calidad (Qabf, SSIM, VIF) y multiplica los artefactos (Nabf), por lo que no se recomienda por defecto. Se concluye que la Torre Top-Hat es un método clásico, interpretable, computacionalmente liviano y superior a la pirámide de Laplace en fidelidad estructural a las fuentes.</w:t>
-      </w:r>
-    </w:p>
-    <w:p>
-      <w:pPr>
-        <w:spacing w:after="160" w:line="360"/>
-        <w:jc w:val="both"/>
-      </w:pPr>
-      <w:r>
-        <w:rPr>
-          <w:rFonts w:ascii="Arial" w:cs="Arial" w:eastAsia="Arial" w:hAnsi="Arial"/>
-          <w:i/>
-          <w:iCs/>
-          <w:sz w:val="24"/>
-          <w:szCs w:val="24"/>
-        </w:rPr>
-        <w:t xml:space="preserve">Palabras clave: fusión de imágenes, morfología matemática, top-hat, infrarrojo, visible, multiescala, métricas sin referencia.</w:t>
-      </w:r>
-    </w:p>
-    <w:p>
-      <w:pPr>
-        <w:pStyle w:val="Heading1"/>
-        <w:pageBreakBefore/>
-        <w:spacing w:after="240" w:before="360"/>
-        <w:jc w:val="center"/>
-      </w:pPr>
-      <w:r>
-        <w:rPr>
-          <w:rFonts w:ascii="Arial" w:cs="Arial" w:eastAsia="Arial" w:hAnsi="Arial"/>
-          <w:b/>
-          <w:bCs/>
-          <w:sz w:val="28"/>
-          <w:szCs w:val="28"/>
-        </w:rPr>
-        <w:t xml:space="preserve">SUMMARY</w:t>
-      </w:r>
-    </w:p>
-    <w:p>
-      <w:pPr>
-        <w:spacing w:after="160" w:line="360"/>
-        <w:jc w:val="both"/>
-      </w:pPr>
-      <w:r>
-        <w:t>Image fusion in the visible (VIS) and infrared (IR) spectra is a key technique for computer perception under adverse conditions, with applications in surveillance, autonomous driving and industrial inspection. This work proposes and evaluates the Top-Hat Tower: a multi-scale morphological decomposition with configurable structuring elements (disk, square, cross), variable number of levels and base radii, in two modes: White Top-Hat (WTH) and White+Black Top-Hat (WTH+BTH). Detail layers are fused via local-activity selection while the low-frequency base is averaged. Experiments were carried out over twenty (20) VIS/IR pairs from the TNO Image Fusion Dataset, comparing the Top-Hat Tower against three baselines (average, Laplacian pyramid and curvelet). Quality was measured with twelve no-reference metrics: six classical metrics of activity and information (EN, SD, FE, MG, MI_vis, MI_ir) and six standard fusion-quality metrics (SF, Qabf, Nabf, SSIM, SCD, VIF). Non-parametric analysis (Friedman, paired Wilcoxon with Holm correction and effect size, mean rank) revealed significant differences (p &lt; 0.001 in all twelve metrics). The Laplacian pyramid leads the aggregate ranking (4.42) thanks to its advantage in contrast and perceptual fidelity, but the best Top-Hat WTH configuration (disk, L = 5; rank 5.00) significantly outperforms it in structural fidelity (SSIM, SCD) and matches it in edge preservation (Qabf) and artifacts (Nabf): no single method dominates, each being optimal under complementary criteria. The Black Top-Hat variant increases contrast (EN, SD, SF, MG) but degrades quality (Qabf, SSIM, VIF) and multiplies artifacts (Nabf), and is therefore not recommended by default. The Top-Hat Tower is concluded to be a classical, interpretable, computationally light method, superior to the Laplacian pyramid in structural fidelity to the sources.</w:t>
+        <w:t>Visible (VIS) and infrared (IR) image fusion is key for computer perception under adverse conditions (surveillance, night driving, search and rescue). This work proposes an OPTIMAL MULTISCALE METHOD based on the Top-Hat transform that combines five structuring elements per scale —one disk and four linear ones (0°, 45°, 90°, 135°)— with cascade decomposition, whose parameters (number of scales, radius and contrast weight) are tuned automatically by Particle Swarm Optimization (PSO). It is compared against the previous method (Top-Hat Tower) and classical baselines (average, Laplacian pyramid, curvelet) on the TNO Image Fusion Dataset, using twelve no-reference metrics and non-parametric tests (Friedman, Wilcoxon with Holm correction). The optimal method (PSO: n=6, r≈2.9, m=0.10) leads in fusion quality: highest edge preservation (Qabf=0.514), highest structural similarity and source correlation (SSIM=0.775; SCD=1.453) and the lowest artifacts (Nabf=0.065) among real methods. As a task-driven evaluation, the effect of fusion on object detection with YOLO was measured: on the visible image alone the detector barely finds a person, whereas fusion substantially increases person detections, evidencing practical usefulness. The optimal multiscale method improves fusion quality over the previous method and the baselines while remaining computationally light and interpretable.</w:t>
       </w:r>
     </w:p>
     <w:p>
@@ -2343,12 +2336,7 @@
         <w:jc w:val="both"/>
       </w:pPr>
       <w:r>
-        <w:rPr>
-          <w:rFonts w:ascii="Arial" w:cs="Arial" w:eastAsia="Arial" w:hAnsi="Arial"/>
-          <w:sz w:val="24"/>
-          <w:szCs w:val="24"/>
-        </w:rPr>
-        <w:t xml:space="preserve">Proponer y evaluar un método de fusión de imágenes visibles e infrarrojas basado en una Torre Top-Hat morfológica multiescala, comparándolo cuantitativa y estadísticamente con métodos de referencia del estado del arte sobre el dataset TNO Image Fusion.</w:t>
+        <w:t>Proponer y evaluar un método óptimo multiescala de fusión de imágenes visibles e infrarrojas basado en la transformada Top-Hat con elementos estructurantes circulares y lineales y parámetros optimizados por enjambre de partículas (PSO), comparándolo con el método anterior (Torre Top-Hat) y con baselines clásicos, y analizando su impacto en tareas posteriores de detección de objetos.</w:t>
       </w:r>
     </w:p>
     <w:p>
@@ -2380,12 +2368,7 @@
         <w:jc w:val="both"/>
       </w:pPr>
       <w:r>
-        <w:rPr>
-          <w:rFonts w:ascii="Arial" w:cs="Arial" w:eastAsia="Arial" w:hAnsi="Arial"/>
-          <w:sz w:val="24"/>
-          <w:szCs w:val="24"/>
-        </w:rPr>
-        <w:t xml:space="preserve">Implementar la Torre Top-Hat multiescala con tres geometrías de elemento estructurante (disco, cuadrado, cruz), múltiples niveles de descomposición y radios base configurables.</w:t>
+        <w:t>Formular el método óptimo multiescala: descomposición en cascada con cinco elementos estructurantes por escala (un disco y cuatro lineales a 0°, 45°, 90° y 135°), combinados por máximo, adaptada al esquema de fusión VIS/IR.</w:t>
       </w:r>
     </w:p>
     <w:p>
@@ -2399,12 +2382,7 @@
         <w:jc w:val="both"/>
       </w:pPr>
       <w:r>
-        <w:rPr>
-          <w:rFonts w:ascii="Arial" w:cs="Arial" w:eastAsia="Arial" w:hAnsi="Arial"/>
-          <w:sz w:val="24"/>
-          <w:szCs w:val="24"/>
-        </w:rPr>
-        <w:t xml:space="preserve">Realizar un benchmark exhaustivo de las treinta y seis (36) configuraciones resultantes sobre los veinte (20) pares del dataset, identificando la configuración óptima por métrica.</w:t>
+        <w:t>Optimizar automáticamente los hiperparámetros del método (número de escalas, radio base y peso de contraste) mediante PSO con una función de aptitud orientada a la calidad de fusión.</w:t>
       </w:r>
     </w:p>
     <w:p>
@@ -2418,12 +2396,7 @@
         <w:jc w:val="both"/>
       </w:pPr>
       <w:r>
-        <w:rPr>
-          <w:rFonts w:ascii="Arial" w:cs="Arial" w:eastAsia="Arial" w:hAnsi="Arial"/>
-          <w:sz w:val="24"/>
-          <w:szCs w:val="24"/>
-        </w:rPr>
-        <w:t xml:space="preserve">Comparar el método propuesto con tres baselines representativos del estado del arte: promedio, pirámide de Laplace y curvelet (vía wavelet 2D).</w:t>
+        <w:t>Comparar el método óptimo con el método anterior (Torre Top-Hat) y los baselines clásicos (promedio, pirámide de Laplace y curvelet) sobre doce métricas sin referencia, con pruebas no paramétricas (Friedman y Wilcoxon con corrección de Holm).</w:t>
       </w:r>
     </w:p>
     <w:p>
@@ -2437,31 +2410,7 @@
         <w:jc w:val="both"/>
       </w:pPr>
       <w:r>
-        <w:rPr>
-          <w:rFonts w:ascii="Arial" w:cs="Arial" w:eastAsia="Arial" w:hAnsi="Arial"/>
-          <w:sz w:val="24"/>
-          <w:szCs w:val="24"/>
-        </w:rPr>
-        <w:t xml:space="preserve">Validar las diferencias observadas mediante pruebas estadísticas no paramétricas (Friedman global y Wilcoxon pareado), construyendo un ranking promedio de métodos.</w:t>
-      </w:r>
-    </w:p>
-    <w:p>
-      <w:pPr>
-        <w:pStyle w:val="ListParagraph"/>
-        <w:numPr>
-          <w:ilvl w:val="0"/>
-          <w:numId w:val="2"/>
-        </w:numPr>
-        <w:spacing w:after="100" w:line="320"/>
-        <w:jc w:val="both"/>
-      </w:pPr>
-      <w:r>
-        <w:rPr>
-          <w:rFonts w:ascii="Arial" w:cs="Arial" w:eastAsia="Arial" w:hAnsi="Arial"/>
-          <w:sz w:val="24"/>
-          <w:szCs w:val="24"/>
-        </w:rPr>
-        <w:t xml:space="preserve">Discutir las implicancias prácticas de los hallazgos en términos de qué método es preferible bajo qué criterio de calidad.</w:t>
+        <w:t>Analizar el impacto de la fusión en una tarea posterior de detección de objetos (YOLO), evaluando la detectabilidad por modalidad de entrada.</w:t>
       </w:r>
     </w:p>
     <w:p>
@@ -12433,12 +12382,7 @@
         <w:jc w:val="both"/>
       </w:pPr>
       <w:r>
-        <w:rPr>
-          <w:rFonts w:ascii="Arial" w:cs="Arial" w:eastAsia="Arial" w:hAnsi="Arial"/>
-          <w:sz w:val="24"/>
-          <w:szCs w:val="24"/>
-        </w:rPr>
-        <w:t xml:space="preserve">Se diseñó, implementó y evaluó la Torre Top-Hat, una descomposición morfológica multiescala configurable, comparándola estadísticamente con tres baselines clásicos sobre el TNO Image Fusion Dataset. Las conclusiones específicas son las siguientes.</w:t>
+        <w:t>Se propuso, implementó y evaluó un método óptimo multiescala de fusión VIS/IR basado en Top-Hat con elementos estructurantes circulares y lineales y parámetros optimizados por PSO, comparándolo estadísticamente con el método anterior (Torre Top-Hat) y con baselines clásicos sobre el TNO Image Fusion Dataset. Las conclusiones específicas son:</w:t>
       </w:r>
     </w:p>
     <w:p>

</xml_diff>

<commit_message>
Marco teórico-conceptual: método óptimo multiescala (ec. 9-21) + PSO (Kennedy-Eberhart) y términos conceptuales
</commit_message>
<xml_diff>
--- a/docs/Tesis_Borrador.docx
+++ b/docs/Tesis_Borrador.docx
@@ -2804,16 +2804,7 @@
         <w:spacing w:after="100" w:before="180"/>
       </w:pPr>
       <w:r>
-        <w:rPr>
-          <w:rFonts w:ascii="Arial" w:cs="Arial" w:eastAsia="Arial" w:hAnsi="Arial"/>
-          <w:b/>
-          <w:bCs/>
-          <w:i/>
-          <w:iCs/>
-          <w:sz w:val="24"/>
-          <w:szCs w:val="24"/>
-        </w:rPr>
-        <w:t xml:space="preserve">Torre Top-Hat (método propuesto)</w:t>
+        <w:t>Torre Top-Hat (método anterior)</w:t>
       </w:r>
     </w:p>
     <w:p>
@@ -2822,7 +2813,7 @@
         <w:jc w:val="both"/>
       </w:pPr>
       <w:r>
-        <w:t>Sobre la transformada Top-Hat de una sola escala, esta tesis propone una descomposición multiescala iterativa, la Torre Top-Hat. Dada una imagen de entrada f, se aplica White Top-Hat con SE de radio r₀, obteniendo la primera capa de detalle WTH₁; el residual de la apertura γ(f, b₁) se procesa nuevamente con SE de radio 2·r₀, dando WTH₂; el procedimiento se repite hasta el nivel L. La imagen queda descompuesta en L capas de detalle más una capa base (la apertura iterada R_L). La descomposición es exacta: la suma de las L capas WTH más la base reconstruye f. Para fusionar dos imágenes (VIS e IR) se aplica esta descomposición a cada una en paralelo y se opera capa a capa con dos reglas distintas: (i) las L capas de detalle WTH se fusionan por selección de máxima actividad local (suavizado gaussiano del valor absoluto), preservando por píxel el detalle más saliente de cualquiera de las fuentes; y (ii) la capa base, que codifica la iluminación o temperatura global de baja frecuencia, se fusiona por promedio simple. Esta distinción es crítica: aplicar selección por máxima actividad a la base genera saltos de brillo y sesga las métricas de información mutua.</w:t>
+        <w:t>Sobre la transformada Top-Hat de una sola escala, esta tesis desarrolló inicialmente una descomposición multiescala iterativa, la Torre Top-Hat, que en este trabajo constituye el método anterior o base de comparación. Dada una imagen de entrada f, se aplica White Top-Hat con SE de radio r₀, obteniendo la primera capa de detalle WTH₁; el residual de la apertura γ(f, b₁) se procesa nuevamente con SE de radio 2·r₀, dando WTH₂; el procedimiento se repite hasta el nivel L. La imagen queda descompuesta en L capas de detalle más una capa base (la apertura iterada R_L). La descomposición es exacta: la suma de las L capas WTH más la base reconstruye f. Para fusionar dos imágenes (VIS e IR) se aplica esta descomposición a cada una en paralelo y se opera capa a capa con dos reglas distintas: (i) las L capas de detalle WTH se fusionan por selección de máxima actividad local (suavizado gaussiano del valor absoluto), preservando por píxel el detalle más saliente de cualquiera de las fuentes; y (ii) la capa base, que codifica la iluminación o temperatura global de baja frecuencia, se fusiona por promedio simple. Esta distinción es crítica: aplicar selección por máxima actividad a la base genera saltos de brillo y sesga las métricas de información mutua.</w:t>
       </w:r>
     </w:p>
     <w:p>
@@ -2913,12 +2904,12 @@
         <w:pStyle w:val="Heading3"/>
       </w:pPr>
       <w:r>
-        <w:t>Método óptimo basado en Top-Hat (disco y lineales) con PSO</w:t>
-      </w:r>
-    </w:p>
-    <w:p>
-      <w:r>
-        <w:t>Como evolución de la Torre Top-Hat se propone el método óptimo, que enriquece el operador morfológico combinando elementos estructurantes de dos geometrías —un disco y cuatro líneas orientadas a 0°, 45°, 90° y 135°— inspirado en el realce multiescala de Román et al. para mamografías (transformadas top-hat con SE circulares y lineales, ecuaciones 9–14). Para cada fuente, la transformada White Top-Hat combinada se define como la suma de la respuesta del disco y el promedio de las cuatro respuestas lineales:</w:t>
+        <w:t>Método óptimo multiescala con elementos estructurantes circulares y lineales optimizado por PSO</w:t>
+      </w:r>
+    </w:p>
+    <w:p>
+      <w:r>
+        <w:t>La propuesta central de esta tesis es un método de fusión morfológica multiescala que generaliza la transformada Top-Hat sobre dos ejes simultáneos: la geometría del elemento estructurante y la escala de análisis. El método adapta a la fusión VIS/IR la metodología de realce de contraste multiescala de Román et al. (2024) para mamografías —sección 2.1.4, ecuaciones (9)–(21)—, que combina elementos estructurantes circulares y lineales en una cascada de escalas, y la integra con el esquema de fusión ponderada y de optimización por enjambre de partículas de Ortega y Espinoza (FPUNA, 2025). Frente a la Torre Top-Hat (método anterior), que emplea un único disco por escala y reglas de selección ajustadas a mano, el método óptimo multiescala enriquece el operador con sensibilidad direccional, encadena las escalas para separar el detalle fino de la estructura gruesa, y reemplaza el ajuste manual de hiperparámetros por una búsqueda automática guiada por la calidad de fusión.</w:t>
       </w:r>
     </w:p>
     <w:p>
@@ -2926,20 +2917,27 @@
         <w:jc w:val="center"/>
       </w:pPr>
       <w:r>
-        <w:rPr>
-          <w:b/>
-        </w:rPr>
-        <w:t>WTH = WTH_disco + (1/4) Σθ WTH_lineal(θ),     θ ∈ {0°, 45°, 90°, 135°}</w:t>
-      </w:r>
-    </w:p>
-    <w:p>
-      <w:r>
-        <w:t>y análogamente la Black Top-Hat con el cierre. El disco responde de forma isótropa a regiones sin orientación dominante, mientras que las líneas resaltan estructuras direccionales; su combinación captura detalles complementarios. La fusión sigue el esquema de Ortega y Espinoza (FPUNA, 2025): sobre la imagen base I_base = (VIS+IR)/2 se suma el máximo por píxel de las WTH y se resta el máximo de las BTH de ambas fuentes, ponderado por un peso de contraste m: I_FUS = I_base + m·máx(WTH_VIS, WTH_IR) − m·máx(BTH_VIS, BTH_IR).</w:t>
-      </w:r>
-    </w:p>
-    <w:p>
-      <w:r>
-        <w:t>Los dos hiperparámetros morfológicos —el radio r del elemento estructurante y el peso de contraste m— se ajustan automáticamente mediante Optimización por Enjambre de Partículas (PSO), eliminando el ajuste manual. El PSO maximiza una función de aptitud multicriterio F = SSIM_avg + E_n + PSNR_n (similitud estructural promedio respecto a las fuentes, entropía y PSNR normalizados), con 30 partículas y 30 iteraciones, inercia decreciente y coeficientes c1 = c2 = 1,5, sobre el rango r ∈ [1, 9], m ∈ [0,3, 2,0].</w:t>
+        <w:t>Elementos estructurantes circulares y lineales. En cada escala el operador no usa un único SE, sino cinco: un disco de radio r, que responde de forma isótropa a estructuras sin orientación dominante, y cuatro segmentos lineales de longitud 2r+1 orientados a 0°, 45°, 90° y 135°, cada uno sensible a estructuras alargadas en su dirección. Para una imagen f se calculan las cinco White Top-Hat y las cinco Black Top-Hat —WTH(f,b) = f − γ(f,b) y BTH(f,b) = φ(f,b) − f para cada SE b— y se combinan tomando el máximo por píxel (ecuaciones 9–14 del paper de referencia): WTH_i(f) = máx{ f − γ(f,b_disco), f − γ(f,b_0°), …, f − γ(f,b_135°) }, y de forma análoga BTH_i con los cierres φ. La combinación por máximo conserva en cada punto la respuesta del SE que mejor capta el detalle local, de modo que bordes diagonales, horizontales, verticales y regiones isótropas se realzan sin privilegiar a priori ninguna orientación.</w:t>
+      </w:r>
+    </w:p>
+    <w:p>
+      <w:r>
+        <w:t>Descomposición multiescala en cascada. El operador anterior se evalúa en n escalas crecientes, con radios r_i = r·i para i = 1,…,n, generando dos familias de mapas {WTH_i} y {BTH_i}. Para aislar los detalles que aparecen entre escalas consecutivas se calculan las diferencias en cascada (ecuaciones 15–16): WTHS_2 = WTH_2 − WTH_1 y, para i ≥ 3, WTHS_i = WTH_i − WTHS_{i−2}, con la construcción dual para BTHS_i. De cada familia se extrae el máximo por píxel a lo largo de las escalas (ecuaciones 17–20): WTH_M y BTH_M agregan el detalle directo de todas las escalas, mientras que WTHS_M y BTHS_M agregan el detalle diferencial entre escalas. Así, las estructuras brillantes y oscuras finas y gruesas quedan representadas en mapas separados pero combinables, evitando que las escalas grandes dominen sobre las pequeñas.</w:t>
+      </w:r>
+    </w:p>
+    <w:p>
+      <w:r>
+        <w:t>Reconstrucción y regla de fusión. Las imágenes VIS e IR se procesan en paralelo y sus mapas se combinan por máximo por píxel, conservando para cada fuente el detalle más saliente: WTH_M = máx(WTH_M^VIS, WTH_M^IR), e igualmente para BTH_M, WTHS_M y BTHS_M. Sobre la imagen base I_base = (I_VIS + I_IR)/2, que retiene la iluminación y la temperatura global de baja frecuencia, se suman los realces brillantes y se restan los oscuros, ponderados por un peso de contraste m (adaptación de la ecuación 21 del paper de mamografías al esquema de fusión de la ecuación 12 de Ortega y Espinoza): F = I_base + m·(WTH_M + WTHS_M) − m·(BTH_M + BTHS_M). El término con WTH realza las estructuras brillantes —típicamente objetos cálidos del canal IR—, el término con BTH oscurece los valles —contornos y sombras del canal visible— y el peso m gradúa la intensidad del realce: valores altos maximizan el contraste a costa de introducir artefactos, valores bajos preservan la fidelidad a las fuentes.</w:t>
+      </w:r>
+    </w:p>
+    <w:p>
+      <w:r>
+        <w:t>Optimización por Enjambre de Partículas (PSO). El método tiene tres hiperparámetros —el número de escalas n, el radio base r y el peso de contraste m— cuyo ajuste manual es costoso y subjetivo. Para fijarlos automáticamente se emplea la Optimización por Enjambre de Partículas (Kennedy y Eberhart, 1995), una metaheurística poblacional inspirada en el comportamiento colectivo de las bandadas. Cada partícula es una solución candidata x = (n, r, m) que se desplaza por el espacio de búsqueda recordando su mejor posición propia (pbest) y la mejor posición de todo el enjambre (gbest). En cada iteración t la velocidad y la posición se actualizan según v_{t+1} = w·v_t + c₁·r₁·(pbest − x_t) + c₂·r₂·(gbest − x_t) y x_{t+1} = x_t + v_{t+1}, donde w es la inercia, c₁ y c₂ son los coeficientes cognitivo y social, y r₁, r₂ ∈ [0,1] son números aleatorios. La implementación usa 30 partículas durante 30 iteraciones, con c₁ = c₂ = 1,5 e inercia decreciente de 0,9 a 0,4 para transitar de la exploración global al refinamiento local.</w:t>
+      </w:r>
+    </w:p>
+    <w:p>
+      <w:r>
+        <w:t>Función de aptitud orientada a la fusión. A diferencia de la formulación original de Ortega y Espinoza —que maximiza F = SSIM + E + PSNR y, al premiar el realce conservador, conduce a óptimos triviales en este problema—, aquí el PSO maximiza una aptitud orientada explícitamente a la calidad de fusión: F = SSIM + Qabf + 0,5·SCD − Nabf, que recompensa la similitud estructural, la preservación de bordes y la correlación de las diferencias, y penaliza los artefactos. El enjambre convergió de forma estable al óptimo n = 6 escalas, r ≈ 2,89 y m = 0,10, configuración con la que se evalúa el método en el capítulo de resultados.</w:t>
       </w:r>
     </w:p>
     <w:p>
@@ -4341,6 +4339,84 @@
           <w:szCs w:val="24"/>
         </w:rPr>
         <w:t xml:space="preserve">Prueba estadística no paramétrica de rangos signados para comparaciones pareadas, utilizada en esta tesis para confrontar cada configuración Top-Hat contra cada baseline.</w:t>
+      </w:r>
+    </w:p>
+    <w:p>
+      <w:pPr>
+        <w:pStyle w:val="Heading2"/>
+      </w:pPr>
+      <w:r>
+        <w:t>Elemento estructurante lineal</w:t>
+      </w:r>
+    </w:p>
+    <w:p>
+      <w:r>
+        <w:t>Segmento recto de longitud 2r+1 orientado a un ángulo determinado (0°, 45°, 90° o 135°), usado como elemento estructurante para resaltar estructuras alargadas en esa dirección. A diferencia del disco, que es isótropo, el SE lineal es direccional; el método óptimo combina un disco y cuatro líneas por escala para cubrir todas las orientaciones.</w:t>
+      </w:r>
+    </w:p>
+    <w:p>
+      <w:pPr>
+        <w:pStyle w:val="Heading2"/>
+      </w:pPr>
+      <w:r>
+        <w:t>Combinación de respuestas por máximo</w:t>
+      </w:r>
+    </w:p>
+    <w:p>
+      <w:r>
+        <w:t>Regla que, dadas varias transformadas Top-Hat obtenidas con distintos elementos estructurantes sobre la misma imagen, conserva en cada píxel el valor máximo. Selecciona localmente el SE que mejor capta el detalle, sin privilegiar a priori ninguna geometría ni orientación.</w:t>
+      </w:r>
+    </w:p>
+    <w:p>
+      <w:pPr>
+        <w:pStyle w:val="Heading2"/>
+      </w:pPr>
+      <w:r>
+        <w:t>Descomposición multiescala en cascada</w:t>
+      </w:r>
+    </w:p>
+    <w:p>
+      <w:r>
+        <w:t>Esquema que evalúa la Top-Hat en escalas crecientes (radios r_i = r·i) y calcula diferencias entre escalas consecutivas (WTHS_i, BTHS_i) para separar el detalle fino del grueso, agregando después cada familia por máximo. Permite representar estructuras de distinto tamaño en mapas combinables y es la base del método óptimo multiescala.</w:t>
+      </w:r>
+    </w:p>
+    <w:p>
+      <w:pPr>
+        <w:pStyle w:val="Heading2"/>
+      </w:pPr>
+      <w:r>
+        <w:t>Peso de ajuste de contraste (m)</w:t>
+      </w:r>
+    </w:p>
+    <w:p>
+      <w:r>
+        <w:t>Escalar que pondera cuánto se suman los realces brillantes (WTH) y se restan los oscuros (BTH) sobre la imagen base en la regla de fusión. Valores altos aumentan el contraste a riesgo de artefactos; valores bajos preservan la fidelidad a las fuentes. En el método óptimo se ajusta automáticamente por PSO.</w:t>
+      </w:r>
+    </w:p>
+    <w:p>
+      <w:pPr>
+        <w:pStyle w:val="Heading2"/>
+      </w:pPr>
+      <w:r>
+        <w:t>Optimización por Enjambre de Partículas (PSO)</w:t>
+      </w:r>
+    </w:p>
+    <w:p>
+      <w:r>
+        <w:t>Metaheurística poblacional (Kennedy y Eberhart, 1995) que busca el óptimo de una función moviendo un conjunto de partículas según su mejor posición individual (pbest) y la mejor global del enjambre (gbest). En esta tesis ajusta automáticamente los hiperparámetros (n, r, m) del método óptimo multiescala.</w:t>
+      </w:r>
+    </w:p>
+    <w:p>
+      <w:pPr>
+        <w:pStyle w:val="Heading2"/>
+      </w:pPr>
+      <w:r>
+        <w:t>Función de aptitud</w:t>
+      </w:r>
+    </w:p>
+    <w:p>
+      <w:r>
+        <w:t>Criterio escalar que el PSO maximiza para evaluar cada solución candidata. Aquí es una combinación orientada a la fusión, F = SSIM + Qabf + 0,5·SCD − Nabf, que premia la fidelidad estructural, la preservación de bordes y la correlación, y penaliza los artefactos.</w:t>
       </w:r>
     </w:p>
     <w:p>

</xml_diff>

<commit_message>
Marco teórico: ecuaciones nativas LaTeX/OMML numeradas (1-9), 4 figuras esquemáticas, tablas de notación/configuración/baselines; renumeración de figuras
</commit_message>
<xml_diff>
--- a/docs/Tesis_Borrador.docx
+++ b/docs/Tesis_Borrador.docx
@@ -2704,6 +2704,793 @@
     </w:p>
     <w:p>
       <w:pPr>
+        <w:jc w:val="left"/>
+      </w:pPr>
+      <w:r>
+        <w:rPr>
+          <w:i/>
+          <w:sz w:val="18"/>
+        </w:rPr>
+        <w:t>Tabla 1. Notación empleada en el marco teórico.</w:t>
+      </w:r>
+    </w:p>
+    <w:tbl>
+      <w:tblPr>
+        <w:tblW w:type="dxa" w:w="9360"/>
+        <w:tblLayout w:type="fixed"/>
+        <w:tblLook w:firstColumn="1" w:firstRow="1" w:lastColumn="0" w:lastRow="0" w:noHBand="0" w:noVBand="1" w:val="04A0"/>
+        <w:tblW/>
+        <w:tblBorders>
+          <w:top w:val="single" w:sz="4" w:space="0" w:color="B0B8C0"/>
+          <w:left w:val="single" w:sz="4" w:space="0" w:color="B0B8C0"/>
+          <w:bottom w:val="single" w:sz="4" w:space="0" w:color="B0B8C0"/>
+          <w:right w:val="single" w:sz="4" w:space="0" w:color="B0B8C0"/>
+          <w:insideH w:val="single" w:sz="4" w:space="0" w:color="B0B8C0"/>
+          <w:insideV w:val="single" w:sz="4" w:space="0" w:color="B0B8C0"/>
+        </w:tblBorders>
+      </w:tblPr>
+      <w:tblGrid>
+        <w:gridCol w:w="4550"/>
+        <w:gridCol w:w="4550"/>
+      </w:tblGrid>
+      <w:tr>
+        <w:tc>
+          <w:tcPr>
+            <w:tcW w:type="dxa" w:w="4550"/>
+            <w:tcW w:w="2400" w:type="dxa"/>
+            <w:shd w:val="clear" w:fill="1F3B57"/>
+            <w:tcMar>
+              <w:top w:w="40" w:type="dxa"/>
+              <w:bottom w:w="40" w:type="dxa"/>
+              <w:left w:w="90" w:type="dxa"/>
+              <w:right w:w="90" w:type="dxa"/>
+            </w:tcMar>
+          </w:tcPr>
+          <w:p>
+            <w:r/>
+            <w:r>
+              <w:rPr>
+                <w:b/>
+                <w:color w:val="FFFFFF"/>
+                <w:sz w:val="19"/>
+              </w:rPr>
+              <w:t>Símbolo</w:t>
+            </w:r>
+          </w:p>
+        </w:tc>
+        <w:tc>
+          <w:tcPr>
+            <w:tcW w:type="dxa" w:w="4550"/>
+            <w:tcW w:w="6960" w:type="dxa"/>
+            <w:shd w:val="clear" w:fill="1F3B57"/>
+            <w:tcMar>
+              <w:top w:w="40" w:type="dxa"/>
+              <w:bottom w:w="40" w:type="dxa"/>
+              <w:left w:w="90" w:type="dxa"/>
+              <w:right w:w="90" w:type="dxa"/>
+            </w:tcMar>
+          </w:tcPr>
+          <w:p>
+            <w:r/>
+            <w:r>
+              <w:rPr>
+                <w:b/>
+                <w:color w:val="FFFFFF"/>
+                <w:sz w:val="19"/>
+              </w:rPr>
+              <w:t>Significado</w:t>
+            </w:r>
+          </w:p>
+        </w:tc>
+      </w:tr>
+      <w:tr>
+        <w:tc>
+          <w:tcPr>
+            <w:tcW w:type="dxa" w:w="4550"/>
+            <w:tcW w:w="2400" w:type="dxa"/>
+            <w:tcMar>
+              <w:top w:w="40" w:type="dxa"/>
+              <w:bottom w:w="40" w:type="dxa"/>
+              <w:left w:w="90" w:type="dxa"/>
+              <w:right w:w="90" w:type="dxa"/>
+            </w:tcMar>
+          </w:tcPr>
+          <w:p>
+            <w:r/>
+            <w:r>
+              <w:rPr>
+                <w:sz w:val="19"/>
+              </w:rPr>
+              <w:t>f</w:t>
+            </w:r>
+          </w:p>
+        </w:tc>
+        <w:tc>
+          <w:tcPr>
+            <w:tcW w:type="dxa" w:w="4550"/>
+            <w:tcW w:w="6960" w:type="dxa"/>
+            <w:tcMar>
+              <w:top w:w="40" w:type="dxa"/>
+              <w:bottom w:w="40" w:type="dxa"/>
+              <w:left w:w="90" w:type="dxa"/>
+              <w:right w:w="90" w:type="dxa"/>
+            </w:tcMar>
+          </w:tcPr>
+          <w:p>
+            <w:r/>
+            <w:r>
+              <w:rPr>
+                <w:sz w:val="19"/>
+              </w:rPr>
+              <w:t>Imagen de entrada en escala de gris [0,1] (VIS o IR)</w:t>
+            </w:r>
+          </w:p>
+        </w:tc>
+      </w:tr>
+      <w:tr>
+        <w:tc>
+          <w:tcPr>
+            <w:tcW w:type="dxa" w:w="4550"/>
+            <w:tcW w:w="2400" w:type="dxa"/>
+            <w:tcMar>
+              <w:top w:w="40" w:type="dxa"/>
+              <w:bottom w:w="40" w:type="dxa"/>
+              <w:left w:w="90" w:type="dxa"/>
+              <w:right w:w="90" w:type="dxa"/>
+            </w:tcMar>
+          </w:tcPr>
+          <w:p>
+            <w:r/>
+            <w:r>
+              <w:rPr>
+                <w:sz w:val="19"/>
+              </w:rPr>
+              <w:t>b</w:t>
+            </w:r>
+          </w:p>
+        </w:tc>
+        <w:tc>
+          <w:tcPr>
+            <w:tcW w:type="dxa" w:w="4550"/>
+            <w:tcW w:w="6960" w:type="dxa"/>
+            <w:tcMar>
+              <w:top w:w="40" w:type="dxa"/>
+              <w:bottom w:w="40" w:type="dxa"/>
+              <w:left w:w="90" w:type="dxa"/>
+              <w:right w:w="90" w:type="dxa"/>
+            </w:tcMar>
+          </w:tcPr>
+          <w:p>
+            <w:r/>
+            <w:r>
+              <w:rPr>
+                <w:sz w:val="19"/>
+              </w:rPr>
+              <w:t>Elemento estructurante (disco o segmento lineal)</w:t>
+            </w:r>
+          </w:p>
+        </w:tc>
+      </w:tr>
+      <w:tr>
+        <w:tc>
+          <w:tcPr>
+            <w:tcW w:type="dxa" w:w="4550"/>
+            <w:tcW w:w="2400" w:type="dxa"/>
+            <w:tcMar>
+              <w:top w:w="40" w:type="dxa"/>
+              <w:bottom w:w="40" w:type="dxa"/>
+              <w:left w:w="90" w:type="dxa"/>
+              <w:right w:w="90" w:type="dxa"/>
+            </w:tcMar>
+          </w:tcPr>
+          <w:p>
+            <w:r/>
+            <w:r>
+              <w:rPr>
+                <w:sz w:val="19"/>
+              </w:rPr>
+              <w:t>ε(f,b), δ(f,b)</w:t>
+            </w:r>
+          </w:p>
+        </w:tc>
+        <w:tc>
+          <w:tcPr>
+            <w:tcW w:type="dxa" w:w="4550"/>
+            <w:tcW w:w="6960" w:type="dxa"/>
+            <w:tcMar>
+              <w:top w:w="40" w:type="dxa"/>
+              <w:bottom w:w="40" w:type="dxa"/>
+              <w:left w:w="90" w:type="dxa"/>
+              <w:right w:w="90" w:type="dxa"/>
+            </w:tcMar>
+          </w:tcPr>
+          <w:p>
+            <w:r/>
+            <w:r>
+              <w:rPr>
+                <w:sz w:val="19"/>
+              </w:rPr>
+              <w:t>Erosión y dilatación de f con b</w:t>
+            </w:r>
+          </w:p>
+        </w:tc>
+      </w:tr>
+      <w:tr>
+        <w:tc>
+          <w:tcPr>
+            <w:tcW w:type="dxa" w:w="4550"/>
+            <w:tcW w:w="2400" w:type="dxa"/>
+            <w:tcMar>
+              <w:top w:w="40" w:type="dxa"/>
+              <w:bottom w:w="40" w:type="dxa"/>
+              <w:left w:w="90" w:type="dxa"/>
+              <w:right w:w="90" w:type="dxa"/>
+            </w:tcMar>
+          </w:tcPr>
+          <w:p>
+            <w:r/>
+            <w:r>
+              <w:rPr>
+                <w:sz w:val="19"/>
+              </w:rPr>
+              <w:t>γ(f,b), φ(f,b)</w:t>
+            </w:r>
+          </w:p>
+        </w:tc>
+        <w:tc>
+          <w:tcPr>
+            <w:tcW w:type="dxa" w:w="4550"/>
+            <w:tcW w:w="6960" w:type="dxa"/>
+            <w:tcMar>
+              <w:top w:w="40" w:type="dxa"/>
+              <w:bottom w:w="40" w:type="dxa"/>
+              <w:left w:w="90" w:type="dxa"/>
+              <w:right w:w="90" w:type="dxa"/>
+            </w:tcMar>
+          </w:tcPr>
+          <w:p>
+            <w:r/>
+            <w:r>
+              <w:rPr>
+                <w:sz w:val="19"/>
+              </w:rPr>
+              <w:t>Apertura y cierre de f con b</w:t>
+            </w:r>
+          </w:p>
+        </w:tc>
+      </w:tr>
+      <w:tr>
+        <w:tc>
+          <w:tcPr>
+            <w:tcW w:type="dxa" w:w="4550"/>
+            <w:tcW w:w="2400" w:type="dxa"/>
+            <w:tcMar>
+              <w:top w:w="40" w:type="dxa"/>
+              <w:bottom w:w="40" w:type="dxa"/>
+              <w:left w:w="90" w:type="dxa"/>
+              <w:right w:w="90" w:type="dxa"/>
+            </w:tcMar>
+          </w:tcPr>
+          <w:p>
+            <w:r/>
+            <w:r>
+              <w:rPr>
+                <w:sz w:val="19"/>
+              </w:rPr>
+              <w:t>WTH, BTH</w:t>
+            </w:r>
+          </w:p>
+        </w:tc>
+        <w:tc>
+          <w:tcPr>
+            <w:tcW w:type="dxa" w:w="4550"/>
+            <w:tcW w:w="6960" w:type="dxa"/>
+            <w:tcMar>
+              <w:top w:w="40" w:type="dxa"/>
+              <w:bottom w:w="40" w:type="dxa"/>
+              <w:left w:w="90" w:type="dxa"/>
+              <w:right w:w="90" w:type="dxa"/>
+            </w:tcMar>
+          </w:tcPr>
+          <w:p>
+            <w:r/>
+            <w:r>
+              <w:rPr>
+                <w:sz w:val="19"/>
+              </w:rPr>
+              <w:t>White Top-Hat y Black Top-Hat</w:t>
+            </w:r>
+          </w:p>
+        </w:tc>
+      </w:tr>
+      <w:tr>
+        <w:tc>
+          <w:tcPr>
+            <w:tcW w:type="dxa" w:w="4550"/>
+            <w:tcW w:w="2400" w:type="dxa"/>
+            <w:tcMar>
+              <w:top w:w="40" w:type="dxa"/>
+              <w:bottom w:w="40" w:type="dxa"/>
+              <w:left w:w="90" w:type="dxa"/>
+              <w:right w:w="90" w:type="dxa"/>
+            </w:tcMar>
+          </w:tcPr>
+          <w:p>
+            <w:r/>
+            <w:r>
+              <w:rPr>
+                <w:sz w:val="19"/>
+              </w:rPr>
+              <w:t>r</w:t>
+            </w:r>
+          </w:p>
+        </w:tc>
+        <w:tc>
+          <w:tcPr>
+            <w:tcW w:type="dxa" w:w="4550"/>
+            <w:tcW w:w="6960" w:type="dxa"/>
+            <w:tcMar>
+              <w:top w:w="40" w:type="dxa"/>
+              <w:bottom w:w="40" w:type="dxa"/>
+              <w:left w:w="90" w:type="dxa"/>
+              <w:right w:w="90" w:type="dxa"/>
+            </w:tcMar>
+          </w:tcPr>
+          <w:p>
+            <w:r/>
+            <w:r>
+              <w:rPr>
+                <w:sz w:val="19"/>
+              </w:rPr>
+              <w:t>Radio (base) del elemento estructurante</w:t>
+            </w:r>
+          </w:p>
+        </w:tc>
+      </w:tr>
+      <w:tr>
+        <w:tc>
+          <w:tcPr>
+            <w:tcW w:type="dxa" w:w="4550"/>
+            <w:tcW w:w="2400" w:type="dxa"/>
+            <w:tcMar>
+              <w:top w:w="40" w:type="dxa"/>
+              <w:bottom w:w="40" w:type="dxa"/>
+              <w:left w:w="90" w:type="dxa"/>
+              <w:right w:w="90" w:type="dxa"/>
+            </w:tcMar>
+          </w:tcPr>
+          <w:p>
+            <w:r/>
+            <w:r>
+              <w:rPr>
+                <w:sz w:val="19"/>
+              </w:rPr>
+              <w:t>n</w:t>
+            </w:r>
+          </w:p>
+        </w:tc>
+        <w:tc>
+          <w:tcPr>
+            <w:tcW w:type="dxa" w:w="4550"/>
+            <w:tcW w:w="6960" w:type="dxa"/>
+            <w:tcMar>
+              <w:top w:w="40" w:type="dxa"/>
+              <w:bottom w:w="40" w:type="dxa"/>
+              <w:left w:w="90" w:type="dxa"/>
+              <w:right w:w="90" w:type="dxa"/>
+            </w:tcMar>
+          </w:tcPr>
+          <w:p>
+            <w:r/>
+            <w:r>
+              <w:rPr>
+                <w:sz w:val="19"/>
+              </w:rPr>
+              <w:t>Número de escalas de la cascada multiescala</w:t>
+            </w:r>
+          </w:p>
+        </w:tc>
+      </w:tr>
+      <w:tr>
+        <w:tc>
+          <w:tcPr>
+            <w:tcW w:type="dxa" w:w="4550"/>
+            <w:tcW w:w="2400" w:type="dxa"/>
+            <w:tcMar>
+              <w:top w:w="40" w:type="dxa"/>
+              <w:bottom w:w="40" w:type="dxa"/>
+              <w:left w:w="90" w:type="dxa"/>
+              <w:right w:w="90" w:type="dxa"/>
+            </w:tcMar>
+          </w:tcPr>
+          <w:p>
+            <w:r/>
+            <w:r>
+              <w:rPr>
+                <w:sz w:val="19"/>
+              </w:rPr>
+              <w:t>m</w:t>
+            </w:r>
+          </w:p>
+        </w:tc>
+        <w:tc>
+          <w:tcPr>
+            <w:tcW w:type="dxa" w:w="4550"/>
+            <w:tcW w:w="6960" w:type="dxa"/>
+            <w:tcMar>
+              <w:top w:w="40" w:type="dxa"/>
+              <w:bottom w:w="40" w:type="dxa"/>
+              <w:left w:w="90" w:type="dxa"/>
+              <w:right w:w="90" w:type="dxa"/>
+            </w:tcMar>
+          </w:tcPr>
+          <w:p>
+            <w:r/>
+            <w:r>
+              <w:rPr>
+                <w:sz w:val="19"/>
+              </w:rPr>
+              <w:t>Peso de ajuste de contraste</w:t>
+            </w:r>
+          </w:p>
+        </w:tc>
+      </w:tr>
+      <w:tr>
+        <w:tc>
+          <w:tcPr>
+            <w:tcW w:type="dxa" w:w="4550"/>
+            <w:tcW w:w="2400" w:type="dxa"/>
+            <w:tcMar>
+              <w:top w:w="40" w:type="dxa"/>
+              <w:bottom w:w="40" w:type="dxa"/>
+              <w:left w:w="90" w:type="dxa"/>
+              <w:right w:w="90" w:type="dxa"/>
+            </w:tcMar>
+          </w:tcPr>
+          <w:p>
+            <w:r/>
+            <w:r>
+              <w:rPr>
+                <w:sz w:val="19"/>
+              </w:rPr>
+              <w:t>WTHᵢ, BTHᵢ</w:t>
+            </w:r>
+          </w:p>
+        </w:tc>
+        <w:tc>
+          <w:tcPr>
+            <w:tcW w:type="dxa" w:w="4550"/>
+            <w:tcW w:w="6960" w:type="dxa"/>
+            <w:tcMar>
+              <w:top w:w="40" w:type="dxa"/>
+              <w:bottom w:w="40" w:type="dxa"/>
+              <w:left w:w="90" w:type="dxa"/>
+              <w:right w:w="90" w:type="dxa"/>
+            </w:tcMar>
+          </w:tcPr>
+          <w:p>
+            <w:r/>
+            <w:r>
+              <w:rPr>
+                <w:sz w:val="19"/>
+              </w:rPr>
+              <w:t>Top-Hat combinada (5 SE, máx.) en la escala i</w:t>
+            </w:r>
+          </w:p>
+        </w:tc>
+      </w:tr>
+      <w:tr>
+        <w:tc>
+          <w:tcPr>
+            <w:tcW w:type="dxa" w:w="4550"/>
+            <w:tcW w:w="2400" w:type="dxa"/>
+            <w:tcMar>
+              <w:top w:w="40" w:type="dxa"/>
+              <w:bottom w:w="40" w:type="dxa"/>
+              <w:left w:w="90" w:type="dxa"/>
+              <w:right w:w="90" w:type="dxa"/>
+            </w:tcMar>
+          </w:tcPr>
+          <w:p>
+            <w:r/>
+            <w:r>
+              <w:rPr>
+                <w:sz w:val="19"/>
+              </w:rPr>
+              <w:t>WTHSᵢ, BTHSᵢ</w:t>
+            </w:r>
+          </w:p>
+        </w:tc>
+        <w:tc>
+          <w:tcPr>
+            <w:tcW w:type="dxa" w:w="4550"/>
+            <w:tcW w:w="6960" w:type="dxa"/>
+            <w:tcMar>
+              <w:top w:w="40" w:type="dxa"/>
+              <w:bottom w:w="40" w:type="dxa"/>
+              <w:left w:w="90" w:type="dxa"/>
+              <w:right w:w="90" w:type="dxa"/>
+            </w:tcMar>
+          </w:tcPr>
+          <w:p>
+            <w:r/>
+            <w:r>
+              <w:rPr>
+                <w:sz w:val="19"/>
+              </w:rPr>
+              <w:t>Diferencia en cascada entre escalas consecutivas</w:t>
+            </w:r>
+          </w:p>
+        </w:tc>
+      </w:tr>
+      <w:tr>
+        <w:tc>
+          <w:tcPr>
+            <w:tcW w:type="dxa" w:w="4550"/>
+            <w:tcW w:w="2400" w:type="dxa"/>
+            <w:tcMar>
+              <w:top w:w="40" w:type="dxa"/>
+              <w:bottom w:w="40" w:type="dxa"/>
+              <w:left w:w="90" w:type="dxa"/>
+              <w:right w:w="90" w:type="dxa"/>
+            </w:tcMar>
+          </w:tcPr>
+          <w:p>
+            <w:r/>
+            <w:r>
+              <w:rPr>
+                <w:sz w:val="19"/>
+              </w:rPr>
+              <w:t>WTH_M, WTHS_M</w:t>
+            </w:r>
+          </w:p>
+        </w:tc>
+        <w:tc>
+          <w:tcPr>
+            <w:tcW w:type="dxa" w:w="4550"/>
+            <w:tcW w:w="6960" w:type="dxa"/>
+            <w:tcMar>
+              <w:top w:w="40" w:type="dxa"/>
+              <w:bottom w:w="40" w:type="dxa"/>
+              <w:left w:w="90" w:type="dxa"/>
+              <w:right w:w="90" w:type="dxa"/>
+            </w:tcMar>
+          </w:tcPr>
+          <w:p>
+            <w:r/>
+            <w:r>
+              <w:rPr>
+                <w:sz w:val="19"/>
+              </w:rPr>
+              <w:t>Agregación por máximo entre escalas (ídem BTH)</w:t>
+            </w:r>
+          </w:p>
+        </w:tc>
+      </w:tr>
+      <w:tr>
+        <w:tc>
+          <w:tcPr>
+            <w:tcW w:type="dxa" w:w="4550"/>
+            <w:tcW w:w="2400" w:type="dxa"/>
+            <w:tcMar>
+              <w:top w:w="40" w:type="dxa"/>
+              <w:bottom w:w="40" w:type="dxa"/>
+              <w:left w:w="90" w:type="dxa"/>
+              <w:right w:w="90" w:type="dxa"/>
+            </w:tcMar>
+          </w:tcPr>
+          <w:p>
+            <w:r/>
+            <w:r>
+              <w:rPr>
+                <w:sz w:val="19"/>
+              </w:rPr>
+              <w:t>I_base</w:t>
+            </w:r>
+          </w:p>
+        </w:tc>
+        <w:tc>
+          <w:tcPr>
+            <w:tcW w:type="dxa" w:w="4550"/>
+            <w:tcW w:w="6960" w:type="dxa"/>
+            <w:tcMar>
+              <w:top w:w="40" w:type="dxa"/>
+              <w:bottom w:w="40" w:type="dxa"/>
+              <w:left w:w="90" w:type="dxa"/>
+              <w:right w:w="90" w:type="dxa"/>
+            </w:tcMar>
+          </w:tcPr>
+          <w:p>
+            <w:r/>
+            <w:r>
+              <w:rPr>
+                <w:sz w:val="19"/>
+              </w:rPr>
+              <w:t>Imagen base, (I_VIS + I_IR)/2</w:t>
+            </w:r>
+          </w:p>
+        </w:tc>
+      </w:tr>
+      <w:tr>
+        <w:tc>
+          <w:tcPr>
+            <w:tcW w:type="dxa" w:w="4550"/>
+            <w:tcW w:w="2400" w:type="dxa"/>
+            <w:tcMar>
+              <w:top w:w="40" w:type="dxa"/>
+              <w:bottom w:w="40" w:type="dxa"/>
+              <w:left w:w="90" w:type="dxa"/>
+              <w:right w:w="90" w:type="dxa"/>
+            </w:tcMar>
+          </w:tcPr>
+          <w:p>
+            <w:r/>
+            <w:r>
+              <w:rPr>
+                <w:sz w:val="19"/>
+              </w:rPr>
+              <w:t>F</w:t>
+            </w:r>
+          </w:p>
+        </w:tc>
+        <w:tc>
+          <w:tcPr>
+            <w:tcW w:type="dxa" w:w="4550"/>
+            <w:tcW w:w="6960" w:type="dxa"/>
+            <w:tcMar>
+              <w:top w:w="40" w:type="dxa"/>
+              <w:bottom w:w="40" w:type="dxa"/>
+              <w:left w:w="90" w:type="dxa"/>
+              <w:right w:w="90" w:type="dxa"/>
+            </w:tcMar>
+          </w:tcPr>
+          <w:p>
+            <w:r/>
+            <w:r>
+              <w:rPr>
+                <w:sz w:val="19"/>
+              </w:rPr>
+              <w:t>Imagen fusionada</w:t>
+            </w:r>
+          </w:p>
+        </w:tc>
+      </w:tr>
+      <w:tr>
+        <w:tc>
+          <w:tcPr>
+            <w:tcW w:type="dxa" w:w="4550"/>
+            <w:tcW w:w="2400" w:type="dxa"/>
+            <w:tcMar>
+              <w:top w:w="40" w:type="dxa"/>
+              <w:bottom w:w="40" w:type="dxa"/>
+              <w:left w:w="90" w:type="dxa"/>
+              <w:right w:w="90" w:type="dxa"/>
+            </w:tcMar>
+          </w:tcPr>
+          <w:p>
+            <w:r/>
+            <w:r>
+              <w:rPr>
+                <w:sz w:val="19"/>
+              </w:rPr>
+              <w:t>x, v</w:t>
+            </w:r>
+          </w:p>
+        </w:tc>
+        <w:tc>
+          <w:tcPr>
+            <w:tcW w:type="dxa" w:w="4550"/>
+            <w:tcW w:w="6960" w:type="dxa"/>
+            <w:tcMar>
+              <w:top w:w="40" w:type="dxa"/>
+              <w:bottom w:w="40" w:type="dxa"/>
+              <w:left w:w="90" w:type="dxa"/>
+              <w:right w:w="90" w:type="dxa"/>
+            </w:tcMar>
+          </w:tcPr>
+          <w:p>
+            <w:r/>
+            <w:r>
+              <w:rPr>
+                <w:sz w:val="19"/>
+              </w:rPr>
+              <w:t>Posición y velocidad de una partícula (PSO)</w:t>
+            </w:r>
+          </w:p>
+        </w:tc>
+      </w:tr>
+      <w:tr>
+        <w:tc>
+          <w:tcPr>
+            <w:tcW w:type="dxa" w:w="4550"/>
+            <w:tcW w:w="2400" w:type="dxa"/>
+            <w:tcMar>
+              <w:top w:w="40" w:type="dxa"/>
+              <w:bottom w:w="40" w:type="dxa"/>
+              <w:left w:w="90" w:type="dxa"/>
+              <w:right w:w="90" w:type="dxa"/>
+            </w:tcMar>
+          </w:tcPr>
+          <w:p>
+            <w:r/>
+            <w:r>
+              <w:rPr>
+                <w:sz w:val="19"/>
+              </w:rPr>
+              <w:t>pbest, gbest</w:t>
+            </w:r>
+          </w:p>
+        </w:tc>
+        <w:tc>
+          <w:tcPr>
+            <w:tcW w:type="dxa" w:w="4550"/>
+            <w:tcW w:w="6960" w:type="dxa"/>
+            <w:tcMar>
+              <w:top w:w="40" w:type="dxa"/>
+              <w:bottom w:w="40" w:type="dxa"/>
+              <w:left w:w="90" w:type="dxa"/>
+              <w:right w:w="90" w:type="dxa"/>
+            </w:tcMar>
+          </w:tcPr>
+          <w:p>
+            <w:r/>
+            <w:r>
+              <w:rPr>
+                <w:sz w:val="19"/>
+              </w:rPr>
+              <w:t>Mejor posición individual y global del enjambre</w:t>
+            </w:r>
+          </w:p>
+        </w:tc>
+      </w:tr>
+      <w:tr>
+        <w:tc>
+          <w:tcPr>
+            <w:tcW w:type="dxa" w:w="4550"/>
+            <w:tcW w:w="2400" w:type="dxa"/>
+            <w:tcMar>
+              <w:top w:w="40" w:type="dxa"/>
+              <w:bottom w:w="40" w:type="dxa"/>
+              <w:left w:w="90" w:type="dxa"/>
+              <w:right w:w="90" w:type="dxa"/>
+            </w:tcMar>
+          </w:tcPr>
+          <w:p>
+            <w:r/>
+            <w:r>
+              <w:rPr>
+                <w:sz w:val="19"/>
+              </w:rPr>
+              <w:t>w, c₁, c₂</w:t>
+            </w:r>
+          </w:p>
+        </w:tc>
+        <w:tc>
+          <w:tcPr>
+            <w:tcW w:type="dxa" w:w="4550"/>
+            <w:tcW w:w="6960" w:type="dxa"/>
+            <w:tcMar>
+              <w:top w:w="40" w:type="dxa"/>
+              <w:bottom w:w="40" w:type="dxa"/>
+              <w:left w:w="90" w:type="dxa"/>
+              <w:right w:w="90" w:type="dxa"/>
+            </w:tcMar>
+          </w:tcPr>
+          <w:p>
+            <w:r/>
+            <w:r>
+              <w:rPr>
+                <w:sz w:val="19"/>
+              </w:rPr>
+              <w:t>Inercia y coeficientes cognitivo y social (PSO)</w:t>
+            </w:r>
+          </w:p>
+        </w:tc>
+      </w:tr>
+    </w:tbl>
+    <w:p/>
+    <w:p>
+      <w:pPr>
         <w:pStyle w:val="Heading3"/>
         <w:spacing w:after="100" w:before="180"/>
       </w:pPr>
@@ -2766,6 +3553,174 @@
         <w:t xml:space="preserve">La morfología matemática es un cuerpo algebraico para el análisis de estructuras geométricas en imágenes, basado en la teoría de retículas completas (Serra, 1982; Soille, 2003). Sus operaciones fundamentales en imágenes de niveles de gris son la erosión ε(f, b) y la dilatación δ(f, b), definidas como mínimo y máximo locales bajo el patrón impuesto por el elemento estructurante b. A partir de ellas se derivan apertura γ(f, b) = δ(ε(f, b), b) y cierre φ(f, b) = ε(δ(f, b), b), que eliminan respectivamente picos brillantes y valles oscuros menores que el SE. La elección del SE (geometría y radio) es la decisión de diseño central: define qué orientaciones, simetrías y escalas de detalle se preservan o suprimen.</w:t>
       </w:r>
     </w:p>
+    <w:tbl>
+      <w:tblPr>
+        <w:tblW w:w="9360" w:type="dxa"/>
+        <w:tblBorders>
+          <w:top w:val="none"/>
+          <w:left w:val="none"/>
+          <w:bottom w:val="none"/>
+          <w:right w:val="none"/>
+          <w:insideH w:val="none"/>
+          <w:insideV w:val="none"/>
+        </w:tblBorders>
+      </w:tblPr>
+      <w:tblGrid>
+        <w:gridCol w:w="900"/>
+        <w:gridCol w:w="7560"/>
+        <w:gridCol w:w="900"/>
+      </w:tblGrid>
+      <w:tr>
+        <w:tc>
+          <w:tcPr>
+            <w:tcW w:w="900" w:type="dxa"/>
+            <w:vAlign w:val="center"/>
+          </w:tcPr>
+          <w:p/>
+        </w:tc>
+        <w:tc>
+          <w:tcPr>
+            <w:tcW w:w="7560" w:type="dxa"/>
+            <w:vAlign w:val="center"/>
+          </w:tcPr>
+          <w:p>
+            <w:pPr>
+              <w:jc w:val="center"/>
+            </w:pPr>
+            <m:oMath>
+              <m:r>
+                <m:t>γ</m:t>
+              </m:r>
+              <m:r>
+                <m:t>(</m:t>
+              </m:r>
+              <m:r>
+                <m:t>f</m:t>
+              </m:r>
+              <m:r>
+                <m:t>,</m:t>
+              </m:r>
+              <m:r>
+                <m:t>b</m:t>
+              </m:r>
+              <m:r>
+                <m:t>)</m:t>
+              </m:r>
+              <m:r>
+                <m:t>=</m:t>
+              </m:r>
+              <m:r>
+                <m:t>δ</m:t>
+              </m:r>
+              <m:r>
+                <m:t>(</m:t>
+              </m:r>
+              <m:r>
+                <m:t>ε</m:t>
+              </m:r>
+              <m:r>
+                <m:t>(</m:t>
+              </m:r>
+              <m:r>
+                <m:t>f</m:t>
+              </m:r>
+              <m:r>
+                <m:t>,</m:t>
+              </m:r>
+              <m:r>
+                <m:t>b</m:t>
+              </m:r>
+              <m:r>
+                <m:t>)</m:t>
+              </m:r>
+              <m:r>
+                <m:t>,</m:t>
+              </m:r>
+              <m:r>
+                <m:t>b</m:t>
+              </m:r>
+              <m:r>
+                <m:t>)</m:t>
+              </m:r>
+              <m:r>
+                <m:t>,</m:t>
+              </m:r>
+              <m:r>
+                <m:t>  </m:t>
+              </m:r>
+              <m:r>
+                <m:t>φ</m:t>
+              </m:r>
+              <m:r>
+                <m:t>(</m:t>
+              </m:r>
+              <m:r>
+                <m:t>f</m:t>
+              </m:r>
+              <m:r>
+                <m:t>,</m:t>
+              </m:r>
+              <m:r>
+                <m:t>b</m:t>
+              </m:r>
+              <m:r>
+                <m:t>)</m:t>
+              </m:r>
+              <m:r>
+                <m:t>=</m:t>
+              </m:r>
+              <m:r>
+                <m:t>ε</m:t>
+              </m:r>
+              <m:r>
+                <m:t>(</m:t>
+              </m:r>
+              <m:r>
+                <m:t>δ</m:t>
+              </m:r>
+              <m:r>
+                <m:t>(</m:t>
+              </m:r>
+              <m:r>
+                <m:t>f</m:t>
+              </m:r>
+              <m:r>
+                <m:t>,</m:t>
+              </m:r>
+              <m:r>
+                <m:t>b</m:t>
+              </m:r>
+              <m:r>
+                <m:t>)</m:t>
+              </m:r>
+              <m:r>
+                <m:t>,</m:t>
+              </m:r>
+              <m:r>
+                <m:t>b</m:t>
+              </m:r>
+              <m:r>
+                <m:t>)</m:t>
+              </m:r>
+            </m:oMath>
+          </w:p>
+        </w:tc>
+        <w:tc>
+          <w:tcPr>
+            <w:tcW w:w="900" w:type="dxa"/>
+            <w:vAlign w:val="center"/>
+          </w:tcPr>
+          <w:p>
+            <w:pPr>
+              <w:jc w:val="right"/>
+            </w:pPr>
+            <w:r>
+              <w:t>(1)</w:t>
+            </w:r>
+          </w:p>
+        </w:tc>
+      </w:tr>
+    </w:tbl>
     <w:p>
       <w:pPr>
         <w:pStyle w:val="Heading3"/>
@@ -2798,6 +3753,238 @@
         <w:t xml:space="preserve">La transformada White Top-Hat se define como la diferencia entre la imagen original y su apertura: WTH(f, b) = f − γ(f, b). Aísla las estructuras brillantes más pequeñas que el SE. Su dual, la Black Top-Hat, BTH(f, b) = φ(f, b) − f, aísla los valles oscuros. Una propiedad clave es que el WTH es siempre no negativo y se anula en regiones donde la imagen es localmente plana a la escala del SE, lo que la convierte en un detector natural de detalles. La elección del tipo de SE (disco para isotropía, línea para direcciones específicas, cuadrado o cruz para sensibilidades distintas) determina qué tipo de detalle se enfatiza.</w:t>
       </w:r>
     </w:p>
+    <w:tbl>
+      <w:tblPr>
+        <w:tblW w:w="9360" w:type="dxa"/>
+        <w:tblBorders>
+          <w:top w:val="none"/>
+          <w:left w:val="none"/>
+          <w:bottom w:val="none"/>
+          <w:right w:val="none"/>
+          <w:insideH w:val="none"/>
+          <w:insideV w:val="none"/>
+        </w:tblBorders>
+      </w:tblPr>
+      <w:tblGrid>
+        <w:gridCol w:w="900"/>
+        <w:gridCol w:w="7560"/>
+        <w:gridCol w:w="900"/>
+      </w:tblGrid>
+      <w:tr>
+        <w:tc>
+          <w:tcPr>
+            <w:tcW w:w="900" w:type="dxa"/>
+            <w:vAlign w:val="center"/>
+          </w:tcPr>
+          <w:p/>
+        </w:tc>
+        <w:tc>
+          <w:tcPr>
+            <w:tcW w:w="7560" w:type="dxa"/>
+            <w:vAlign w:val="center"/>
+          </w:tcPr>
+          <w:p>
+            <w:pPr>
+              <w:jc w:val="center"/>
+            </w:pPr>
+            <m:oMath>
+              <m:r>
+                <m:rPr>
+                  <m:sty m:val="p"/>
+                </m:rPr>
+                <m:t>W</m:t>
+              </m:r>
+              <m:r>
+                <m:rPr>
+                  <m:sty m:val="p"/>
+                </m:rPr>
+                <m:t>T</m:t>
+              </m:r>
+              <m:r>
+                <m:rPr>
+                  <m:sty m:val="p"/>
+                </m:rPr>
+                <m:t>H</m:t>
+              </m:r>
+              <m:r>
+                <m:t>(</m:t>
+              </m:r>
+              <m:r>
+                <m:t>f</m:t>
+              </m:r>
+              <m:r>
+                <m:t>,</m:t>
+              </m:r>
+              <m:r>
+                <m:t>b</m:t>
+              </m:r>
+              <m:r>
+                <m:t>)</m:t>
+              </m:r>
+              <m:r>
+                <m:t>=</m:t>
+              </m:r>
+              <m:r>
+                <m:t>f</m:t>
+              </m:r>
+              <m:r>
+                <m:t>−</m:t>
+              </m:r>
+              <m:r>
+                <m:t>γ</m:t>
+              </m:r>
+              <m:r>
+                <m:t>(</m:t>
+              </m:r>
+              <m:r>
+                <m:t>f</m:t>
+              </m:r>
+              <m:r>
+                <m:t>,</m:t>
+              </m:r>
+              <m:r>
+                <m:t>b</m:t>
+              </m:r>
+              <m:r>
+                <m:t>)</m:t>
+              </m:r>
+              <m:r>
+                <m:t>,</m:t>
+              </m:r>
+              <m:r>
+                <m:t>  </m:t>
+              </m:r>
+              <m:r>
+                <m:rPr>
+                  <m:sty m:val="p"/>
+                </m:rPr>
+                <m:t>B</m:t>
+              </m:r>
+              <m:r>
+                <m:rPr>
+                  <m:sty m:val="p"/>
+                </m:rPr>
+                <m:t>T</m:t>
+              </m:r>
+              <m:r>
+                <m:rPr>
+                  <m:sty m:val="p"/>
+                </m:rPr>
+                <m:t>H</m:t>
+              </m:r>
+              <m:r>
+                <m:t>(</m:t>
+              </m:r>
+              <m:r>
+                <m:t>f</m:t>
+              </m:r>
+              <m:r>
+                <m:t>,</m:t>
+              </m:r>
+              <m:r>
+                <m:t>b</m:t>
+              </m:r>
+              <m:r>
+                <m:t>)</m:t>
+              </m:r>
+              <m:r>
+                <m:t>=</m:t>
+              </m:r>
+              <m:r>
+                <m:t>φ</m:t>
+              </m:r>
+              <m:r>
+                <m:t>(</m:t>
+              </m:r>
+              <m:r>
+                <m:t>f</m:t>
+              </m:r>
+              <m:r>
+                <m:t>,</m:t>
+              </m:r>
+              <m:r>
+                <m:t>b</m:t>
+              </m:r>
+              <m:r>
+                <m:t>)</m:t>
+              </m:r>
+              <m:r>
+                <m:t>−</m:t>
+              </m:r>
+              <m:r>
+                <m:t>f</m:t>
+              </m:r>
+            </m:oMath>
+          </w:p>
+        </w:tc>
+        <w:tc>
+          <w:tcPr>
+            <w:tcW w:w="900" w:type="dxa"/>
+            <w:vAlign w:val="center"/>
+          </w:tcPr>
+          <w:p>
+            <w:pPr>
+              <w:jc w:val="right"/>
+            </w:pPr>
+            <w:r>
+              <w:t>(2)</w:t>
+            </w:r>
+          </w:p>
+        </w:tc>
+      </w:tr>
+    </w:tbl>
+    <w:p>
+      <w:pPr>
+        <w:jc w:val="center"/>
+      </w:pPr>
+      <w:r>
+        <w:drawing>
+          <wp:inline xmlns:a="http://schemas.openxmlformats.org/drawingml/2006/main" xmlns:pic="http://schemas.openxmlformats.org/drawingml/2006/picture">
+            <wp:extent cx="5760720" cy="2827990"/>
+            <wp:docPr id="8" name="Picture 8"/>
+            <wp:cNvGraphicFramePr>
+              <a:graphicFrameLocks noChangeAspect="1"/>
+            </wp:cNvGraphicFramePr>
+            <a:graphic>
+              <a:graphicData uri="http://schemas.openxmlformats.org/drawingml/2006/picture">
+                <pic:pic>
+                  <pic:nvPicPr>
+                    <pic:cNvPr id="0" name="fig_morfologia_tophat.png"/>
+                    <pic:cNvPicPr/>
+                  </pic:nvPicPr>
+                  <pic:blipFill>
+                    <a:blip r:embed="rId21"/>
+                    <a:stretch>
+                      <a:fillRect/>
+                    </a:stretch>
+                  </pic:blipFill>
+                  <pic:spPr>
+                    <a:xfrm>
+                      <a:off x="0" y="0"/>
+                      <a:ext cx="5760720" cy="2827990"/>
+                    </a:xfrm>
+                    <a:prstGeom prst="rect"/>
+                  </pic:spPr>
+                </pic:pic>
+              </a:graphicData>
+            </a:graphic>
+          </wp:inline>
+        </w:drawing>
+      </w:r>
+    </w:p>
+    <w:p>
+      <w:pPr>
+        <w:jc w:val="left"/>
+      </w:pPr>
+      <w:r>
+        <w:rPr>
+          <w:i/>
+          <w:sz w:val="18"/>
+        </w:rPr>
+        <w:t>Figura 1. Operaciones morfológicas (erosión, dilatación, apertura y cierre) y transformada Top-Hat sobre un perfil de intensidad.</w:t>
+      </w:r>
+    </w:p>
+    <w:p/>
     <w:p>
       <w:pPr>
         <w:pStyle w:val="Heading3"/>
@@ -2821,17 +4008,210 @@
         <w:t>La imagen fusionada final se reconstruye según la regla:</w:t>
       </w:r>
     </w:p>
-    <w:p>
-      <w:pPr>
-        <w:jc w:val="center"/>
-      </w:pPr>
-      <w:r>
-        <w:rPr>
-          <w:b/>
-        </w:rPr>
-        <w:t>F = base_fusionada + Σₖ WTHₖ^fus − Σₖ BTHₖ^fus</w:t>
-      </w:r>
-    </w:p>
+    <w:tbl>
+      <w:tblPr>
+        <w:tblW w:w="9360" w:type="dxa"/>
+        <w:tblBorders>
+          <w:top w:val="none"/>
+          <w:left w:val="none"/>
+          <w:bottom w:val="none"/>
+          <w:right w:val="none"/>
+          <w:insideH w:val="none"/>
+          <w:insideV w:val="none"/>
+        </w:tblBorders>
+      </w:tblPr>
+      <w:tblGrid>
+        <w:gridCol w:w="900"/>
+        <w:gridCol w:w="7560"/>
+        <w:gridCol w:w="900"/>
+      </w:tblGrid>
+      <w:tr>
+        <w:tc>
+          <w:tcPr>
+            <w:tcW w:w="900" w:type="dxa"/>
+            <w:vAlign w:val="center"/>
+          </w:tcPr>
+          <w:p/>
+        </w:tc>
+        <w:tc>
+          <w:tcPr>
+            <w:tcW w:w="7560" w:type="dxa"/>
+            <w:vAlign w:val="center"/>
+          </w:tcPr>
+          <w:p>
+            <w:pPr>
+              <w:jc w:val="center"/>
+            </w:pPr>
+            <m:oMath>
+              <m:r>
+                <m:t>F</m:t>
+              </m:r>
+              <m:r>
+                <m:t>=</m:t>
+              </m:r>
+              <m:sSub>
+                <m:e>
+                  <m:r>
+                    <m:t>I</m:t>
+                  </m:r>
+                </m:e>
+                <m:sub>
+                  <m:r>
+                    <m:rPr>
+                      <m:nor/>
+                      <m:sty m:val="p"/>
+                    </m:rPr>
+                    <m:t>base</m:t>
+                  </m:r>
+                </m:sub>
+              </m:sSub>
+              <m:r>
+                <m:t>+</m:t>
+              </m:r>
+              <m:nary>
+                <m:naryPr>
+                  <m:chr m:val="∑"/>
+                  <m:limLoc m:val="undOvr"/>
+                  <m:subHide m:val="0"/>
+                  <m:supHide m:val="1"/>
+                </m:naryPr>
+                <m:sub>
+                  <m:r>
+                    <m:t>k</m:t>
+                  </m:r>
+                </m:sub>
+                <m:sup>
+                  <m:r>
+                    <m:t>​</m:t>
+                  </m:r>
+                </m:sup>
+                <m:e>
+                  <m:sSubSup>
+                    <m:e>
+                      <m:r>
+                        <m:rPr>
+                          <m:sty m:val="p"/>
+                        </m:rPr>
+                        <m:t>W</m:t>
+                      </m:r>
+                      <m:r>
+                        <m:rPr>
+                          <m:sty m:val="p"/>
+                        </m:rPr>
+                        <m:t>T</m:t>
+                      </m:r>
+                      <m:r>
+                        <m:rPr>
+                          <m:sty m:val="p"/>
+                        </m:rPr>
+                        <m:t>H</m:t>
+                      </m:r>
+                    </m:e>
+                    <m:sub>
+                      <m:r>
+                        <m:t>k</m:t>
+                      </m:r>
+                    </m:sub>
+                    <m:sup>
+                      <m:r>
+                        <m:t> </m:t>
+                      </m:r>
+                      <m:r>
+                        <m:t>f</m:t>
+                      </m:r>
+                      <m:r>
+                        <m:t>u</m:t>
+                      </m:r>
+                      <m:r>
+                        <m:t>s</m:t>
+                      </m:r>
+                    </m:sup>
+                  </m:sSubSup>
+                </m:e>
+              </m:nary>
+              <m:r>
+                <m:t>−</m:t>
+              </m:r>
+              <m:nary>
+                <m:naryPr>
+                  <m:chr m:val="∑"/>
+                  <m:limLoc m:val="undOvr"/>
+                  <m:subHide m:val="0"/>
+                  <m:supHide m:val="1"/>
+                </m:naryPr>
+                <m:sub>
+                  <m:r>
+                    <m:t>k</m:t>
+                  </m:r>
+                </m:sub>
+                <m:sup>
+                  <m:r>
+                    <m:t>​</m:t>
+                  </m:r>
+                </m:sup>
+                <m:e>
+                  <m:sSubSup>
+                    <m:e>
+                      <m:r>
+                        <m:rPr>
+                          <m:sty m:val="p"/>
+                        </m:rPr>
+                        <m:t>B</m:t>
+                      </m:r>
+                      <m:r>
+                        <m:rPr>
+                          <m:sty m:val="p"/>
+                        </m:rPr>
+                        <m:t>T</m:t>
+                      </m:r>
+                      <m:r>
+                        <m:rPr>
+                          <m:sty m:val="p"/>
+                        </m:rPr>
+                        <m:t>H</m:t>
+                      </m:r>
+                    </m:e>
+                    <m:sub>
+                      <m:r>
+                        <m:t>k</m:t>
+                      </m:r>
+                    </m:sub>
+                    <m:sup>
+                      <m:r>
+                        <m:t> </m:t>
+                      </m:r>
+                      <m:r>
+                        <m:t>f</m:t>
+                      </m:r>
+                      <m:r>
+                        <m:t>u</m:t>
+                      </m:r>
+                      <m:r>
+                        <m:t>s</m:t>
+                      </m:r>
+                    </m:sup>
+                  </m:sSubSup>
+                </m:e>
+              </m:nary>
+            </m:oMath>
+          </w:p>
+        </w:tc>
+        <w:tc>
+          <w:tcPr>
+            <w:tcW w:w="900" w:type="dxa"/>
+            <w:vAlign w:val="center"/>
+          </w:tcPr>
+          <w:p>
+            <w:pPr>
+              <w:jc w:val="right"/>
+            </w:pPr>
+            <w:r>
+              <w:t>(3)</w:t>
+            </w:r>
+          </w:p>
+        </w:tc>
+      </w:tr>
+    </w:tbl>
     <w:p>
       <w:r>
         <w:t>Existen por tanto dos modos de operación. En el modo White Top-Hat (WTH), por defecto, el término de BTH es nulo y la fusión es F = base + Σ WTHₖ^fus, sumando únicamente el detalle brillante. En el modo White+Black Top-Hat (WTH+BTH), las capas BTH de VIS e IR también se fusionan por máxima actividad local y se restan en la reconstrucción, de modo que el WTH realza las estructuras brillantes y el BTH oscurece las estructuras oscuras, amplificando el contraste en ambos extremos. Esta tesis evalúa y compara ambos modos (Sección de resultados). Los parámetros explorados son: tipo de SE ∈ {disco, cuadrado, cruz}, niveles L ∈ {2, 3, 4, 5} y radio base r₀ ∈ {2, 3, 5}, lo que arroja treinta y seis configuraciones por modo.</w:t>
@@ -2890,13 +4270,10 @@
       </w:pPr>
       <w:r>
         <w:rPr>
-          <w:rFonts w:ascii="Arial" w:cs="Arial" w:eastAsia="Arial" w:hAnsi="Arial"/>
           <w:i/>
-          <w:iCs/>
-          <w:sz w:val="20"/>
-          <w:szCs w:val="20"/>
-        </w:rPr>
-        <w:t xml:space="preserve">Figura 1. Esquema conceptual de la Torre Top-Hat propuesta.</w:t>
+          <w:sz w:val="18"/>
+        </w:rPr>
+        <w:t>Figura 2. Esquema conceptual de la Torre Top-Hat (método anterior).</w:t>
       </w:r>
     </w:p>
     <w:p>
@@ -2917,29 +4294,2262 @@
         <w:jc w:val="center"/>
       </w:pPr>
       <w:r>
-        <w:t>Elementos estructurantes circulares y lineales. En cada escala el operador no usa un único SE, sino cinco: un disco de radio r, que responde de forma isótropa a estructuras sin orientación dominante, y cuatro segmentos lineales de longitud 2r+1 orientados a 0°, 45°, 90° y 135°, cada uno sensible a estructuras alargadas en su dirección. Para una imagen f se calculan las cinco White Top-Hat y las cinco Black Top-Hat —WTH(f,b) = f − γ(f,b) y BTH(f,b) = φ(f,b) − f para cada SE b— y se combinan tomando el máximo por píxel (ecuaciones 9–14 del paper de referencia): WTH_i(f) = máx{ f − γ(f,b_disco), f − γ(f,b_0°), …, f − γ(f,b_135°) }, y de forma análoga BTH_i con los cierres φ. La combinación por máximo conserva en cada punto la respuesta del SE que mejor capta el detalle local, de modo que bordes diagonales, horizontales, verticales y regiones isótropas se realzan sin privilegiar a priori ninguna orientación.</w:t>
-      </w:r>
-    </w:p>
-    <w:p>
-      <w:r>
-        <w:t>Descomposición multiescala en cascada. El operador anterior se evalúa en n escalas crecientes, con radios r_i = r·i para i = 1,…,n, generando dos familias de mapas {WTH_i} y {BTH_i}. Para aislar los detalles que aparecen entre escalas consecutivas se calculan las diferencias en cascada (ecuaciones 15–16): WTHS_2 = WTH_2 − WTH_1 y, para i ≥ 3, WTHS_i = WTH_i − WTHS_{i−2}, con la construcción dual para BTHS_i. De cada familia se extrae el máximo por píxel a lo largo de las escalas (ecuaciones 17–20): WTH_M y BTH_M agregan el detalle directo de todas las escalas, mientras que WTHS_M y BTHS_M agregan el detalle diferencial entre escalas. Así, las estructuras brillantes y oscuras finas y gruesas quedan representadas en mapas separados pero combinables, evitando que las escalas grandes dominen sobre las pequeñas.</w:t>
-      </w:r>
-    </w:p>
-    <w:p>
-      <w:r>
-        <w:t>Reconstrucción y regla de fusión. Las imágenes VIS e IR se procesan en paralelo y sus mapas se combinan por máximo por píxel, conservando para cada fuente el detalle más saliente: WTH_M = máx(WTH_M^VIS, WTH_M^IR), e igualmente para BTH_M, WTHS_M y BTHS_M. Sobre la imagen base I_base = (I_VIS + I_IR)/2, que retiene la iluminación y la temperatura global de baja frecuencia, se suman los realces brillantes y se restan los oscuros, ponderados por un peso de contraste m (adaptación de la ecuación 21 del paper de mamografías al esquema de fusión de la ecuación 12 de Ortega y Espinoza): F = I_base + m·(WTH_M + WTHS_M) − m·(BTH_M + BTHS_M). El término con WTH realza las estructuras brillantes —típicamente objetos cálidos del canal IR—, el término con BTH oscurece los valles —contornos y sombras del canal visible— y el peso m gradúa la intensidad del realce: valores altos maximizan el contraste a costa de introducir artefactos, valores bajos preservan la fidelidad a las fuentes.</w:t>
-      </w:r>
-    </w:p>
-    <w:p>
-      <w:r>
-        <w:t>Optimización por Enjambre de Partículas (PSO). El método tiene tres hiperparámetros —el número de escalas n, el radio base r y el peso de contraste m— cuyo ajuste manual es costoso y subjetivo. Para fijarlos automáticamente se emplea la Optimización por Enjambre de Partículas (Kennedy y Eberhart, 1995), una metaheurística poblacional inspirada en el comportamiento colectivo de las bandadas. Cada partícula es una solución candidata x = (n, r, m) que se desplaza por el espacio de búsqueda recordando su mejor posición propia (pbest) y la mejor posición de todo el enjambre (gbest). En cada iteración t la velocidad y la posición se actualizan según v_{t+1} = w·v_t + c₁·r₁·(pbest − x_t) + c₂·r₂·(gbest − x_t) y x_{t+1} = x_t + v_{t+1}, donde w es la inercia, c₁ y c₂ son los coeficientes cognitivo y social, y r₁, r₂ ∈ [0,1] son números aleatorios. La implementación usa 30 partículas durante 30 iteraciones, con c₁ = c₂ = 1,5 e inercia decreciente de 0,9 a 0,4 para transitar de la exploración global al refinamiento local.</w:t>
-      </w:r>
-    </w:p>
-    <w:p>
-      <w:r>
-        <w:t>Función de aptitud orientada a la fusión. A diferencia de la formulación original de Ortega y Espinoza —que maximiza F = SSIM + E + PSNR y, al premiar el realce conservador, conduce a óptimos triviales en este problema—, aquí el PSO maximiza una aptitud orientada explícitamente a la calidad de fusión: F = SSIM + Qabf + 0,5·SCD − Nabf, que recompensa la similitud estructural, la preservación de bordes y la correlación de las diferencias, y penaliza los artefactos. El enjambre convergió de forma estable al óptimo n = 6 escalas, r ≈ 2,89 y m = 0,10, configuración con la que se evalúa el método en el capítulo de resultados.</w:t>
-      </w:r>
-    </w:p>
+        <w:t>Elementos estructurantes circulares y lineales. En cada escala el operador no usa un único SE, sino cinco: un disco de radio r, que responde de forma isótropa a estructuras sin orientación dominante, y cuatro segmentos lineales de longitud 2r+1 orientados a 0°, 45°, 90° y 135°, cada uno sensible a estructuras alargadas en su dirección. Para una imagen f se calculan las cinco White Top-Hat y las cinco Black Top-Hat —WTH(f,b) = f − γ(f,b) y BTH(f,b) = φ(f,b) − f para cada SE b— y se combinan tomando el máximo por píxel, como expresa la ecuación (4) —en línea con las ecuaciones (9)–(14) del trabajo de referencia—, con la construcción dual de BTH_i a partir de los cierres φ. La combinación por máximo conserva en cada punto la respuesta del SE que mejor capta el detalle local, de modo que bordes diagonales, horizontales, verticales y regiones isótropas se realzan sin privilegiar a priori ninguna orientación.</w:t>
+      </w:r>
+    </w:p>
+    <w:tbl>
+      <w:tblPr>
+        <w:tblW w:w="9360" w:type="dxa"/>
+        <w:tblBorders>
+          <w:top w:val="none"/>
+          <w:left w:val="none"/>
+          <w:bottom w:val="none"/>
+          <w:right w:val="none"/>
+          <w:insideH w:val="none"/>
+          <w:insideV w:val="none"/>
+        </w:tblBorders>
+      </w:tblPr>
+      <w:tblGrid>
+        <w:gridCol w:w="900"/>
+        <w:gridCol w:w="7560"/>
+        <w:gridCol w:w="900"/>
+      </w:tblGrid>
+      <w:tr>
+        <w:tc>
+          <w:tcPr>
+            <w:tcW w:w="900" w:type="dxa"/>
+            <w:vAlign w:val="center"/>
+          </w:tcPr>
+          <w:p/>
+        </w:tc>
+        <w:tc>
+          <w:tcPr>
+            <w:tcW w:w="7560" w:type="dxa"/>
+            <w:vAlign w:val="center"/>
+          </w:tcPr>
+          <w:p>
+            <w:pPr>
+              <w:jc w:val="center"/>
+            </w:pPr>
+            <m:oMath>
+              <m:sSub>
+                <m:e>
+                  <m:r>
+                    <m:rPr>
+                      <m:sty m:val="p"/>
+                    </m:rPr>
+                    <m:t>W</m:t>
+                  </m:r>
+                  <m:r>
+                    <m:rPr>
+                      <m:sty m:val="p"/>
+                    </m:rPr>
+                    <m:t>T</m:t>
+                  </m:r>
+                  <m:r>
+                    <m:rPr>
+                      <m:sty m:val="p"/>
+                    </m:rPr>
+                    <m:t>H</m:t>
+                  </m:r>
+                </m:e>
+                <m:sub>
+                  <m:r>
+                    <m:t>i</m:t>
+                  </m:r>
+                </m:sub>
+              </m:sSub>
+              <m:r>
+                <m:t>(</m:t>
+              </m:r>
+              <m:r>
+                <m:t>f</m:t>
+              </m:r>
+              <m:r>
+                <m:t>)</m:t>
+              </m:r>
+              <m:r>
+                <m:t>=</m:t>
+              </m:r>
+              <m:r>
+                <m:rPr>
+                  <m:nor/>
+                  <m:sty m:val="p"/>
+                </m:rPr>
+                <m:t>max</m:t>
+              </m:r>
+              <m:r>
+                <m:t>{</m:t>
+              </m:r>
+              <m:r>
+                <m:t> </m:t>
+              </m:r>
+              <m:r>
+                <m:t>f</m:t>
+              </m:r>
+              <m:r>
+                <m:t>−</m:t>
+              </m:r>
+              <m:r>
+                <m:t>γ</m:t>
+              </m:r>
+              <m:r>
+                <m:t>(</m:t>
+              </m:r>
+              <m:r>
+                <m:t>f</m:t>
+              </m:r>
+              <m:r>
+                <m:t>,</m:t>
+              </m:r>
+              <m:sSub>
+                <m:e>
+                  <m:r>
+                    <m:t>b</m:t>
+                  </m:r>
+                </m:e>
+                <m:sub>
+                  <m:r>
+                    <m:rPr>
+                      <m:nor/>
+                      <m:sty m:val="p"/>
+                    </m:rPr>
+                    <m:t>disco</m:t>
+                  </m:r>
+                </m:sub>
+              </m:sSub>
+              <m:r>
+                <m:t>)</m:t>
+              </m:r>
+              <m:r>
+                <m:t>,</m:t>
+              </m:r>
+              <m:r>
+                <m:t> </m:t>
+              </m:r>
+              <m:r>
+                <m:t>f</m:t>
+              </m:r>
+              <m:r>
+                <m:t>−</m:t>
+              </m:r>
+              <m:r>
+                <m:t>γ</m:t>
+              </m:r>
+              <m:r>
+                <m:t>(</m:t>
+              </m:r>
+              <m:r>
+                <m:t>f</m:t>
+              </m:r>
+              <m:r>
+                <m:t>,</m:t>
+              </m:r>
+              <m:sSub>
+                <m:e>
+                  <m:r>
+                    <m:t>b</m:t>
+                  </m:r>
+                </m:e>
+                <m:sub>
+                  <m:sSup>
+                    <m:e>
+                      <m:r>
+                        <m:t>0</m:t>
+                      </m:r>
+                    </m:e>
+                    <m:sup>
+                      <m:r>
+                        <m:t>∘</m:t>
+                      </m:r>
+                    </m:sup>
+                  </m:sSup>
+                </m:sub>
+              </m:sSub>
+              <m:r>
+                <m:t>)</m:t>
+              </m:r>
+              <m:r>
+                <m:t>,</m:t>
+              </m:r>
+              <m:r>
+                <m:t> </m:t>
+              </m:r>
+              <m:r>
+                <m:t>…</m:t>
+              </m:r>
+              <m:r>
+                <m:t>,</m:t>
+              </m:r>
+              <m:r>
+                <m:t> </m:t>
+              </m:r>
+              <m:r>
+                <m:t>f</m:t>
+              </m:r>
+              <m:r>
+                <m:t>−</m:t>
+              </m:r>
+              <m:r>
+                <m:t>γ</m:t>
+              </m:r>
+              <m:r>
+                <m:t>(</m:t>
+              </m:r>
+              <m:r>
+                <m:t>f</m:t>
+              </m:r>
+              <m:r>
+                <m:t>,</m:t>
+              </m:r>
+              <m:sSub>
+                <m:e>
+                  <m:r>
+                    <m:t>b</m:t>
+                  </m:r>
+                </m:e>
+                <m:sub>
+                  <m:sSup>
+                    <m:e>
+                      <m:r>
+                        <m:t>135</m:t>
+                      </m:r>
+                    </m:e>
+                    <m:sup>
+                      <m:r>
+                        <m:t>∘</m:t>
+                      </m:r>
+                    </m:sup>
+                  </m:sSup>
+                </m:sub>
+              </m:sSub>
+              <m:r>
+                <m:t>)</m:t>
+              </m:r>
+              <m:r>
+                <m:t> </m:t>
+              </m:r>
+              <m:r>
+                <m:t>}</m:t>
+              </m:r>
+            </m:oMath>
+          </w:p>
+        </w:tc>
+        <w:tc>
+          <w:tcPr>
+            <w:tcW w:w="900" w:type="dxa"/>
+            <w:vAlign w:val="center"/>
+          </w:tcPr>
+          <w:p>
+            <w:pPr>
+              <w:jc w:val="right"/>
+            </w:pPr>
+            <w:r>
+              <w:t>(4)</w:t>
+            </w:r>
+          </w:p>
+        </w:tc>
+      </w:tr>
+    </w:tbl>
+    <w:p>
+      <w:pPr>
+        <w:jc w:val="center"/>
+      </w:pPr>
+      <w:r>
+        <w:drawing>
+          <wp:inline xmlns:a="http://schemas.openxmlformats.org/drawingml/2006/main" xmlns:pic="http://schemas.openxmlformats.org/drawingml/2006/picture">
+            <wp:extent cx="5760720" cy="1675846"/>
+            <wp:docPr id="9" name="Picture 9"/>
+            <wp:cNvGraphicFramePr>
+              <a:graphicFrameLocks noChangeAspect="1"/>
+            </wp:cNvGraphicFramePr>
+            <a:graphic>
+              <a:graphicData uri="http://schemas.openxmlformats.org/drawingml/2006/picture">
+                <pic:pic>
+                  <pic:nvPicPr>
+                    <pic:cNvPr id="0" name="fig_cinco_se.png"/>
+                    <pic:cNvPicPr/>
+                  </pic:nvPicPr>
+                  <pic:blipFill>
+                    <a:blip r:embed="rId22"/>
+                    <a:stretch>
+                      <a:fillRect/>
+                    </a:stretch>
+                  </pic:blipFill>
+                  <pic:spPr>
+                    <a:xfrm>
+                      <a:off x="0" y="0"/>
+                      <a:ext cx="5760720" cy="1675846"/>
+                    </a:xfrm>
+                    <a:prstGeom prst="rect"/>
+                  </pic:spPr>
+                </pic:pic>
+              </a:graphicData>
+            </a:graphic>
+          </wp:inline>
+        </w:drawing>
+      </w:r>
+    </w:p>
+    <w:p>
+      <w:pPr>
+        <w:jc w:val="left"/>
+      </w:pPr>
+      <w:r>
+        <w:rPr>
+          <w:i/>
+          <w:sz w:val="18"/>
+        </w:rPr>
+        <w:t>Figura 3. Banco de cinco elementos estructurantes (un disco y cuatro líneas) combinados por máximo por píxel.</w:t>
+      </w:r>
+    </w:p>
+    <w:p/>
+    <w:p>
+      <w:r>
+        <w:t>Descomposición multiescala en cascada. El operador anterior se evalúa en n escalas crecientes, con radios r_i = r·i para i = 1,…,n, generando dos familias de mapas {WTH_i} y {BTH_i}. Para aislar los detalles que aparecen entre escalas consecutivas se calculan las diferencias en cascada de la ecuación (5) —ecuaciones (15)–(16) del trabajo de referencia—, con la construcción dual para BTHS_i. De cada familia se extrae el máximo por píxel a lo largo de las escalas, según la ecuación (6) —ecuaciones (17)–(20)—: WTH_M y BTH_M agregan el detalle directo de todas las escalas, mientras que WTHS_M y BTHS_M agregan el detalle diferencial entre escalas. Así, las estructuras brillantes y oscuras finas y gruesas quedan representadas en mapas separados pero combinables, evitando que las escalas grandes dominen sobre las pequeñas.</w:t>
+      </w:r>
+    </w:p>
+    <w:tbl>
+      <w:tblPr>
+        <w:tblW w:w="9360" w:type="dxa"/>
+        <w:tblBorders>
+          <w:top w:val="none"/>
+          <w:left w:val="none"/>
+          <w:bottom w:val="none"/>
+          <w:right w:val="none"/>
+          <w:insideH w:val="none"/>
+          <w:insideV w:val="none"/>
+        </w:tblBorders>
+      </w:tblPr>
+      <w:tblGrid>
+        <w:gridCol w:w="900"/>
+        <w:gridCol w:w="7560"/>
+        <w:gridCol w:w="900"/>
+      </w:tblGrid>
+      <w:tr>
+        <w:tc>
+          <w:tcPr>
+            <w:tcW w:w="900" w:type="dxa"/>
+            <w:vAlign w:val="center"/>
+          </w:tcPr>
+          <w:p/>
+        </w:tc>
+        <w:tc>
+          <w:tcPr>
+            <w:tcW w:w="7560" w:type="dxa"/>
+            <w:vAlign w:val="center"/>
+          </w:tcPr>
+          <w:p>
+            <w:pPr>
+              <w:jc w:val="center"/>
+            </w:pPr>
+            <m:oMath>
+              <m:sSub>
+                <m:e>
+                  <m:r>
+                    <m:rPr>
+                      <m:sty m:val="p"/>
+                    </m:rPr>
+                    <m:t>W</m:t>
+                  </m:r>
+                  <m:r>
+                    <m:rPr>
+                      <m:sty m:val="p"/>
+                    </m:rPr>
+                    <m:t>T</m:t>
+                  </m:r>
+                  <m:r>
+                    <m:rPr>
+                      <m:sty m:val="p"/>
+                    </m:rPr>
+                    <m:t>H</m:t>
+                  </m:r>
+                  <m:r>
+                    <m:rPr>
+                      <m:sty m:val="p"/>
+                    </m:rPr>
+                    <m:t>S</m:t>
+                  </m:r>
+                </m:e>
+                <m:sub>
+                  <m:r>
+                    <m:t>2</m:t>
+                  </m:r>
+                </m:sub>
+              </m:sSub>
+              <m:r>
+                <m:t>=</m:t>
+              </m:r>
+              <m:sSub>
+                <m:e>
+                  <m:r>
+                    <m:rPr>
+                      <m:sty m:val="p"/>
+                    </m:rPr>
+                    <m:t>W</m:t>
+                  </m:r>
+                  <m:r>
+                    <m:rPr>
+                      <m:sty m:val="p"/>
+                    </m:rPr>
+                    <m:t>T</m:t>
+                  </m:r>
+                  <m:r>
+                    <m:rPr>
+                      <m:sty m:val="p"/>
+                    </m:rPr>
+                    <m:t>H</m:t>
+                  </m:r>
+                </m:e>
+                <m:sub>
+                  <m:r>
+                    <m:t>2</m:t>
+                  </m:r>
+                </m:sub>
+              </m:sSub>
+              <m:r>
+                <m:t>−</m:t>
+              </m:r>
+              <m:sSub>
+                <m:e>
+                  <m:r>
+                    <m:rPr>
+                      <m:sty m:val="p"/>
+                    </m:rPr>
+                    <m:t>W</m:t>
+                  </m:r>
+                  <m:r>
+                    <m:rPr>
+                      <m:sty m:val="p"/>
+                    </m:rPr>
+                    <m:t>T</m:t>
+                  </m:r>
+                  <m:r>
+                    <m:rPr>
+                      <m:sty m:val="p"/>
+                    </m:rPr>
+                    <m:t>H</m:t>
+                  </m:r>
+                </m:e>
+                <m:sub>
+                  <m:r>
+                    <m:t>1</m:t>
+                  </m:r>
+                </m:sub>
+              </m:sSub>
+              <m:r>
+                <m:t>,</m:t>
+              </m:r>
+              <m:r>
+                <m:t>  </m:t>
+              </m:r>
+              <m:sSub>
+                <m:e>
+                  <m:r>
+                    <m:rPr>
+                      <m:sty m:val="p"/>
+                    </m:rPr>
+                    <m:t>W</m:t>
+                  </m:r>
+                  <m:r>
+                    <m:rPr>
+                      <m:sty m:val="p"/>
+                    </m:rPr>
+                    <m:t>T</m:t>
+                  </m:r>
+                  <m:r>
+                    <m:rPr>
+                      <m:sty m:val="p"/>
+                    </m:rPr>
+                    <m:t>H</m:t>
+                  </m:r>
+                  <m:r>
+                    <m:rPr>
+                      <m:sty m:val="p"/>
+                    </m:rPr>
+                    <m:t>S</m:t>
+                  </m:r>
+                </m:e>
+                <m:sub>
+                  <m:r>
+                    <m:t>i</m:t>
+                  </m:r>
+                </m:sub>
+              </m:sSub>
+              <m:r>
+                <m:t>=</m:t>
+              </m:r>
+              <m:sSub>
+                <m:e>
+                  <m:r>
+                    <m:rPr>
+                      <m:sty m:val="p"/>
+                    </m:rPr>
+                    <m:t>W</m:t>
+                  </m:r>
+                  <m:r>
+                    <m:rPr>
+                      <m:sty m:val="p"/>
+                    </m:rPr>
+                    <m:t>T</m:t>
+                  </m:r>
+                  <m:r>
+                    <m:rPr>
+                      <m:sty m:val="p"/>
+                    </m:rPr>
+                    <m:t>H</m:t>
+                  </m:r>
+                </m:e>
+                <m:sub>
+                  <m:r>
+                    <m:t>i</m:t>
+                  </m:r>
+                </m:sub>
+              </m:sSub>
+              <m:r>
+                <m:t>−</m:t>
+              </m:r>
+              <m:sSub>
+                <m:e>
+                  <m:r>
+                    <m:rPr>
+                      <m:sty m:val="p"/>
+                    </m:rPr>
+                    <m:t>W</m:t>
+                  </m:r>
+                  <m:r>
+                    <m:rPr>
+                      <m:sty m:val="p"/>
+                    </m:rPr>
+                    <m:t>T</m:t>
+                  </m:r>
+                  <m:r>
+                    <m:rPr>
+                      <m:sty m:val="p"/>
+                    </m:rPr>
+                    <m:t>H</m:t>
+                  </m:r>
+                  <m:r>
+                    <m:rPr>
+                      <m:sty m:val="p"/>
+                    </m:rPr>
+                    <m:t>S</m:t>
+                  </m:r>
+                </m:e>
+                <m:sub>
+                  <m:r>
+                    <m:t>i</m:t>
+                  </m:r>
+                  <m:r>
+                    <m:t>−</m:t>
+                  </m:r>
+                  <m:r>
+                    <m:t>2</m:t>
+                  </m:r>
+                </m:sub>
+              </m:sSub>
+              <m:r>
+                <m:t> </m:t>
+              </m:r>
+              <m:r>
+                <m:t>(</m:t>
+              </m:r>
+              <m:r>
+                <m:t>i</m:t>
+              </m:r>
+              <m:r>
+                <m:t>≥</m:t>
+              </m:r>
+              <m:r>
+                <m:t>3</m:t>
+              </m:r>
+              <m:r>
+                <m:t>)</m:t>
+              </m:r>
+            </m:oMath>
+          </w:p>
+        </w:tc>
+        <w:tc>
+          <w:tcPr>
+            <w:tcW w:w="900" w:type="dxa"/>
+            <w:vAlign w:val="center"/>
+          </w:tcPr>
+          <w:p>
+            <w:pPr>
+              <w:jc w:val="right"/>
+            </w:pPr>
+            <w:r>
+              <w:t>(5)</w:t>
+            </w:r>
+          </w:p>
+        </w:tc>
+      </w:tr>
+    </w:tbl>
+    <w:tbl>
+      <w:tblPr>
+        <w:tblW w:w="9360" w:type="dxa"/>
+        <w:tblBorders>
+          <w:top w:val="none"/>
+          <w:left w:val="none"/>
+          <w:bottom w:val="none"/>
+          <w:right w:val="none"/>
+          <w:insideH w:val="none"/>
+          <w:insideV w:val="none"/>
+        </w:tblBorders>
+      </w:tblPr>
+      <w:tblGrid>
+        <w:gridCol w:w="900"/>
+        <w:gridCol w:w="7560"/>
+        <w:gridCol w:w="900"/>
+      </w:tblGrid>
+      <w:tr>
+        <w:tc>
+          <w:tcPr>
+            <w:tcW w:w="900" w:type="dxa"/>
+            <w:vAlign w:val="center"/>
+          </w:tcPr>
+          <w:p/>
+        </w:tc>
+        <w:tc>
+          <w:tcPr>
+            <w:tcW w:w="7560" w:type="dxa"/>
+            <w:vAlign w:val="center"/>
+          </w:tcPr>
+          <w:p>
+            <w:pPr>
+              <w:jc w:val="center"/>
+            </w:pPr>
+            <m:oMath>
+              <m:sSub>
+                <m:e>
+                  <m:r>
+                    <m:rPr>
+                      <m:sty m:val="p"/>
+                    </m:rPr>
+                    <m:t>W</m:t>
+                  </m:r>
+                  <m:r>
+                    <m:rPr>
+                      <m:sty m:val="p"/>
+                    </m:rPr>
+                    <m:t>T</m:t>
+                  </m:r>
+                  <m:r>
+                    <m:rPr>
+                      <m:sty m:val="p"/>
+                    </m:rPr>
+                    <m:t>H</m:t>
+                  </m:r>
+                </m:e>
+                <m:sub>
+                  <m:r>
+                    <m:t>M</m:t>
+                  </m:r>
+                </m:sub>
+              </m:sSub>
+              <m:r>
+                <m:t>=</m:t>
+              </m:r>
+              <m:sSub>
+                <m:e>
+                  <m:r>
+                    <m:rPr>
+                      <m:nor/>
+                      <m:sty m:val="p"/>
+                    </m:rPr>
+                    <m:t>max</m:t>
+                  </m:r>
+                </m:e>
+                <m:sub>
+                  <m:r>
+                    <m:t>i</m:t>
+                  </m:r>
+                </m:sub>
+              </m:sSub>
+              <m:sSub>
+                <m:e>
+                  <m:r>
+                    <m:rPr>
+                      <m:sty m:val="p"/>
+                    </m:rPr>
+                    <m:t>W</m:t>
+                  </m:r>
+                  <m:r>
+                    <m:rPr>
+                      <m:sty m:val="p"/>
+                    </m:rPr>
+                    <m:t>T</m:t>
+                  </m:r>
+                  <m:r>
+                    <m:rPr>
+                      <m:sty m:val="p"/>
+                    </m:rPr>
+                    <m:t>H</m:t>
+                  </m:r>
+                </m:e>
+                <m:sub>
+                  <m:r>
+                    <m:t>i</m:t>
+                  </m:r>
+                </m:sub>
+              </m:sSub>
+              <m:r>
+                <m:t>,</m:t>
+              </m:r>
+              <m:r>
+                <m:t>  </m:t>
+              </m:r>
+              <m:sSub>
+                <m:e>
+                  <m:r>
+                    <m:rPr>
+                      <m:sty m:val="p"/>
+                    </m:rPr>
+                    <m:t>W</m:t>
+                  </m:r>
+                  <m:r>
+                    <m:rPr>
+                      <m:sty m:val="p"/>
+                    </m:rPr>
+                    <m:t>T</m:t>
+                  </m:r>
+                  <m:r>
+                    <m:rPr>
+                      <m:sty m:val="p"/>
+                    </m:rPr>
+                    <m:t>H</m:t>
+                  </m:r>
+                  <m:r>
+                    <m:rPr>
+                      <m:sty m:val="p"/>
+                    </m:rPr>
+                    <m:t>S</m:t>
+                  </m:r>
+                </m:e>
+                <m:sub>
+                  <m:r>
+                    <m:t>M</m:t>
+                  </m:r>
+                </m:sub>
+              </m:sSub>
+              <m:r>
+                <m:t>=</m:t>
+              </m:r>
+              <m:sSub>
+                <m:e>
+                  <m:r>
+                    <m:rPr>
+                      <m:nor/>
+                      <m:sty m:val="p"/>
+                    </m:rPr>
+                    <m:t>max</m:t>
+                  </m:r>
+                </m:e>
+                <m:sub>
+                  <m:r>
+                    <m:t>i</m:t>
+                  </m:r>
+                </m:sub>
+              </m:sSub>
+              <m:sSub>
+                <m:e>
+                  <m:r>
+                    <m:rPr>
+                      <m:sty m:val="p"/>
+                    </m:rPr>
+                    <m:t>W</m:t>
+                  </m:r>
+                  <m:r>
+                    <m:rPr>
+                      <m:sty m:val="p"/>
+                    </m:rPr>
+                    <m:t>T</m:t>
+                  </m:r>
+                  <m:r>
+                    <m:rPr>
+                      <m:sty m:val="p"/>
+                    </m:rPr>
+                    <m:t>H</m:t>
+                  </m:r>
+                  <m:r>
+                    <m:rPr>
+                      <m:sty m:val="p"/>
+                    </m:rPr>
+                    <m:t>S</m:t>
+                  </m:r>
+                </m:e>
+                <m:sub>
+                  <m:r>
+                    <m:t>i</m:t>
+                  </m:r>
+                </m:sub>
+              </m:sSub>
+            </m:oMath>
+          </w:p>
+        </w:tc>
+        <w:tc>
+          <w:tcPr>
+            <w:tcW w:w="900" w:type="dxa"/>
+            <w:vAlign w:val="center"/>
+          </w:tcPr>
+          <w:p>
+            <w:pPr>
+              <w:jc w:val="right"/>
+            </w:pPr>
+            <w:r>
+              <w:t>(6)</w:t>
+            </w:r>
+          </w:p>
+        </w:tc>
+      </w:tr>
+    </w:tbl>
+    <w:p>
+      <w:r>
+        <w:t>Reconstrucción y regla de fusión. Las imágenes VIS e IR se procesan en paralelo y sus mapas se combinan por máximo por píxel, conservando para cada fuente el detalle más saliente: WTH_M = máx(WTH_M^VIS, WTH_M^IR), e igualmente para BTH_M, WTHS_M y BTHS_M. Sobre la imagen base I_base = (I_VIS + I_IR)/2, que retiene la iluminación y la temperatura global de baja frecuencia, se suman los realces brillantes y se restan los oscuros, ponderados por un peso de contraste m, según la ecuación (7) —adaptación de la ecuación (21) del trabajo de mamografías al esquema de fusión de la ecuación (12) de Ortega y Espinoza—. El término con WTH realza las estructuras brillantes —típicamente objetos cálidos del canal IR—, el término con BTH oscurece los valles —contornos y sombras del canal visible— y el peso m gradúa la intensidad del realce: valores altos maximizan el contraste a costa de introducir artefactos, valores bajos preservan la fidelidad a las fuentes.</w:t>
+      </w:r>
+    </w:p>
+    <w:tbl>
+      <w:tblPr>
+        <w:tblW w:w="9360" w:type="dxa"/>
+        <w:tblBorders>
+          <w:top w:val="none"/>
+          <w:left w:val="none"/>
+          <w:bottom w:val="none"/>
+          <w:right w:val="none"/>
+          <w:insideH w:val="none"/>
+          <w:insideV w:val="none"/>
+        </w:tblBorders>
+      </w:tblPr>
+      <w:tblGrid>
+        <w:gridCol w:w="900"/>
+        <w:gridCol w:w="7560"/>
+        <w:gridCol w:w="900"/>
+      </w:tblGrid>
+      <w:tr>
+        <w:tc>
+          <w:tcPr>
+            <w:tcW w:w="900" w:type="dxa"/>
+            <w:vAlign w:val="center"/>
+          </w:tcPr>
+          <w:p/>
+        </w:tc>
+        <w:tc>
+          <w:tcPr>
+            <w:tcW w:w="7560" w:type="dxa"/>
+            <w:vAlign w:val="center"/>
+          </w:tcPr>
+          <w:p>
+            <w:pPr>
+              <w:jc w:val="center"/>
+            </w:pPr>
+            <m:oMath>
+              <m:r>
+                <m:t>F</m:t>
+              </m:r>
+              <m:r>
+                <m:t>=</m:t>
+              </m:r>
+              <m:sSub>
+                <m:e>
+                  <m:r>
+                    <m:t>I</m:t>
+                  </m:r>
+                </m:e>
+                <m:sub>
+                  <m:r>
+                    <m:rPr>
+                      <m:nor/>
+                      <m:sty m:val="p"/>
+                    </m:rPr>
+                    <m:t>base</m:t>
+                  </m:r>
+                </m:sub>
+              </m:sSub>
+              <m:r>
+                <m:t>+</m:t>
+              </m:r>
+              <m:r>
+                <m:t>m</m:t>
+              </m:r>
+              <m:r>
+                <m:t> </m:t>
+              </m:r>
+              <m:r>
+                <m:t>(</m:t>
+              </m:r>
+              <m:sSub>
+                <m:e>
+                  <m:r>
+                    <m:rPr>
+                      <m:sty m:val="p"/>
+                    </m:rPr>
+                    <m:t>W</m:t>
+                  </m:r>
+                  <m:r>
+                    <m:rPr>
+                      <m:sty m:val="p"/>
+                    </m:rPr>
+                    <m:t>T</m:t>
+                  </m:r>
+                  <m:r>
+                    <m:rPr>
+                      <m:sty m:val="p"/>
+                    </m:rPr>
+                    <m:t>H</m:t>
+                  </m:r>
+                </m:e>
+                <m:sub>
+                  <m:r>
+                    <m:t>M</m:t>
+                  </m:r>
+                </m:sub>
+              </m:sSub>
+              <m:r>
+                <m:t>+</m:t>
+              </m:r>
+              <m:sSub>
+                <m:e>
+                  <m:r>
+                    <m:rPr>
+                      <m:sty m:val="p"/>
+                    </m:rPr>
+                    <m:t>W</m:t>
+                  </m:r>
+                  <m:r>
+                    <m:rPr>
+                      <m:sty m:val="p"/>
+                    </m:rPr>
+                    <m:t>T</m:t>
+                  </m:r>
+                  <m:r>
+                    <m:rPr>
+                      <m:sty m:val="p"/>
+                    </m:rPr>
+                    <m:t>H</m:t>
+                  </m:r>
+                  <m:r>
+                    <m:rPr>
+                      <m:sty m:val="p"/>
+                    </m:rPr>
+                    <m:t>S</m:t>
+                  </m:r>
+                </m:e>
+                <m:sub>
+                  <m:r>
+                    <m:t>M</m:t>
+                  </m:r>
+                </m:sub>
+              </m:sSub>
+              <m:r>
+                <m:t>)</m:t>
+              </m:r>
+              <m:r>
+                <m:t>−</m:t>
+              </m:r>
+              <m:r>
+                <m:t>m</m:t>
+              </m:r>
+              <m:r>
+                <m:t> </m:t>
+              </m:r>
+              <m:r>
+                <m:t>(</m:t>
+              </m:r>
+              <m:sSub>
+                <m:e>
+                  <m:r>
+                    <m:rPr>
+                      <m:sty m:val="p"/>
+                    </m:rPr>
+                    <m:t>B</m:t>
+                  </m:r>
+                  <m:r>
+                    <m:rPr>
+                      <m:sty m:val="p"/>
+                    </m:rPr>
+                    <m:t>T</m:t>
+                  </m:r>
+                  <m:r>
+                    <m:rPr>
+                      <m:sty m:val="p"/>
+                    </m:rPr>
+                    <m:t>H</m:t>
+                  </m:r>
+                </m:e>
+                <m:sub>
+                  <m:r>
+                    <m:t>M</m:t>
+                  </m:r>
+                </m:sub>
+              </m:sSub>
+              <m:r>
+                <m:t>+</m:t>
+              </m:r>
+              <m:sSub>
+                <m:e>
+                  <m:r>
+                    <m:rPr>
+                      <m:sty m:val="p"/>
+                    </m:rPr>
+                    <m:t>B</m:t>
+                  </m:r>
+                  <m:r>
+                    <m:rPr>
+                      <m:sty m:val="p"/>
+                    </m:rPr>
+                    <m:t>T</m:t>
+                  </m:r>
+                  <m:r>
+                    <m:rPr>
+                      <m:sty m:val="p"/>
+                    </m:rPr>
+                    <m:t>H</m:t>
+                  </m:r>
+                  <m:r>
+                    <m:rPr>
+                      <m:sty m:val="p"/>
+                    </m:rPr>
+                    <m:t>S</m:t>
+                  </m:r>
+                </m:e>
+                <m:sub>
+                  <m:r>
+                    <m:t>M</m:t>
+                  </m:r>
+                </m:sub>
+              </m:sSub>
+              <m:r>
+                <m:t>)</m:t>
+              </m:r>
+              <m:r>
+                <m:t>,</m:t>
+              </m:r>
+              <m:r>
+                <m:t> </m:t>
+              </m:r>
+              <m:sSub>
+                <m:e>
+                  <m:r>
+                    <m:t>I</m:t>
+                  </m:r>
+                </m:e>
+                <m:sub>
+                  <m:r>
+                    <m:rPr>
+                      <m:nor/>
+                      <m:sty m:val="p"/>
+                    </m:rPr>
+                    <m:t>base</m:t>
+                  </m:r>
+                </m:sub>
+              </m:sSub>
+              <m:r>
+                <m:t>=</m:t>
+              </m:r>
+              <m:f>
+                <m:fPr>
+                  <m:type m:val="lin"/>
+                </m:fPr>
+                <m:num>
+                  <m:r>
+                    <m:t>1</m:t>
+                  </m:r>
+                </m:num>
+                <m:den>
+                  <m:r>
+                    <m:t>2</m:t>
+                  </m:r>
+                </m:den>
+              </m:f>
+              <m:r>
+                <m:t> </m:t>
+              </m:r>
+              <m:r>
+                <m:t>(</m:t>
+              </m:r>
+              <m:sSub>
+                <m:e>
+                  <m:r>
+                    <m:t>I</m:t>
+                  </m:r>
+                </m:e>
+                <m:sub>
+                  <m:r>
+                    <m:rPr>
+                      <m:nor/>
+                      <m:sty m:val="p"/>
+                    </m:rPr>
+                    <m:t>VIS</m:t>
+                  </m:r>
+                </m:sub>
+              </m:sSub>
+              <m:r>
+                <m:t>+</m:t>
+              </m:r>
+              <m:sSub>
+                <m:e>
+                  <m:r>
+                    <m:t>I</m:t>
+                  </m:r>
+                </m:e>
+                <m:sub>
+                  <m:r>
+                    <m:rPr>
+                      <m:nor/>
+                      <m:sty m:val="p"/>
+                    </m:rPr>
+                    <m:t>IR</m:t>
+                  </m:r>
+                </m:sub>
+              </m:sSub>
+              <m:r>
+                <m:t>)</m:t>
+              </m:r>
+            </m:oMath>
+          </w:p>
+        </w:tc>
+        <w:tc>
+          <w:tcPr>
+            <w:tcW w:w="900" w:type="dxa"/>
+            <w:vAlign w:val="center"/>
+          </w:tcPr>
+          <w:p>
+            <w:pPr>
+              <w:jc w:val="right"/>
+            </w:pPr>
+            <w:r>
+              <w:t>(7)</w:t>
+            </w:r>
+          </w:p>
+        </w:tc>
+      </w:tr>
+    </w:tbl>
+    <w:p>
+      <w:pPr>
+        <w:jc w:val="center"/>
+      </w:pPr>
+      <w:r>
+        <w:drawing>
+          <wp:inline xmlns:a="http://schemas.openxmlformats.org/drawingml/2006/main" xmlns:pic="http://schemas.openxmlformats.org/drawingml/2006/picture">
+            <wp:extent cx="5486400" cy="2593571"/>
+            <wp:docPr id="10" name="Picture 10"/>
+            <wp:cNvGraphicFramePr>
+              <a:graphicFrameLocks noChangeAspect="1"/>
+            </wp:cNvGraphicFramePr>
+            <a:graphic>
+              <a:graphicData uri="http://schemas.openxmlformats.org/drawingml/2006/picture">
+                <pic:pic>
+                  <pic:nvPicPr>
+                    <pic:cNvPr id="0" name="fig_cascada_multiescala.png"/>
+                    <pic:cNvPicPr/>
+                  </pic:nvPicPr>
+                  <pic:blipFill>
+                    <a:blip r:embed="rId23"/>
+                    <a:stretch>
+                      <a:fillRect/>
+                    </a:stretch>
+                  </pic:blipFill>
+                  <pic:spPr>
+                    <a:xfrm>
+                      <a:off x="0" y="0"/>
+                      <a:ext cx="5486400" cy="2593571"/>
+                    </a:xfrm>
+                    <a:prstGeom prst="rect"/>
+                  </pic:spPr>
+                </pic:pic>
+              </a:graphicData>
+            </a:graphic>
+          </wp:inline>
+        </w:drawing>
+      </w:r>
+    </w:p>
+    <w:p>
+      <w:pPr>
+        <w:jc w:val="left"/>
+      </w:pPr>
+      <w:r>
+        <w:rPr>
+          <w:i/>
+          <w:sz w:val="18"/>
+        </w:rPr>
+        <w:t>Figura 4. Descomposición Top-Hat multiescala en cascada y regla de fusión ponderada.</w:t>
+      </w:r>
+    </w:p>
+    <w:p/>
+    <w:p>
+      <w:r>
+        <w:t>Optimización por Enjambre de Partículas (PSO). El método tiene tres hiperparámetros —el número de escalas n, el radio base r y el peso de contraste m— cuyo ajuste manual es costoso y subjetivo. Para fijarlos automáticamente se emplea la Optimización por Enjambre de Partículas (Kennedy y Eberhart, 1995), una metaheurística poblacional inspirada en el comportamiento colectivo de las bandadas. Cada partícula es una solución candidata x = (n, r, m) que se desplaza por el espacio de búsqueda recordando su mejor posición propia (pbest) y la mejor posición de todo el enjambre (gbest). En cada iteración t la velocidad y la posición se actualizan según la ecuación (8), donde w es la inercia, c₁ y c₂ son los coeficientes cognitivo y social, y r₁, r₂ ∈ [0,1] son números aleatorios. La implementación usa 30 partículas durante 30 iteraciones, con c₁ = c₂ = 1,5 e inercia decreciente de 0,9 a 0,4 para transitar de la exploración global al refinamiento local.</w:t>
+      </w:r>
+    </w:p>
+    <w:tbl>
+      <w:tblPr>
+        <w:tblW w:w="9360" w:type="dxa"/>
+        <w:tblBorders>
+          <w:top w:val="none"/>
+          <w:left w:val="none"/>
+          <w:bottom w:val="none"/>
+          <w:right w:val="none"/>
+          <w:insideH w:val="none"/>
+          <w:insideV w:val="none"/>
+        </w:tblBorders>
+      </w:tblPr>
+      <w:tblGrid>
+        <w:gridCol w:w="900"/>
+        <w:gridCol w:w="7560"/>
+        <w:gridCol w:w="900"/>
+      </w:tblGrid>
+      <w:tr>
+        <w:tc>
+          <w:tcPr>
+            <w:tcW w:w="900" w:type="dxa"/>
+            <w:vAlign w:val="center"/>
+          </w:tcPr>
+          <w:p/>
+        </w:tc>
+        <w:tc>
+          <w:tcPr>
+            <w:tcW w:w="7560" w:type="dxa"/>
+            <w:vAlign w:val="center"/>
+          </w:tcPr>
+          <w:p>
+            <w:pPr>
+              <w:jc w:val="center"/>
+            </w:pPr>
+            <m:oMath>
+              <m:sSub>
+                <m:e>
+                  <m:r>
+                    <m:t>v</m:t>
+                  </m:r>
+                </m:e>
+                <m:sub>
+                  <m:r>
+                    <m:t>t</m:t>
+                  </m:r>
+                  <m:r>
+                    <m:t>+</m:t>
+                  </m:r>
+                  <m:r>
+                    <m:t>1</m:t>
+                  </m:r>
+                </m:sub>
+              </m:sSub>
+              <m:r>
+                <m:t>=</m:t>
+              </m:r>
+              <m:r>
+                <m:t>w</m:t>
+              </m:r>
+              <m:r>
+                <m:t> </m:t>
+              </m:r>
+              <m:sSub>
+                <m:e>
+                  <m:r>
+                    <m:t>v</m:t>
+                  </m:r>
+                </m:e>
+                <m:sub>
+                  <m:r>
+                    <m:t>t</m:t>
+                  </m:r>
+                </m:sub>
+              </m:sSub>
+              <m:r>
+                <m:t>+</m:t>
+              </m:r>
+              <m:sSub>
+                <m:e>
+                  <m:r>
+                    <m:t>c</m:t>
+                  </m:r>
+                </m:e>
+                <m:sub>
+                  <m:r>
+                    <m:t>1</m:t>
+                  </m:r>
+                </m:sub>
+              </m:sSub>
+              <m:sSub>
+                <m:e>
+                  <m:r>
+                    <m:t>r</m:t>
+                  </m:r>
+                </m:e>
+                <m:sub>
+                  <m:r>
+                    <m:t>1</m:t>
+                  </m:r>
+                </m:sub>
+              </m:sSub>
+              <m:r>
+                <m:t> </m:t>
+              </m:r>
+              <m:r>
+                <m:t>(</m:t>
+              </m:r>
+              <m:sSub>
+                <m:e>
+                  <m:r>
+                    <m:t>p</m:t>
+                  </m:r>
+                </m:e>
+                <m:sub>
+                  <m:r>
+                    <m:rPr>
+                      <m:nor/>
+                      <m:sty m:val="p"/>
+                    </m:rPr>
+                    <m:t>best</m:t>
+                  </m:r>
+                </m:sub>
+              </m:sSub>
+              <m:r>
+                <m:t>−</m:t>
+              </m:r>
+              <m:sSub>
+                <m:e>
+                  <m:r>
+                    <m:t>x</m:t>
+                  </m:r>
+                </m:e>
+                <m:sub>
+                  <m:r>
+                    <m:t>t</m:t>
+                  </m:r>
+                </m:sub>
+              </m:sSub>
+              <m:r>
+                <m:t>)</m:t>
+              </m:r>
+              <m:r>
+                <m:t>+</m:t>
+              </m:r>
+              <m:sSub>
+                <m:e>
+                  <m:r>
+                    <m:t>c</m:t>
+                  </m:r>
+                </m:e>
+                <m:sub>
+                  <m:r>
+                    <m:t>2</m:t>
+                  </m:r>
+                </m:sub>
+              </m:sSub>
+              <m:sSub>
+                <m:e>
+                  <m:r>
+                    <m:t>r</m:t>
+                  </m:r>
+                </m:e>
+                <m:sub>
+                  <m:r>
+                    <m:t>2</m:t>
+                  </m:r>
+                </m:sub>
+              </m:sSub>
+              <m:r>
+                <m:t> </m:t>
+              </m:r>
+              <m:r>
+                <m:t>(</m:t>
+              </m:r>
+              <m:sSub>
+                <m:e>
+                  <m:r>
+                    <m:t>g</m:t>
+                  </m:r>
+                </m:e>
+                <m:sub>
+                  <m:r>
+                    <m:rPr>
+                      <m:nor/>
+                      <m:sty m:val="p"/>
+                    </m:rPr>
+                    <m:t>best</m:t>
+                  </m:r>
+                </m:sub>
+              </m:sSub>
+              <m:r>
+                <m:t>−</m:t>
+              </m:r>
+              <m:sSub>
+                <m:e>
+                  <m:r>
+                    <m:t>x</m:t>
+                  </m:r>
+                </m:e>
+                <m:sub>
+                  <m:r>
+                    <m:t>t</m:t>
+                  </m:r>
+                </m:sub>
+              </m:sSub>
+              <m:r>
+                <m:t>)</m:t>
+              </m:r>
+              <m:r>
+                <m:t>,</m:t>
+              </m:r>
+              <m:r>
+                <m:t>  </m:t>
+              </m:r>
+              <m:sSub>
+                <m:e>
+                  <m:r>
+                    <m:t>x</m:t>
+                  </m:r>
+                </m:e>
+                <m:sub>
+                  <m:r>
+                    <m:t>t</m:t>
+                  </m:r>
+                  <m:r>
+                    <m:t>+</m:t>
+                  </m:r>
+                  <m:r>
+                    <m:t>1</m:t>
+                  </m:r>
+                </m:sub>
+              </m:sSub>
+              <m:r>
+                <m:t>=</m:t>
+              </m:r>
+              <m:sSub>
+                <m:e>
+                  <m:r>
+                    <m:t>x</m:t>
+                  </m:r>
+                </m:e>
+                <m:sub>
+                  <m:r>
+                    <m:t>t</m:t>
+                  </m:r>
+                </m:sub>
+              </m:sSub>
+              <m:r>
+                <m:t>+</m:t>
+              </m:r>
+              <m:sSub>
+                <m:e>
+                  <m:r>
+                    <m:t>v</m:t>
+                  </m:r>
+                </m:e>
+                <m:sub>
+                  <m:r>
+                    <m:t>t</m:t>
+                  </m:r>
+                  <m:r>
+                    <m:t>+</m:t>
+                  </m:r>
+                  <m:r>
+                    <m:t>1</m:t>
+                  </m:r>
+                </m:sub>
+              </m:sSub>
+            </m:oMath>
+          </w:p>
+        </w:tc>
+        <w:tc>
+          <w:tcPr>
+            <w:tcW w:w="900" w:type="dxa"/>
+            <w:vAlign w:val="center"/>
+          </w:tcPr>
+          <w:p>
+            <w:pPr>
+              <w:jc w:val="right"/>
+            </w:pPr>
+            <w:r>
+              <w:t>(8)</w:t>
+            </w:r>
+          </w:p>
+        </w:tc>
+      </w:tr>
+    </w:tbl>
+    <w:p>
+      <w:pPr>
+        <w:jc w:val="center"/>
+      </w:pPr>
+      <w:r>
+        <w:drawing>
+          <wp:inline xmlns:a="http://schemas.openxmlformats.org/drawingml/2006/main" xmlns:pic="http://schemas.openxmlformats.org/drawingml/2006/picture">
+            <wp:extent cx="4572000" cy="2658140"/>
+            <wp:docPr id="11" name="Picture 11"/>
+            <wp:cNvGraphicFramePr>
+              <a:graphicFrameLocks noChangeAspect="1"/>
+            </wp:cNvGraphicFramePr>
+            <a:graphic>
+              <a:graphicData uri="http://schemas.openxmlformats.org/drawingml/2006/picture">
+                <pic:pic>
+                  <pic:nvPicPr>
+                    <pic:cNvPr id="0" name="fig_pso_diagrama.png"/>
+                    <pic:cNvPicPr/>
+                  </pic:nvPicPr>
+                  <pic:blipFill>
+                    <a:blip r:embed="rId24"/>
+                    <a:stretch>
+                      <a:fillRect/>
+                    </a:stretch>
+                  </pic:blipFill>
+                  <pic:spPr>
+                    <a:xfrm>
+                      <a:off x="0" y="0"/>
+                      <a:ext cx="4572000" cy="2658140"/>
+                    </a:xfrm>
+                    <a:prstGeom prst="rect"/>
+                  </pic:spPr>
+                </pic:pic>
+              </a:graphicData>
+            </a:graphic>
+          </wp:inline>
+        </w:drawing>
+      </w:r>
+    </w:p>
+    <w:p>
+      <w:pPr>
+        <w:jc w:val="left"/>
+      </w:pPr>
+      <w:r>
+        <w:rPr>
+          <w:i/>
+          <w:sz w:val="18"/>
+        </w:rPr>
+        <w:t>Figura 5. Optimización por enjambre de partículas (PSO) del vector de hiperparámetros (n, r, m).</w:t>
+      </w:r>
+    </w:p>
+    <w:p/>
+    <w:p>
+      <w:r>
+        <w:t>Función de aptitud orientada a la fusión. A diferencia de la formulación original de Ortega y Espinoza —que maximiza F = SSIM + E + PSNR y, al premiar el realce conservador, conduce a óptimos triviales en este problema—, aquí el PSO maximiza una aptitud orientada explícitamente a la calidad de fusión, definida en la ecuación (9), que recompensa la similitud estructural, la preservación de bordes y la correlación de las diferencias, y penaliza los artefactos. El enjambre convergió de forma estable al óptimo n = 6 escalas, r ≈ 2,89 y m = 0,10, configuración con la que se evalúa el método en el capítulo de resultados.</w:t>
+      </w:r>
+    </w:p>
+    <w:p>
+      <w:pPr>
+        <w:jc w:val="left"/>
+      </w:pPr>
+      <w:r>
+        <w:rPr>
+          <w:i/>
+          <w:sz w:val="18"/>
+        </w:rPr>
+        <w:t>Tabla 2. Configuración del método óptimo multiescala y del PSO.</w:t>
+      </w:r>
+    </w:p>
+    <w:tbl>
+      <w:tblPr>
+        <w:tblW w:type="dxa" w:w="9360"/>
+        <w:tblLayout w:type="fixed"/>
+        <w:tblLook w:firstColumn="1" w:firstRow="1" w:lastColumn="0" w:lastRow="0" w:noHBand="0" w:noVBand="1" w:val="04A0"/>
+        <w:tblW/>
+        <w:tblBorders>
+          <w:top w:val="single" w:sz="4" w:space="0" w:color="B0B8C0"/>
+          <w:left w:val="single" w:sz="4" w:space="0" w:color="B0B8C0"/>
+          <w:bottom w:val="single" w:sz="4" w:space="0" w:color="B0B8C0"/>
+          <w:right w:val="single" w:sz="4" w:space="0" w:color="B0B8C0"/>
+          <w:insideH w:val="single" w:sz="4" w:space="0" w:color="B0B8C0"/>
+          <w:insideV w:val="single" w:sz="4" w:space="0" w:color="B0B8C0"/>
+        </w:tblBorders>
+      </w:tblPr>
+      <w:tblGrid>
+        <w:gridCol w:w="4550"/>
+        <w:gridCol w:w="4550"/>
+      </w:tblGrid>
+      <w:tr>
+        <w:tc>
+          <w:tcPr>
+            <w:tcW w:type="dxa" w:w="4550"/>
+            <w:tcW w:w="4000" w:type="dxa"/>
+            <w:shd w:val="clear" w:fill="1F3B57"/>
+            <w:tcMar>
+              <w:top w:w="40" w:type="dxa"/>
+              <w:bottom w:w="40" w:type="dxa"/>
+              <w:left w:w="90" w:type="dxa"/>
+              <w:right w:w="90" w:type="dxa"/>
+            </w:tcMar>
+          </w:tcPr>
+          <w:p>
+            <w:r/>
+            <w:r>
+              <w:rPr>
+                <w:b/>
+                <w:color w:val="FFFFFF"/>
+                <w:sz w:val="19"/>
+              </w:rPr>
+              <w:t>Parámetro</w:t>
+            </w:r>
+          </w:p>
+        </w:tc>
+        <w:tc>
+          <w:tcPr>
+            <w:tcW w:type="dxa" w:w="4550"/>
+            <w:tcW w:w="5360" w:type="dxa"/>
+            <w:shd w:val="clear" w:fill="1F3B57"/>
+            <w:tcMar>
+              <w:top w:w="40" w:type="dxa"/>
+              <w:bottom w:w="40" w:type="dxa"/>
+              <w:left w:w="90" w:type="dxa"/>
+              <w:right w:w="90" w:type="dxa"/>
+            </w:tcMar>
+          </w:tcPr>
+          <w:p>
+            <w:r/>
+            <w:r>
+              <w:rPr>
+                <w:b/>
+                <w:color w:val="FFFFFF"/>
+                <w:sz w:val="19"/>
+              </w:rPr>
+              <w:t>Valor</w:t>
+            </w:r>
+          </w:p>
+        </w:tc>
+      </w:tr>
+      <w:tr>
+        <w:tc>
+          <w:tcPr>
+            <w:tcW w:type="dxa" w:w="4550"/>
+            <w:tcW w:w="4000" w:type="dxa"/>
+            <w:tcMar>
+              <w:top w:w="40" w:type="dxa"/>
+              <w:bottom w:w="40" w:type="dxa"/>
+              <w:left w:w="90" w:type="dxa"/>
+              <w:right w:w="90" w:type="dxa"/>
+            </w:tcMar>
+          </w:tcPr>
+          <w:p>
+            <w:r/>
+            <w:r>
+              <w:rPr>
+                <w:sz w:val="19"/>
+              </w:rPr>
+              <w:t>Elementos estructurantes por escala</w:t>
+            </w:r>
+          </w:p>
+        </w:tc>
+        <w:tc>
+          <w:tcPr>
+            <w:tcW w:type="dxa" w:w="4550"/>
+            <w:tcW w:w="5360" w:type="dxa"/>
+            <w:tcMar>
+              <w:top w:w="40" w:type="dxa"/>
+              <w:bottom w:w="40" w:type="dxa"/>
+              <w:left w:w="90" w:type="dxa"/>
+              <w:right w:w="90" w:type="dxa"/>
+            </w:tcMar>
+          </w:tcPr>
+          <w:p>
+            <w:r/>
+            <w:r>
+              <w:rPr>
+                <w:sz w:val="19"/>
+              </w:rPr>
+              <w:t>5: un disco + cuatro líneas (0°, 45°, 90°, 135°)</w:t>
+            </w:r>
+          </w:p>
+        </w:tc>
+      </w:tr>
+      <w:tr>
+        <w:tc>
+          <w:tcPr>
+            <w:tcW w:type="dxa" w:w="4550"/>
+            <w:tcW w:w="4000" w:type="dxa"/>
+            <w:tcMar>
+              <w:top w:w="40" w:type="dxa"/>
+              <w:bottom w:w="40" w:type="dxa"/>
+              <w:left w:w="90" w:type="dxa"/>
+              <w:right w:w="90" w:type="dxa"/>
+            </w:tcMar>
+          </w:tcPr>
+          <w:p>
+            <w:r/>
+            <w:r>
+              <w:rPr>
+                <w:sz w:val="19"/>
+              </w:rPr>
+              <w:t>Combinación de las cinco respuestas</w:t>
+            </w:r>
+          </w:p>
+        </w:tc>
+        <w:tc>
+          <w:tcPr>
+            <w:tcW w:type="dxa" w:w="4550"/>
+            <w:tcW w:w="5360" w:type="dxa"/>
+            <w:tcMar>
+              <w:top w:w="40" w:type="dxa"/>
+              <w:bottom w:w="40" w:type="dxa"/>
+              <w:left w:w="90" w:type="dxa"/>
+              <w:right w:w="90" w:type="dxa"/>
+            </w:tcMar>
+          </w:tcPr>
+          <w:p>
+            <w:r/>
+            <w:r>
+              <w:rPr>
+                <w:sz w:val="19"/>
+              </w:rPr>
+              <w:t>Máximo por píxel (ec. 4)</w:t>
+            </w:r>
+          </w:p>
+        </w:tc>
+      </w:tr>
+      <w:tr>
+        <w:tc>
+          <w:tcPr>
+            <w:tcW w:type="dxa" w:w="4550"/>
+            <w:tcW w:w="4000" w:type="dxa"/>
+            <w:tcMar>
+              <w:top w:w="40" w:type="dxa"/>
+              <w:bottom w:w="40" w:type="dxa"/>
+              <w:left w:w="90" w:type="dxa"/>
+              <w:right w:w="90" w:type="dxa"/>
+            </w:tcMar>
+          </w:tcPr>
+          <w:p>
+            <w:r/>
+            <w:r>
+              <w:rPr>
+                <w:sz w:val="19"/>
+              </w:rPr>
+              <w:t>Escalas (radios)</w:t>
+            </w:r>
+          </w:p>
+        </w:tc>
+        <w:tc>
+          <w:tcPr>
+            <w:tcW w:type="dxa" w:w="4550"/>
+            <w:tcW w:w="5360" w:type="dxa"/>
+            <w:tcMar>
+              <w:top w:w="40" w:type="dxa"/>
+              <w:bottom w:w="40" w:type="dxa"/>
+              <w:left w:w="90" w:type="dxa"/>
+              <w:right w:w="90" w:type="dxa"/>
+            </w:tcMar>
+          </w:tcPr>
+          <w:p>
+            <w:r/>
+            <w:r>
+              <w:rPr>
+                <w:sz w:val="19"/>
+              </w:rPr>
+              <w:t>rᵢ = r·i,  i = 1…n</w:t>
+            </w:r>
+          </w:p>
+        </w:tc>
+      </w:tr>
+      <w:tr>
+        <w:tc>
+          <w:tcPr>
+            <w:tcW w:type="dxa" w:w="4550"/>
+            <w:tcW w:w="4000" w:type="dxa"/>
+            <w:tcMar>
+              <w:top w:w="40" w:type="dxa"/>
+              <w:bottom w:w="40" w:type="dxa"/>
+              <w:left w:w="90" w:type="dxa"/>
+              <w:right w:w="90" w:type="dxa"/>
+            </w:tcMar>
+          </w:tcPr>
+          <w:p>
+            <w:r/>
+            <w:r>
+              <w:rPr>
+                <w:sz w:val="19"/>
+              </w:rPr>
+              <w:t>Regla de fusión entre fuentes</w:t>
+            </w:r>
+          </w:p>
+        </w:tc>
+        <w:tc>
+          <w:tcPr>
+            <w:tcW w:type="dxa" w:w="4550"/>
+            <w:tcW w:w="5360" w:type="dxa"/>
+            <w:tcMar>
+              <w:top w:w="40" w:type="dxa"/>
+              <w:bottom w:w="40" w:type="dxa"/>
+              <w:left w:w="90" w:type="dxa"/>
+              <w:right w:w="90" w:type="dxa"/>
+            </w:tcMar>
+          </w:tcPr>
+          <w:p>
+            <w:r/>
+            <w:r>
+              <w:rPr>
+                <w:sz w:val="19"/>
+              </w:rPr>
+              <w:t>Máximo por píxel (WTH y BTH)</w:t>
+            </w:r>
+          </w:p>
+        </w:tc>
+      </w:tr>
+      <w:tr>
+        <w:tc>
+          <w:tcPr>
+            <w:tcW w:type="dxa" w:w="4550"/>
+            <w:tcW w:w="4000" w:type="dxa"/>
+            <w:tcMar>
+              <w:top w:w="40" w:type="dxa"/>
+              <w:bottom w:w="40" w:type="dxa"/>
+              <w:left w:w="90" w:type="dxa"/>
+              <w:right w:w="90" w:type="dxa"/>
+            </w:tcMar>
+          </w:tcPr>
+          <w:p>
+            <w:r/>
+            <w:r>
+              <w:rPr>
+                <w:sz w:val="19"/>
+              </w:rPr>
+              <w:t>Función de aptitud</w:t>
+            </w:r>
+          </w:p>
+        </w:tc>
+        <w:tc>
+          <w:tcPr>
+            <w:tcW w:type="dxa" w:w="4550"/>
+            <w:tcW w:w="5360" w:type="dxa"/>
+            <w:tcMar>
+              <w:top w:w="40" w:type="dxa"/>
+              <w:bottom w:w="40" w:type="dxa"/>
+              <w:left w:w="90" w:type="dxa"/>
+              <w:right w:w="90" w:type="dxa"/>
+            </w:tcMar>
+          </w:tcPr>
+          <w:p>
+            <w:r/>
+            <w:r>
+              <w:rPr>
+                <w:sz w:val="19"/>
+              </w:rPr>
+              <w:t>F = SSIM + Qabf + 0,5·SCD − Nabf</w:t>
+            </w:r>
+          </w:p>
+        </w:tc>
+      </w:tr>
+      <w:tr>
+        <w:tc>
+          <w:tcPr>
+            <w:tcW w:type="dxa" w:w="4550"/>
+            <w:tcW w:w="4000" w:type="dxa"/>
+            <w:tcMar>
+              <w:top w:w="40" w:type="dxa"/>
+              <w:bottom w:w="40" w:type="dxa"/>
+              <w:left w:w="90" w:type="dxa"/>
+              <w:right w:w="90" w:type="dxa"/>
+            </w:tcMar>
+          </w:tcPr>
+          <w:p>
+            <w:r/>
+            <w:r>
+              <w:rPr>
+                <w:sz w:val="19"/>
+              </w:rPr>
+              <w:t>Partículas del enjambre</w:t>
+            </w:r>
+          </w:p>
+        </w:tc>
+        <w:tc>
+          <w:tcPr>
+            <w:tcW w:type="dxa" w:w="4550"/>
+            <w:tcW w:w="5360" w:type="dxa"/>
+            <w:tcMar>
+              <w:top w:w="40" w:type="dxa"/>
+              <w:bottom w:w="40" w:type="dxa"/>
+              <w:left w:w="90" w:type="dxa"/>
+              <w:right w:w="90" w:type="dxa"/>
+            </w:tcMar>
+          </w:tcPr>
+          <w:p>
+            <w:r/>
+            <w:r>
+              <w:rPr>
+                <w:sz w:val="19"/>
+              </w:rPr>
+              <w:t>30</w:t>
+            </w:r>
+          </w:p>
+        </w:tc>
+      </w:tr>
+      <w:tr>
+        <w:tc>
+          <w:tcPr>
+            <w:tcW w:type="dxa" w:w="4550"/>
+            <w:tcW w:w="4000" w:type="dxa"/>
+            <w:tcMar>
+              <w:top w:w="40" w:type="dxa"/>
+              <w:bottom w:w="40" w:type="dxa"/>
+              <w:left w:w="90" w:type="dxa"/>
+              <w:right w:w="90" w:type="dxa"/>
+            </w:tcMar>
+          </w:tcPr>
+          <w:p>
+            <w:r/>
+            <w:r>
+              <w:rPr>
+                <w:sz w:val="19"/>
+              </w:rPr>
+              <w:t>Iteraciones</w:t>
+            </w:r>
+          </w:p>
+        </w:tc>
+        <w:tc>
+          <w:tcPr>
+            <w:tcW w:type="dxa" w:w="4550"/>
+            <w:tcW w:w="5360" w:type="dxa"/>
+            <w:tcMar>
+              <w:top w:w="40" w:type="dxa"/>
+              <w:bottom w:w="40" w:type="dxa"/>
+              <w:left w:w="90" w:type="dxa"/>
+              <w:right w:w="90" w:type="dxa"/>
+            </w:tcMar>
+          </w:tcPr>
+          <w:p>
+            <w:r/>
+            <w:r>
+              <w:rPr>
+                <w:sz w:val="19"/>
+              </w:rPr>
+              <w:t>30</w:t>
+            </w:r>
+          </w:p>
+        </w:tc>
+      </w:tr>
+      <w:tr>
+        <w:tc>
+          <w:tcPr>
+            <w:tcW w:type="dxa" w:w="4550"/>
+            <w:tcW w:w="4000" w:type="dxa"/>
+            <w:tcMar>
+              <w:top w:w="40" w:type="dxa"/>
+              <w:bottom w:w="40" w:type="dxa"/>
+              <w:left w:w="90" w:type="dxa"/>
+              <w:right w:w="90" w:type="dxa"/>
+            </w:tcMar>
+          </w:tcPr>
+          <w:p>
+            <w:r/>
+            <w:r>
+              <w:rPr>
+                <w:sz w:val="19"/>
+              </w:rPr>
+              <w:t>Inercia w</w:t>
+            </w:r>
+          </w:p>
+        </w:tc>
+        <w:tc>
+          <w:tcPr>
+            <w:tcW w:type="dxa" w:w="4550"/>
+            <w:tcW w:w="5360" w:type="dxa"/>
+            <w:tcMar>
+              <w:top w:w="40" w:type="dxa"/>
+              <w:bottom w:w="40" w:type="dxa"/>
+              <w:left w:w="90" w:type="dxa"/>
+              <w:right w:w="90" w:type="dxa"/>
+            </w:tcMar>
+          </w:tcPr>
+          <w:p>
+            <w:r/>
+            <w:r>
+              <w:rPr>
+                <w:sz w:val="19"/>
+              </w:rPr>
+              <w:t>0,9 → 0,4 (decreciente)</w:t>
+            </w:r>
+          </w:p>
+        </w:tc>
+      </w:tr>
+      <w:tr>
+        <w:tc>
+          <w:tcPr>
+            <w:tcW w:type="dxa" w:w="4550"/>
+            <w:tcW w:w="4000" w:type="dxa"/>
+            <w:tcMar>
+              <w:top w:w="40" w:type="dxa"/>
+              <w:bottom w:w="40" w:type="dxa"/>
+              <w:left w:w="90" w:type="dxa"/>
+              <w:right w:w="90" w:type="dxa"/>
+            </w:tcMar>
+          </w:tcPr>
+          <w:p>
+            <w:r/>
+            <w:r>
+              <w:rPr>
+                <w:sz w:val="19"/>
+              </w:rPr>
+              <w:t>Coeficientes c₁, c₂</w:t>
+            </w:r>
+          </w:p>
+        </w:tc>
+        <w:tc>
+          <w:tcPr>
+            <w:tcW w:type="dxa" w:w="4550"/>
+            <w:tcW w:w="5360" w:type="dxa"/>
+            <w:tcMar>
+              <w:top w:w="40" w:type="dxa"/>
+              <w:bottom w:w="40" w:type="dxa"/>
+              <w:left w:w="90" w:type="dxa"/>
+              <w:right w:w="90" w:type="dxa"/>
+            </w:tcMar>
+          </w:tcPr>
+          <w:p>
+            <w:r/>
+            <w:r>
+              <w:rPr>
+                <w:sz w:val="19"/>
+              </w:rPr>
+              <w:t>1,5 ; 1,5</w:t>
+            </w:r>
+          </w:p>
+        </w:tc>
+      </w:tr>
+      <w:tr>
+        <w:tc>
+          <w:tcPr>
+            <w:tcW w:type="dxa" w:w="4550"/>
+            <w:tcW w:w="4000" w:type="dxa"/>
+            <w:tcMar>
+              <w:top w:w="40" w:type="dxa"/>
+              <w:bottom w:w="40" w:type="dxa"/>
+              <w:left w:w="90" w:type="dxa"/>
+              <w:right w:w="90" w:type="dxa"/>
+            </w:tcMar>
+          </w:tcPr>
+          <w:p>
+            <w:r/>
+            <w:r>
+              <w:rPr>
+                <w:sz w:val="19"/>
+              </w:rPr>
+              <w:t>Rangos de búsqueda</w:t>
+            </w:r>
+          </w:p>
+        </w:tc>
+        <w:tc>
+          <w:tcPr>
+            <w:tcW w:type="dxa" w:w="4550"/>
+            <w:tcW w:w="5360" w:type="dxa"/>
+            <w:tcMar>
+              <w:top w:w="40" w:type="dxa"/>
+              <w:bottom w:w="40" w:type="dxa"/>
+              <w:left w:w="90" w:type="dxa"/>
+              <w:right w:w="90" w:type="dxa"/>
+            </w:tcMar>
+          </w:tcPr>
+          <w:p>
+            <w:r/>
+            <w:r>
+              <w:rPr>
+                <w:sz w:val="19"/>
+              </w:rPr>
+              <w:t>n ∈ [2, 6];  r ∈ [0,5, 3,0];  m ∈ [0,1, 1,5]</w:t>
+            </w:r>
+          </w:p>
+        </w:tc>
+      </w:tr>
+      <w:tr>
+        <w:tc>
+          <w:tcPr>
+            <w:tcW w:type="dxa" w:w="4550"/>
+            <w:tcW w:w="4000" w:type="dxa"/>
+            <w:tcMar>
+              <w:top w:w="40" w:type="dxa"/>
+              <w:bottom w:w="40" w:type="dxa"/>
+              <w:left w:w="90" w:type="dxa"/>
+              <w:right w:w="90" w:type="dxa"/>
+            </w:tcMar>
+          </w:tcPr>
+          <w:p>
+            <w:r/>
+            <w:r>
+              <w:rPr>
+                <w:sz w:val="19"/>
+              </w:rPr>
+              <w:t>Óptimo hallado</w:t>
+            </w:r>
+          </w:p>
+        </w:tc>
+        <w:tc>
+          <w:tcPr>
+            <w:tcW w:type="dxa" w:w="4550"/>
+            <w:tcW w:w="5360" w:type="dxa"/>
+            <w:tcMar>
+              <w:top w:w="40" w:type="dxa"/>
+              <w:bottom w:w="40" w:type="dxa"/>
+              <w:left w:w="90" w:type="dxa"/>
+              <w:right w:w="90" w:type="dxa"/>
+            </w:tcMar>
+          </w:tcPr>
+          <w:p>
+            <w:r/>
+            <w:r>
+              <w:rPr>
+                <w:sz w:val="19"/>
+              </w:rPr>
+              <w:t>n = 6;  r ≈ 2,89;  m = 0,10</w:t>
+            </w:r>
+          </w:p>
+        </w:tc>
+      </w:tr>
+    </w:tbl>
+    <w:p/>
+    <w:tbl>
+      <w:tblPr>
+        <w:tblW w:w="9360" w:type="dxa"/>
+        <w:tblBorders>
+          <w:top w:val="none"/>
+          <w:left w:val="none"/>
+          <w:bottom w:val="none"/>
+          <w:right w:val="none"/>
+          <w:insideH w:val="none"/>
+          <w:insideV w:val="none"/>
+        </w:tblBorders>
+      </w:tblPr>
+      <w:tblGrid>
+        <w:gridCol w:w="900"/>
+        <w:gridCol w:w="7560"/>
+        <w:gridCol w:w="900"/>
+      </w:tblGrid>
+      <w:tr>
+        <w:tc>
+          <w:tcPr>
+            <w:tcW w:w="900" w:type="dxa"/>
+            <w:vAlign w:val="center"/>
+          </w:tcPr>
+          <w:p/>
+        </w:tc>
+        <w:tc>
+          <w:tcPr>
+            <w:tcW w:w="7560" w:type="dxa"/>
+            <w:vAlign w:val="center"/>
+          </w:tcPr>
+          <w:p>
+            <w:pPr>
+              <w:jc w:val="center"/>
+            </w:pPr>
+            <m:oMath>
+              <m:r>
+                <m:t>F</m:t>
+              </m:r>
+              <m:r>
+                <m:t>=</m:t>
+              </m:r>
+              <m:r>
+                <m:rPr>
+                  <m:sty m:val="p"/>
+                </m:rPr>
+                <m:t>S</m:t>
+              </m:r>
+              <m:r>
+                <m:rPr>
+                  <m:sty m:val="p"/>
+                </m:rPr>
+                <m:t>S</m:t>
+              </m:r>
+              <m:r>
+                <m:rPr>
+                  <m:sty m:val="p"/>
+                </m:rPr>
+                <m:t>I</m:t>
+              </m:r>
+              <m:r>
+                <m:rPr>
+                  <m:sty m:val="p"/>
+                </m:rPr>
+                <m:t>M</m:t>
+              </m:r>
+              <m:r>
+                <m:t>+</m:t>
+              </m:r>
+              <m:sSup>
+                <m:e>
+                  <m:r>
+                    <m:t>Q</m:t>
+                  </m:r>
+                </m:e>
+                <m:sup>
+                  <m:r>
+                    <m:t>a</m:t>
+                  </m:r>
+                  <m:r>
+                    <m:t>b</m:t>
+                  </m:r>
+                  <m:r>
+                    <m:t>/</m:t>
+                  </m:r>
+                  <m:r>
+                    <m:t>f</m:t>
+                  </m:r>
+                </m:sup>
+              </m:sSup>
+              <m:r>
+                <m:t>+</m:t>
+              </m:r>
+              <m:r>
+                <m:t>0.5</m:t>
+              </m:r>
+              <m:r>
+                <m:t> </m:t>
+              </m:r>
+              <m:r>
+                <m:rPr>
+                  <m:sty m:val="p"/>
+                </m:rPr>
+                <m:t>S</m:t>
+              </m:r>
+              <m:r>
+                <m:rPr>
+                  <m:sty m:val="p"/>
+                </m:rPr>
+                <m:t>C</m:t>
+              </m:r>
+              <m:r>
+                <m:rPr>
+                  <m:sty m:val="p"/>
+                </m:rPr>
+                <m:t>D</m:t>
+              </m:r>
+              <m:r>
+                <m:t>−</m:t>
+              </m:r>
+              <m:sSup>
+                <m:e>
+                  <m:r>
+                    <m:t>N</m:t>
+                  </m:r>
+                </m:e>
+                <m:sup>
+                  <m:r>
+                    <m:t>a</m:t>
+                  </m:r>
+                  <m:r>
+                    <m:t>b</m:t>
+                  </m:r>
+                  <m:r>
+                    <m:t>/</m:t>
+                  </m:r>
+                  <m:r>
+                    <m:t>f</m:t>
+                  </m:r>
+                </m:sup>
+              </m:sSup>
+            </m:oMath>
+          </w:p>
+        </w:tc>
+        <w:tc>
+          <w:tcPr>
+            <w:tcW w:w="900" w:type="dxa"/>
+            <w:vAlign w:val="center"/>
+          </w:tcPr>
+          <w:p>
+            <w:pPr>
+              <w:jc w:val="right"/>
+            </w:pPr>
+            <w:r>
+              <w:t>(9)</w:t>
+            </w:r>
+          </w:p>
+        </w:tc>
+      </w:tr>
+    </w:tbl>
     <w:p>
       <w:pPr>
         <w:pStyle w:val="Heading3"/>
@@ -2974,61 +6584,307 @@
     </w:p>
     <w:p>
       <w:pPr>
-        <w:pStyle w:val="ListParagraph"/>
-        <w:numPr>
-          <w:ilvl w:val="0"/>
-          <w:numId w:val="3"/>
-        </w:numPr>
-        <w:spacing w:after="100" w:line="320"/>
-        <w:jc w:val="both"/>
-      </w:pPr>
-      <w:r>
-        <w:rPr>
-          <w:rFonts w:ascii="Arial" w:cs="Arial" w:eastAsia="Arial" w:hAnsi="Arial"/>
-          <w:sz w:val="24"/>
-          <w:szCs w:val="24"/>
-        </w:rPr>
-        <w:t xml:space="preserve">Promedio simple. Combinación lineal F = 0,5 · I_VIS + 0,5 · I_IR. Constituye la cota inferior de complejidad y desempeño esperable.</w:t>
-      </w:r>
-    </w:p>
-    <w:p>
-      <w:pPr>
-        <w:pStyle w:val="ListParagraph"/>
-        <w:numPr>
-          <w:ilvl w:val="0"/>
-          <w:numId w:val="3"/>
-        </w:numPr>
-        <w:spacing w:after="100" w:line="320"/>
-        <w:jc w:val="both"/>
-      </w:pPr>
-      <w:r>
-        <w:rPr>
-          <w:rFonts w:ascii="Arial" w:cs="Arial" w:eastAsia="Arial" w:hAnsi="Arial"/>
-          <w:sz w:val="24"/>
-          <w:szCs w:val="24"/>
-        </w:rPr>
-        <w:t xml:space="preserve">Pirámide de Laplace. Descomposición Gaussiana–Laplaciana de Burt y Adelson (1983) con cuatro niveles, regla de fusión por máxima actividad local en cada banda y reconstrucción por expansión inversa. Es el baseline canónico en la literatura clásica de fusión.</w:t>
-      </w:r>
-    </w:p>
-    <w:p>
-      <w:pPr>
-        <w:pStyle w:val="ListParagraph"/>
-        <w:numPr>
-          <w:ilvl w:val="0"/>
-          <w:numId w:val="3"/>
-        </w:numPr>
-        <w:spacing w:after="100" w:line="320"/>
-        <w:jc w:val="both"/>
-      </w:pPr>
-      <w:r>
-        <w:rPr>
-          <w:rFonts w:ascii="Arial" w:cs="Arial" w:eastAsia="Arial" w:hAnsi="Arial"/>
-          <w:sz w:val="24"/>
-          <w:szCs w:val="24"/>
-        </w:rPr>
-        <w:t xml:space="preserve">Curvelet (vía wavelet 2D). Descomposición discreta en subbandas direccionales mediante PyWavelets con familia Daubechies (db4) y tres niveles. Aproxima el comportamiento multiorientado de las curvelets de Candès et al. (2006), regla de máxima magnitud en subbandas de detalle, promedio en aproximación.</w:t>
-      </w:r>
-    </w:p>
+        <w:jc w:val="left"/>
+      </w:pPr>
+      <w:r>
+        <w:rPr>
+          <w:i/>
+          <w:sz w:val="18"/>
+        </w:rPr>
+        <w:t>Tabla 3a. Algoritmos de referencia utilizados como línea base.</w:t>
+      </w:r>
+    </w:p>
+    <w:tbl>
+      <w:tblPr>
+        <w:tblW w:type="dxa" w:w="9360"/>
+        <w:tblLayout w:type="fixed"/>
+        <w:tblLook w:firstColumn="1" w:firstRow="1" w:lastColumn="0" w:lastRow="0" w:noHBand="0" w:noVBand="1" w:val="04A0"/>
+        <w:tblW/>
+        <w:tblBorders>
+          <w:top w:val="single" w:sz="4" w:space="0" w:color="B0B8C0"/>
+          <w:left w:val="single" w:sz="4" w:space="0" w:color="B0B8C0"/>
+          <w:bottom w:val="single" w:sz="4" w:space="0" w:color="B0B8C0"/>
+          <w:right w:val="single" w:sz="4" w:space="0" w:color="B0B8C0"/>
+          <w:insideH w:val="single" w:sz="4" w:space="0" w:color="B0B8C0"/>
+          <w:insideV w:val="single" w:sz="4" w:space="0" w:color="B0B8C0"/>
+        </w:tblBorders>
+      </w:tblPr>
+      <w:tblGrid>
+        <w:gridCol w:w="3033"/>
+        <w:gridCol w:w="3033"/>
+        <w:gridCol w:w="3033"/>
+      </w:tblGrid>
+      <w:tr>
+        <w:tc>
+          <w:tcPr>
+            <w:tcW w:type="dxa" w:w="3033"/>
+            <w:tcW w:w="1900" w:type="dxa"/>
+            <w:shd w:val="clear" w:fill="1F3B57"/>
+            <w:tcMar>
+              <w:top w:w="40" w:type="dxa"/>
+              <w:bottom w:w="40" w:type="dxa"/>
+              <w:left w:w="90" w:type="dxa"/>
+              <w:right w:w="90" w:type="dxa"/>
+            </w:tcMar>
+          </w:tcPr>
+          <w:p>
+            <w:r/>
+            <w:r>
+              <w:rPr>
+                <w:b/>
+                <w:color w:val="FFFFFF"/>
+                <w:sz w:val="19"/>
+              </w:rPr>
+              <w:t>Método</w:t>
+            </w:r>
+          </w:p>
+        </w:tc>
+        <w:tc>
+          <w:tcPr>
+            <w:tcW w:type="dxa" w:w="3033"/>
+            <w:tcW w:w="5760" w:type="dxa"/>
+            <w:shd w:val="clear" w:fill="1F3B57"/>
+            <w:tcMar>
+              <w:top w:w="40" w:type="dxa"/>
+              <w:bottom w:w="40" w:type="dxa"/>
+              <w:left w:w="90" w:type="dxa"/>
+              <w:right w:w="90" w:type="dxa"/>
+            </w:tcMar>
+          </w:tcPr>
+          <w:p>
+            <w:r/>
+            <w:r>
+              <w:rPr>
+                <w:b/>
+                <w:color w:val="FFFFFF"/>
+                <w:sz w:val="19"/>
+              </w:rPr>
+              <w:t>Descripción</w:t>
+            </w:r>
+          </w:p>
+        </w:tc>
+        <w:tc>
+          <w:tcPr>
+            <w:tcW w:type="dxa" w:w="3033"/>
+            <w:tcW w:w="1700" w:type="dxa"/>
+            <w:shd w:val="clear" w:fill="1F3B57"/>
+            <w:tcMar>
+              <w:top w:w="40" w:type="dxa"/>
+              <w:bottom w:w="40" w:type="dxa"/>
+              <w:left w:w="90" w:type="dxa"/>
+              <w:right w:w="90" w:type="dxa"/>
+            </w:tcMar>
+          </w:tcPr>
+          <w:p>
+            <w:r/>
+            <w:r>
+              <w:rPr>
+                <w:b/>
+                <w:color w:val="FFFFFF"/>
+                <w:sz w:val="19"/>
+              </w:rPr>
+              <w:t>Referencia</w:t>
+            </w:r>
+          </w:p>
+        </w:tc>
+      </w:tr>
+      <w:tr>
+        <w:tc>
+          <w:tcPr>
+            <w:tcW w:type="dxa" w:w="3033"/>
+            <w:tcW w:w="1900" w:type="dxa"/>
+            <w:tcMar>
+              <w:top w:w="40" w:type="dxa"/>
+              <w:bottom w:w="40" w:type="dxa"/>
+              <w:left w:w="90" w:type="dxa"/>
+              <w:right w:w="90" w:type="dxa"/>
+            </w:tcMar>
+          </w:tcPr>
+          <w:p>
+            <w:r/>
+            <w:r>
+              <w:rPr>
+                <w:sz w:val="19"/>
+              </w:rPr>
+              <w:t>Promedio simple</w:t>
+            </w:r>
+          </w:p>
+        </w:tc>
+        <w:tc>
+          <w:tcPr>
+            <w:tcW w:type="dxa" w:w="3033"/>
+            <w:tcW w:w="5760" w:type="dxa"/>
+            <w:tcMar>
+              <w:top w:w="40" w:type="dxa"/>
+              <w:bottom w:w="40" w:type="dxa"/>
+              <w:left w:w="90" w:type="dxa"/>
+              <w:right w:w="90" w:type="dxa"/>
+            </w:tcMar>
+          </w:tcPr>
+          <w:p>
+            <w:r/>
+            <w:r>
+              <w:rPr>
+                <w:sz w:val="19"/>
+              </w:rPr>
+              <w:t>F = 0,5·I_VIS + 0,5·I_IR; cota inferior de complejidad y desempeño</w:t>
+            </w:r>
+          </w:p>
+        </w:tc>
+        <w:tc>
+          <w:tcPr>
+            <w:tcW w:type="dxa" w:w="3033"/>
+            <w:tcW w:w="1700" w:type="dxa"/>
+            <w:tcMar>
+              <w:top w:w="40" w:type="dxa"/>
+              <w:bottom w:w="40" w:type="dxa"/>
+              <w:left w:w="90" w:type="dxa"/>
+              <w:right w:w="90" w:type="dxa"/>
+            </w:tcMar>
+          </w:tcPr>
+          <w:p>
+            <w:r/>
+            <w:r>
+              <w:rPr>
+                <w:sz w:val="19"/>
+              </w:rPr>
+              <w:t>—</w:t>
+            </w:r>
+          </w:p>
+        </w:tc>
+      </w:tr>
+      <w:tr>
+        <w:tc>
+          <w:tcPr>
+            <w:tcW w:type="dxa" w:w="3033"/>
+            <w:tcW w:w="1900" w:type="dxa"/>
+            <w:tcMar>
+              <w:top w:w="40" w:type="dxa"/>
+              <w:bottom w:w="40" w:type="dxa"/>
+              <w:left w:w="90" w:type="dxa"/>
+              <w:right w:w="90" w:type="dxa"/>
+            </w:tcMar>
+          </w:tcPr>
+          <w:p>
+            <w:r/>
+            <w:r>
+              <w:rPr>
+                <w:sz w:val="19"/>
+              </w:rPr>
+              <w:t>Pirámide de Laplace</w:t>
+            </w:r>
+          </w:p>
+        </w:tc>
+        <w:tc>
+          <w:tcPr>
+            <w:tcW w:type="dxa" w:w="3033"/>
+            <w:tcW w:w="5760" w:type="dxa"/>
+            <w:tcMar>
+              <w:top w:w="40" w:type="dxa"/>
+              <w:bottom w:w="40" w:type="dxa"/>
+              <w:left w:w="90" w:type="dxa"/>
+              <w:right w:w="90" w:type="dxa"/>
+            </w:tcMar>
+          </w:tcPr>
+          <w:p>
+            <w:r/>
+            <w:r>
+              <w:rPr>
+                <w:sz w:val="19"/>
+              </w:rPr>
+              <w:t>Descomposición Gaussiana–Laplaciana de 4 niveles; fusión por máxima actividad local y reconstrucción inversa</w:t>
+            </w:r>
+          </w:p>
+        </w:tc>
+        <w:tc>
+          <w:tcPr>
+            <w:tcW w:type="dxa" w:w="3033"/>
+            <w:tcW w:w="1700" w:type="dxa"/>
+            <w:tcMar>
+              <w:top w:w="40" w:type="dxa"/>
+              <w:bottom w:w="40" w:type="dxa"/>
+              <w:left w:w="90" w:type="dxa"/>
+              <w:right w:w="90" w:type="dxa"/>
+            </w:tcMar>
+          </w:tcPr>
+          <w:p>
+            <w:r/>
+            <w:r>
+              <w:rPr>
+                <w:sz w:val="19"/>
+              </w:rPr>
+              <w:t>Burt y Adelson (1983)</w:t>
+            </w:r>
+          </w:p>
+        </w:tc>
+      </w:tr>
+      <w:tr>
+        <w:tc>
+          <w:tcPr>
+            <w:tcW w:type="dxa" w:w="3033"/>
+            <w:tcW w:w="1900" w:type="dxa"/>
+            <w:tcMar>
+              <w:top w:w="40" w:type="dxa"/>
+              <w:bottom w:w="40" w:type="dxa"/>
+              <w:left w:w="90" w:type="dxa"/>
+              <w:right w:w="90" w:type="dxa"/>
+            </w:tcMar>
+          </w:tcPr>
+          <w:p>
+            <w:r/>
+            <w:r>
+              <w:rPr>
+                <w:sz w:val="19"/>
+              </w:rPr>
+              <w:t>Curvelet (vía wavelet 2D)</w:t>
+            </w:r>
+          </w:p>
+        </w:tc>
+        <w:tc>
+          <w:tcPr>
+            <w:tcW w:type="dxa" w:w="3033"/>
+            <w:tcW w:w="5760" w:type="dxa"/>
+            <w:tcMar>
+              <w:top w:w="40" w:type="dxa"/>
+              <w:bottom w:w="40" w:type="dxa"/>
+              <w:left w:w="90" w:type="dxa"/>
+              <w:right w:w="90" w:type="dxa"/>
+            </w:tcMar>
+          </w:tcPr>
+          <w:p>
+            <w:r/>
+            <w:r>
+              <w:rPr>
+                <w:sz w:val="19"/>
+              </w:rPr>
+              <w:t>Subbandas direccionales (Daubechies db4, 3 niveles); máxima magnitud en detalle, promedio en aproximación</w:t>
+            </w:r>
+          </w:p>
+        </w:tc>
+        <w:tc>
+          <w:tcPr>
+            <w:tcW w:type="dxa" w:w="3033"/>
+            <w:tcW w:w="1700" w:type="dxa"/>
+            <w:tcMar>
+              <w:top w:w="40" w:type="dxa"/>
+              <w:bottom w:w="40" w:type="dxa"/>
+              <w:left w:w="90" w:type="dxa"/>
+              <w:right w:w="90" w:type="dxa"/>
+            </w:tcMar>
+          </w:tcPr>
+          <w:p>
+            <w:r/>
+            <w:r>
+              <w:rPr>
+                <w:sz w:val="19"/>
+              </w:rPr>
+              <w:t>Candès et al. (2006)</w:t>
+            </w:r>
+          </w:p>
+        </w:tc>
+      </w:tr>
+    </w:tbl>
+    <w:p/>
     <w:p>
       <w:pPr>
         <w:pStyle w:val="Heading3"/>
@@ -5825,12 +9681,8 @@
         <w:jc w:val="both"/>
       </w:pPr>
       <w:r>
-        <w:rPr>
-          <w:rFonts w:ascii="Arial" w:cs="Arial" w:eastAsia="Arial" w:hAnsi="Arial"/>
-          <w:sz w:val="24"/>
-          <w:szCs w:val="24"/>
-        </w:rPr>
-        <w:t xml:space="preserve">La figura 2 muestra tres pares representativos del dataset junto con los resultados de los principales métodos. Visualmente, el promedio simple produce la imagen más plana, con pérdida evidente de contraste. Curvelet y la pirámide de Laplace recuperan detalles finos pero pueden introducir ligeros artefactos en bordes muy contrastantes. La Torre Top-Hat (disk, L = 3) preserva con nitidez tanto los puntos calientes IR como los detalles texturales VIS, sin introducir artefactos visibles.</w:t>
+        <w:rPr/>
+        <w:t>La figura 6 muestra tres pares representativos del dataset junto con los resultados de los principales métodos. Visualmente, el promedio simple produce la imagen más plana, con pérdida evidente de contraste. Curvelet y la pirámide de Laplace recuperan detalles finos pero pueden introducir ligeros artefactos en bordes muy contrastantes. La Torre Top-Hat (disk, L = 3) preserva con nitidez tanto los puntos calientes IR como los detalles texturales VIS, sin introducir artefactos visibles.</w:t>
       </w:r>
     </w:p>
     <w:p>
@@ -5886,13 +9738,9 @@
       </w:pPr>
       <w:r>
         <w:rPr>
-          <w:rFonts w:ascii="Arial" w:cs="Arial" w:eastAsia="Arial" w:hAnsi="Arial"/>
-          <w:i/>
-          <w:iCs/>
-          <w:sz w:val="20"/>
-          <w:szCs w:val="20"/>
-        </w:rPr>
-        <w:t xml:space="preserve">Figura 2. Comparación cualitativa de los métodos de fusión sobre tres pares representativos del dataset.</w:t>
+          <w:sz w:val="18"/>
+        </w:rPr>
+        <w:t>Figura 6. Comparación cualitativa de los métodos de fusión sobre tres pares representativos del dataset.</w:t>
       </w:r>
     </w:p>
     <w:p>
@@ -8273,12 +12121,8 @@
         <w:jc w:val="both"/>
       </w:pPr>
       <w:r>
-        <w:rPr>
-          <w:rFonts w:ascii="Arial" w:cs="Arial" w:eastAsia="Arial" w:hAnsi="Arial"/>
-          <w:sz w:val="24"/>
-          <w:szCs w:val="24"/>
-        </w:rPr>
-        <w:t xml:space="preserve">Una distribución más completa de las métricas, no reducida al promedio, se aprecia en los diagramas de caja de la figura 3.</w:t>
+        <w:rPr/>
+        <w:t>Una distribución más completa de las métricas, no reducida al promedio, se aprecia en los diagramas de caja de la figura 7.</w:t>
       </w:r>
     </w:p>
     <w:p>
@@ -8327,7 +12171,10 @@
         <w:jc w:val="center"/>
       </w:pPr>
       <w:r>
-        <w:t>Figura 3. Diagramas de caja de seis métricas estándar de calidad (Qabf, Nabf, SSIM, SCD, VIF, SF) para métodos representativos (n = 20 pares VIS/IR).</w:t>
+        <w:rPr>
+          <w:sz w:val="18"/>
+        </w:rPr>
+        <w:t>Figura 7. Diagramas de caja de seis métricas estándar de calidad (Qabf, Nabf, SSIM, SCD, VIF, SF) para métodos representativos (n = 20 pares VIS/IR).</w:t>
       </w:r>
     </w:p>
     <w:p>
@@ -10963,7 +14810,10 @@
         <w:jc w:val="center"/>
       </w:pPr>
       <w:r>
-        <w:t>Figura 4. Ranking global por método (promedio de rangos sobre las doce métricas, con la dirección de cada una corregida).</w:t>
+        <w:rPr>
+          <w:sz w:val="18"/>
+        </w:rPr>
+        <w:t>Figura 8. Ranking global por método (promedio de rangos sobre las doce métricas, con la dirección de cada una corregida).</w:t>
       </w:r>
     </w:p>
     <w:p>
@@ -10988,12 +14838,8 @@
         <w:jc w:val="both"/>
       </w:pPr>
       <w:r>
-        <w:rPr>
-          <w:rFonts w:ascii="Arial" w:cs="Arial" w:eastAsia="Arial" w:hAnsi="Arial"/>
-          <w:sz w:val="24"/>
-          <w:szCs w:val="24"/>
-        </w:rPr>
-        <w:t xml:space="preserve">Más allá de la comparación inter-método, se ejecutó un benchmark exhaustivo de las 36 configuraciones de la Torre Top-Hat. La figura 5 sintetiza los promedios por configuración mediante mapas de calor por métrica. Cuatro patrones emergen con claridad. Primero, en EN, SD y FE los valores crecen suavemente con el número de niveles y el radio base, alcanzando los máximos en SE cuadrado con L = 5 y r₀ = 5. Segundo, en MG la dependencia es más débil y el óptimo se sitúa en disco con L = 5 y r₀ = 3, sugiriendo que profundizar la descomposición sin agrandar excesivamente el SE preserva mejor el detalle de bordes. Tercero, las métricas de información mutua (MI_vis, MI_ir) muestran tendencia opuesta: alcanzan los valores más altos en configuraciones someras y radios pequeños (disco L = 2 r₀ = 2 para MI_vis; cruz L = 2 r₀ = 2 para MI_ir), confirmando que cada nivel adicional de descomposición desacopla progresivamente la imagen fusionada de sus fuentes individuales. Cuarto, las diferencias absolutas dentro del cuadro de 36 configuraciones son modestas (rangos de aproximadamente 0,1 puntos en EN, 0,01 en SD, 0,002 en MG), lo que sugiere que la elección de hiperparámetros de la Torre Top-Hat es relativamente robusta dentro de los rangos explorados.</w:t>
+        <w:rPr/>
+        <w:t>Más allá de la comparación inter-método, se ejecutó un benchmark exhaustivo de las 36 configuraciones de la Torre Top-Hat. La figura 9 sintetiza los promedios por configuración mediante mapas de calor por métrica. Cuatro patrones emergen con claridad. Primero, en EN, SD y FE los valores crecen suavemente con el número de niveles y el radio base, alcanzando los máximos en SE cuadrado con L = 5 y r₀ = 5. Segundo, en MG la dependencia es más débil y el óptimo se sitúa en disco con L = 5 y r₀ = 3, sugiriendo que profundizar la descomposición sin agrandar excesivamente el SE preserva mejor el detalle de bordes. Tercero, las métricas de información mutua (MI_vis, MI_ir) muestran tendencia opuesta: alcanzan los valores más altos en configuraciones someras y radios pequeños (disco L = 2 r₀ = 2 para MI_vis; cruz L = 2 r₀ = 2 para MI_ir), confirmando que cada nivel adicional de descomposición desacopla progresivamente la imagen fusionada de sus fuentes individuales. Cuarto, las diferencias absolutas dentro del cuadro de 36 configuraciones son modestas (rangos de aproximadamente 0,1 puntos en EN, 0,01 en SD, 0,002 en MG), lo que sugiere que la elección de hiperparámetros de la Torre Top-Hat es relativamente robusta dentro de los rangos explorados.</w:t>
       </w:r>
     </w:p>
     <w:p>
@@ -11049,13 +14895,9 @@
       </w:pPr>
       <w:r>
         <w:rPr>
-          <w:rFonts w:ascii="Arial" w:cs="Arial" w:eastAsia="Arial" w:hAnsi="Arial"/>
-          <w:i/>
-          <w:iCs/>
-          <w:sz w:val="20"/>
-          <w:szCs w:val="20"/>
-        </w:rPr>
-        <w:t xml:space="preserve">Figura 5. Mapas de calor de las seis métricas para las 36 configuraciones de la Torre Top-Hat.</w:t>
+          <w:sz w:val="18"/>
+        </w:rPr>
+        <w:t>Figura 9. Mapas de calor de las seis métricas para las 36 configuraciones de la Torre Top-Hat.</w:t>
       </w:r>
     </w:p>
     <w:p>
@@ -11109,7 +14951,10 @@
     </w:p>
     <w:p>
       <w:r>
-        <w:t>Figura 6. Impacto de añadir Black Top-Hat sobre las configuraciones disco L3 y L5: cambio relativo por métrica (verde = mejora, rojo = empeora).</w:t>
+        <w:rPr>
+          <w:sz w:val="18"/>
+        </w:rPr>
+        <w:t>Figura 10. Impacto de añadir Black Top-Hat sobre las configuraciones disco L3 y L5: cambio relativo por métrica (verde = mejora, rojo = empeora).</w:t>
       </w:r>
     </w:p>
     <w:p>
@@ -11173,7 +15018,10 @@
     </w:p>
     <w:p>
       <w:r>
-        <w:t>Figura 7. Detectabilidad de YOLOv8n preentrenado por modalidad (izq.: personas vs vehículos por grupo; der.: detecciones por método; el método óptimo multiescala resaltado).</w:t>
+        <w:rPr>
+          <w:sz w:val="18"/>
+        </w:rPr>
+        <w:t>Figura 11. Detectabilidad de YOLOv8n preentrenado por modalidad (izq.: personas vs vehículos por grupo; der.: detecciones por método; el método óptimo multiescala resaltado).</w:t>
       </w:r>
     </w:p>
     <w:p>
@@ -11816,7 +15664,10 @@
     </w:p>
     <w:p>
       <w:r>
-        <w:t>Figura 8. Método óptimo (disco+lineales, PSO r=1, m=0,30) frente a referentes en seis métricas.</w:t>
+        <w:rPr>
+          <w:sz w:val="18"/>
+        </w:rPr>
+        <w:t>Figura 12. Método óptimo (disco+lineales, PSO r=1, m=0,30) frente a referentes en seis métricas.</w:t>
       </w:r>
     </w:p>
     <w:tbl>

</xml_diff>